<commit_message>
Phase 5 abgeschlossen: Konsistenz-Durchgang
- Quellennummern konsolidiert: 164 Eintraege, lueckenlos, keine Doppelten,
  alle Kapitelverweise gueltig. Skript 04_produktion/konsolidiere_quellen.py
  dokumentiert den Eingriff.
- Kapitel 8: Prueffragen mit dem Taschenrechner-Test aus Kapitel 5
  harmonisiert; beide Redaktionsnotizen entfernt.
- Kontrollwerte des konstruierten Rechenbeispiels nach
  03_pruefung/rechenbeispiel_kap8_kontrollwerte.md gerettet.
- Pruefliste neu erzeugt: 111 markierte Stellen.
- Word-Manuskript neu gebaut.

Manuskript: 90.634 Woerter in 14 Teilen.

Co-Authored-By: Claude Opus 4.8 <noreply@anthropic.com>
Claude-Session: https://claude.ai/code/session_0134ACJs5QwNt7TBrqmWZELo
</commit_message>
<xml_diff>
--- a/04_produktion/Erst_kam_die_Angst_Manuskript.docx
+++ b/04_produktion/Erst_kam_die_Angst_Manuskript.docx
@@ -8687,7 +8687,7 @@
         <w:ind w:firstLine="283"/>
       </w:pPr>
       <w:r>
-        <w:t>Also nehmen wir die vier großen Risikofelder einzeln auseinander. Und wir legen an jedes die Prüffragen an, die wir uns im fünften Kapitel erarbeitet haben: Ist der Schaden dokumentiert oder ausgemalt? Wer trägt ihn, und trägt er ihn jetzt schon oder erst in einem Szenario? Woher stammt die Zahl, die alle zitieren, und hat sie jemand nachgerechnet? Und schließlich, die Frage, die wir schon bei Trithemius gestellt haben: Was gewinnen wir dafür, und wie steht die Bilanz?</w:t>
+        <w:t>Also nehmen wir die vier großen Risikofelder einzeln auseinander. Und wir legen an jedes den Taschenrechner-Test aus dem fünften Kapitel an, in der Kurzfassung, die für Risiken am meisten hergibt. Gibt es einen Mechanismus, oder ist der Schaden nur ausgemalt? Betrifft es alle oder eine bestimmte Gruppe — und trifft es sie jetzt schon oder erst in einem Szenario? Wer profitiert davon, dass ich diese Zahl glaube, und hat sie überhaupt jemand nachgerechnet? Und schließlich die Frage, die schon bei Trithemius stand: Was gewinnen wir dafür, und wie steht die Bilanz?</w:t>
       </w:r>
     </w:p>
     <w:p>
@@ -12488,25 +12488,25 @@
         <w:ind w:firstLine="283"/>
       </w:pPr>
       <w:r>
-        <w:t>Bei Code muss ich meinen eigenen brutalen Satz allerdings einschränken, weil die Ausnahme die wichtige ist. „Läuft oder läuft nicht" gilt für abstürzende Programme, nicht für solche, die laufen und dabei still falsch rechnen. Ein Skript, das zwei Exporte zusammenführt und jede Zeile verwirft, in der ein Feld leer ist, wirft keine Fehlermeldung. Es liefert eine Tabelle. Eine schöne, plausible, kürzere Tabelle. Mir ist das passiert, und ich habe es nicht am Code gemerkt, sondern daran, dass eine Summe nicht zu einer Zahl passte, die ich aus einem ganz anderen Grund im Kopf hatte. Seitdem gilt für selbstgebaute Werkzeuge: Ich brauche mindestens einen Fall, dessen Ergebnis ich unabhängig weiß, und den lasse ich jedes Mal mitlaufen.</w:t>
-      </w:r>
-    </w:p>
-    <w:p>
-      <w:pPr>
-        <w:pStyle w:val="Fliesstext"/>
-        <w:ind w:firstLine="283"/>
-      </w:pPr>
-      <w:r>
-        <w:t>Die zweite Ecke ist teuer, aber sofort sichtbar, und damit beherrschbar. Eine Herzoperation ist teuer, wenn sie schiefgeht — aber sie geht nicht unbemerkt schief. Eine Änderung im Produktivsystem kann viel Schaden anrichten, und genau deshalb hat jemand Tests, eine Freigabe und einen Weg zurück gebaut. In dieser Ecke steckt der ganze Aufwand, den Ingenieure seit hundert Jahren treiben, und er hat immer denselben Zweck: Sichtbarkeit kaufen. Wer dafür sorgt, dass Fehler sofort weh tun, hat aus einem Risiko einen Vorfall gemacht, und Vorfälle kann man bearbeiten.</w:t>
-      </w:r>
-    </w:p>
-    <w:p>
-      <w:pPr>
-        <w:pStyle w:val="Fliesstext"/>
-        <w:ind w:firstLine="283"/>
-      </w:pPr>
-      <w:r>
-        <w:t>Die dritte Ecke ist die schleichende: billig im Einzelfall, aber unsichtbar. Sie wird kaum diskutiert, weil sich über jeden einzelnen Fall nicht streiten lässt. Du lässt dir einen Bericht zusammenfassen, den du nie im Original liest, eine Seite aus dem Norwegischen übersetzen, die Garzeit ausrechnen, den Weg beschreiben. Jeder dieser Fälle ist zu klein, um ihn zu prüfen; das ist keine Faulheit, sondern eine richtige Rechnung. Der Schaden liegt in der Menge. Nach hundert solchen Vorgängen hat sich dein Bild von einem Thema um ein paar Grad verschoben, und du hast keinen Kompass, an dem du das merken würdest. Was hilft, ist unspektakulär: ab und zu eine Stichprobe, nicht um diesen einen Fall aufzuklären, sondern um deine eigene Fehlerquote überhaupt schätzen zu können. Ich halte etwa einmal im Monat eine Zusammenfassung gegen das Original. Manchmal ist sie tadellos. Manchmal fehlt genau der Satz, auf den es angekommen wäre.</w:t>
+        <w:t>Bei Code muss ich meinen eigenen brutalen Satz allerdings einschränken, weil die Ausnahme die wichtige ist. „Läuft oder läuft nicht" gilt für abstürzende Programme, nicht für solche, die laufen und dabei still falsch rechnen. Ein Skript, das zwei Exporte zusammenführt und jede Zeile verwirft, in der ein Feld leer ist, wirft keine Fehlermeldung. Es liefert eine Tabelle. Eine schöne, plausible, kürzere Tabelle. Mir ist das passiert, und ich habe es nicht am Code gemerkt, sondern daran, dass eine Summe nicht zu einer Zahl passte, die ich aus ganz anderem Grund im Kopf hatte. Seitdem gilt: Ich brauche mindestens einen Fall, dessen Ergebnis ich unabhängig weiß, und den lasse ich jedes Mal mitlaufen.</w:t>
+      </w:r>
+    </w:p>
+    <w:p>
+      <w:pPr>
+        <w:pStyle w:val="Fliesstext"/>
+        <w:ind w:firstLine="283"/>
+      </w:pPr>
+      <w:r>
+        <w:t>Die zweite Ecke ist teuer, aber sofort sichtbar, und damit beherrschbar. Eine Herzoperation ist teuer, wenn sie schiefgeht — aber sie geht nicht unbemerkt schief. Eine Änderung im Produktivsystem kann viel Schaden anrichten, und genau deshalb hat jemand Tests, eine Freigabe und einen Weg zurück gebaut. In dieser Ecke steckt der Aufwand, den Ingenieure seit hundert Jahren treiben, und er hat immer denselben Zweck: Sichtbarkeit kaufen. Wer dafür sorgt, dass Fehler sofort weh tun, hat aus einem Risiko einen Vorfall gemacht, und Vorfälle kann man bearbeiten.</w:t>
+      </w:r>
+    </w:p>
+    <w:p>
+      <w:pPr>
+        <w:pStyle w:val="Fliesstext"/>
+        <w:ind w:firstLine="283"/>
+      </w:pPr>
+      <w:r>
+        <w:t>Die dritte Ecke ist die schleichende: billig im Einzelfall, aber unsichtbar. Du lässt dir einen Bericht zusammenfassen, den du nie im Original liest, eine Seite aus dem Norwegischen übersetzen, die Garzeit ausrechnen, den Weg beschreiben. Jeder dieser Fälle ist zu klein, um ihn zu prüfen; das ist keine Faulheit, sondern eine richtige Rechnung. Der Schaden liegt in der Menge. Nach hundert solchen Vorgängen hat sich dein Bild von einem Thema um ein paar Grad verschoben, und du hast keinen Kompass, an dem du das merken würdest. Was hilft, ist unspektakulär: ab und zu eine Stichprobe, nicht um diesen einen Fall aufzuklären, sondern um die eigene Fehlerquote überhaupt schätzen zu können. Ich halte etwa einmal im Monat eine Zusammenfassung gegen das Original. Manchmal ist sie tadellos. Manchmal fehlt genau der Satz, auf den es angekommen wäre.</w:t>
       </w:r>
     </w:p>
     <w:p>
@@ -12524,16 +12524,16 @@
         <w:ind w:firstLine="283"/>
       </w:pPr>
       <w:r>
-        <w:t>Zwei Dinge verzerren diese Fläche, wenn man sie übersieht. Das erste ist die Stückzahl. Ein Fehler in einer einzelnen Anfrage ist ein Ärgernis; derselbe Fehlertyp in einem Bot, der viertausendmal im Monat läuft, ist eine Serie. Und Maschinenfehler verteilen sich anders als menschliche: Ein Mensch macht wechselnde Fehler, meistens wenn er müde ist, ein System denselben, zuverlässig, bei derselben Sorte Fall. Das ist die schlechte Nachricht, weil sich so etwas unbemerkt summiert. Es ist zugleich die gute, denn systematische Fehler findet man, wenn man nach einem Muster sucht statt nach Pech.</w:t>
-      </w:r>
-    </w:p>
-    <w:p>
-      <w:pPr>
-        <w:pStyle w:val="Fliesstext"/>
-        <w:ind w:firstLine="283"/>
-      </w:pPr>
-      <w:r>
-        <w:t>Das zweite ist die Umkehrbarkeit. Ein Entwurf im Postausgang und dieselbe Mail beim Kunden sind nicht dasselbe Risiko, auch wenn der Text identisch ist. Zwischen einem Vorschlag, den jemand bestätigt, und einer Buchung, die das System selbst auslöst, liegt genau eine Klickstrecke, und die entscheidet, ob ein Fehler eine Korrektur wird oder ein Storno mit Aktenvermerk. Wenn ich unsicher bin, baue ich zuerst die umkehrbare Variante. Aus der kann man nach drei Monaten die andere machen. Umgekehrt nie.</w:t>
+        <w:t>Zwei Dinge verzerren diese Fläche. Das erste ist die Stückzahl. Ein Fehler in einer einzelnen Anfrage ist ein Ärgernis; derselbe Fehlertyp in einem Bot, der viertausendmal im Monat läuft, ist eine Serie. Und Maschinenfehler verteilen sich anders als menschliche: Ein Mensch macht wechselnde Fehler, meistens wenn er müde ist, ein System denselben, zuverlässig, bei derselben Sorte Fall. Das ist die schlechte Nachricht und zugleich die gute, denn systematische Fehler findet man, wenn man nach einem Muster sucht statt nach Pech.</w:t>
+      </w:r>
+    </w:p>
+    <w:p>
+      <w:pPr>
+        <w:pStyle w:val="Fliesstext"/>
+        <w:ind w:firstLine="283"/>
+      </w:pPr>
+      <w:r>
+        <w:t>Das zweite ist die Umkehrbarkeit. Ein Entwurf im Postausgang und dieselbe Mail beim Kunden sind nicht dasselbe Risiko, auch wenn der Text identisch ist. Zwischen einem Vorschlag, den jemand bestätigt, und einer Buchung, die das System selbst auslöst, liegt eine Klickstrecke, und die entscheidet, ob ein Fehler eine Korrektur wird oder ein Storno mit Aktenvermerk. Aus der umkehrbaren Variante kann man nach drei Monaten die andere machen. Umgekehrt nie.</w:t>
       </w:r>
     </w:p>
     <w:p>
@@ -12567,52 +12567,52 @@
         <w:pStyle w:val="Fliesstext"/>
       </w:pPr>
       <w:r>
-        <w:t>Nimm die Zahl im Reporting und spiel sie durch. Eine Kollegin hat einen Datenexport, zweitausend Zeilen, und lässt sich daraus eine Auswertung bauen. Ergebnis: ein Prozentwert. Der wandert auf eine Folie, die Folie in eine Vorlage, die Vorlage in eine Sitzung, in der eine Entscheidung fällt. An welcher Stelle dieser Kette hätte jemand gemerkt, dass die Zahl nicht stimmt? An keiner. Folien haben kein Prüfverfahren, sie haben ein Layout. Ich halte es deshalb mit einer Arbeitsteilung: Zahlen kommen aus dem System, das sie verantwortet. Das Modell darf sie erklären, einordnen und mir sagen, was daran auffällig ist. Erzeugen darf es sie nicht.</w:t>
-      </w:r>
-    </w:p>
-    <w:p>
-      <w:pPr>
-        <w:pStyle w:val="Fliesstext"/>
-        <w:ind w:firstLine="283"/>
-      </w:pPr>
-      <w:r>
-        <w:t>Der zweite Fall ist mir näher, als mir lieb ist. Meine Mutter lebt seit über fünfunddreißig Jahren hier und tut sich mit der Sprache immer noch schwer. Amtsbriefe waren in meiner Kindheit ein Familienereignis, und dass so ein Brief heute in zwei Sekunden verständlich wird, ist eine echte Erleichterung, die ich nicht kleinreden will. Ich habe trotzdem eine Grenze. Wo eine Frist, ein Widerspruch oder ein Betrag drinsteht, lese ich selbst oder rufe an. Nicht, weil die Übersetzung meistens falsch wäre — sie ist meistens gut. Sondern weil ich es nicht merken würde, wenn sie es nicht ist, und weil dieser Fehler nicht auffliegt, sondern verfällt. Fristen sind der Prototyp des teuren, unsichtbaren Fehlers: Du erfährst vom Problem, wenn es nicht mehr zu lösen ist.</w:t>
-      </w:r>
-    </w:p>
-    <w:p>
-      <w:pPr>
-        <w:pStyle w:val="Fliesstext"/>
-        <w:ind w:firstLine="283"/>
-      </w:pPr>
-      <w:r>
-        <w:t>Bei der Gesundheit wird die Grenze oft falsch gezogen. Sie heißt nicht „frag nie". Sich einen Befund erklären zu lassen, den man schon hat, oder sich vor einem Termin fünf vernünftige Fragen zurechtzulegen, halte ich für eine der besseren Anwendungen überhaupt. Die Grenze liegt zwischen erklären lassen und entscheiden lassen. Wer sich einen Laborwert übersetzen lässt, bleibt in der prüfbaren Ecke, weil beim nächsten Termin jemand sitzt, der es besser weiß. Wer sich aufgrund einer Auskunft gegen den Termin entscheidet, ist in der teuren, unsichtbaren gelandet, ohne es zu merken — ein ausgefallener Termin produziert kein Ereignis.</w:t>
-      </w:r>
-    </w:p>
-    <w:p>
-      <w:pPr>
-        <w:pStyle w:val="Fliesstext"/>
-        <w:ind w:firstLine="283"/>
-      </w:pPr>
-      <w:r>
-        <w:t>Der vierte Fall ist der mit den Menschen darin. Vorauswahl von Bewerbungen, Zuteilung von Leistungen, Priorisierung von Kunden. Amazon steht oben, aber der Punkt reicht weiter als bis zu dem einen Werkzeug. Buolamwini und Gebru prüften 2018 drei kommerzielle Systeme zur Geschlechtsklassifikation aus Gesichtern; bei hellhäutigen Männern lag die Fehlerrate bei 0,8 Prozent, bei dunkelhäutigen Frauen bei bis zu 34,7 Prozent.[16] Über alle Gruppen gemittelt hätte man ein Werkzeug mit ordentlicher Trefferquote gesehen. Der Durchschnitt ist die zuverlässigste Art, ein Problem zu verstecken. Daraus folgt für mich eine Frage, die in jede Abnahme gehört und fast nie gestellt wird: Für wen ist dieses System schlechter als im Mittel, und wer hat nachgesehen?</w:t>
-      </w:r>
-    </w:p>
-    <w:p>
-      <w:pPr>
-        <w:pStyle w:val="Fliesstext"/>
-        <w:ind w:firstLine="283"/>
-      </w:pPr>
-      <w:r>
-        <w:t>Und dann der Fall, der so harmlos aussieht, dass ich ihn am häufigsten sehe. Eine lange E-Mail-Kette, zwanzig Nachrichten, zwei Anhänge, und du lässt dir zusammenfassen, worum es geht, um dann zu antworten. Zusammenfassungen sind gut geworden. Ihr typischer Fehler ist aber nicht die falsche Aussage, sondern die fehlende. Ein falscher Satz fällt auf, weil er sich an etwas reibt, das du weißt. Ein fehlender Satz reibt sich an gar nichts. Der Halbsatz, in dem jemand einen Vorbehalt gemacht hat, ist nicht drin, und du antwortest, als hätte es ihn nie gegeben. Ich lasse mir deshalb nichts zusammenfassen, was ich anschließend verantworten muss.</w:t>
-      </w:r>
-    </w:p>
-    <w:p>
-      <w:pPr>
-        <w:pStyle w:val="Fliesstext"/>
-        <w:ind w:firstLine="283"/>
-      </w:pPr>
-      <w:r>
-        <w:t>In dieser Ecke gibt es genau zwei ehrliche Antworten. Entweder du setzt eine Prüfung davor, die diesen Namen verdient, oder du lässt es. Es gibt auch eine dritte, unehrliche: es trotzdem machen und hoffen, dass nichts passiert. Die funktioniert erstaunlich lange, und das ist ihr Problem.</w:t>
+        <w:t>Nimm die Zahl im Reporting und spiel sie durch. Eine Kollegin hat einen Datenexport, zweitausend Zeilen, und lässt sich daraus eine Auswertung bauen. Ergebnis: ein Prozentwert. Der wandert auf eine Folie, die Folie in eine Vorlage, die Vorlage in eine Sitzung, in der eine Entscheidung fällt. An welcher Stelle dieser Kette hätte jemand gemerkt, dass die Zahl nicht stimmt? An keiner. Folien haben kein Prüfverfahren, sie haben ein Layout. Ich halte es deshalb mit einer Arbeitsteilung: Zahlen kommen aus dem System, das sie verantwortet. Erklären darf das Modell sie, erzeugen nicht.</w:t>
+      </w:r>
+    </w:p>
+    <w:p>
+      <w:pPr>
+        <w:pStyle w:val="Fliesstext"/>
+        <w:ind w:firstLine="283"/>
+      </w:pPr>
+      <w:r>
+        <w:t>Der zweite Fall ist mir näher, als mir lieb ist. Meine Mutter lebt seit über fünfunddreißig Jahren hier und tut sich mit der Sprache immer noch schwer. Amtsbriefe waren in meiner Kindheit ein Familienereignis, und dass so ein Brief heute in zwei Sekunden verständlich wird, ist eine echte Erleichterung. Ich habe trotzdem eine Grenze: Wo eine Frist, ein Widerspruch oder ein Betrag drinsteht, lese ich selbst oder rufe an. Nicht, weil die Übersetzung meistens falsch wäre, sie ist meistens gut. Sondern weil ich es nicht merken würde, wenn sie es nicht ist, und weil dieser Fehler nicht auffliegt, sondern verfällt. Fristen sind der Prototyp des teuren, unsichtbaren Fehlers: Du erfährst vom Problem, wenn es nicht mehr zu lösen ist.</w:t>
+      </w:r>
+    </w:p>
+    <w:p>
+      <w:pPr>
+        <w:pStyle w:val="Fliesstext"/>
+        <w:ind w:firstLine="283"/>
+      </w:pPr>
+      <w:r>
+        <w:t>Bei der Gesundheit wird die Grenze oft falsch gezogen. Sie heißt nicht „frag nie". Sich einen Befund erklären zu lassen, den man schon hat, oder sich vor einem Termin fünf vernünftige Fragen zurechtzulegen, halte ich für eine der besseren Anwendungen überhaupt. Die Grenze liegt zwischen erklären lassen und entscheiden lassen. Wer sich einen Laborwert übersetzen lässt, bleibt in der prüfbaren Ecke, weil beim nächsten Termin jemand sitzt, der es besser weiß. Wer sich aufgrund einer Auskunft gegen den Termin entscheidet, merkt nichts, denn ein ausgefallener Termin produziert kein Ereignis.</w:t>
+      </w:r>
+    </w:p>
+    <w:p>
+      <w:pPr>
+        <w:pStyle w:val="Fliesstext"/>
+        <w:ind w:firstLine="283"/>
+      </w:pPr>
+      <w:r>
+        <w:t>Der vierte Fall ist der mit den Menschen darin: Vorauswahl von Bewerbungen, Zuteilung von Leistungen, Priorisierung von Kunden. Amazon steht oben, aber der Punkt reicht weiter als bis zu dem einen Werkzeug. Buolamwini und Gebru prüften 2018 drei kommerzielle Systeme zur Geschlechtsklassifikation aus Gesichtern; bei hellhäutigen Männern lag die Fehlerrate bei 0,8 Prozent, bei dunkelhäutigen Frauen bei bis zu 34,7 Prozent.[16] Über alle Gruppen gemittelt hätte man ein Werkzeug mit ordentlicher Trefferquote gesehen. Der Durchschnitt ist die zuverlässigste Art, ein Problem zu verstecken. Daraus folgt eine Frage, die in jede Abnahme gehört und fast nie gestellt wird: Für wen ist dieses System schlechter als im Mittel, und wer hat nachgesehen?</w:t>
+      </w:r>
+    </w:p>
+    <w:p>
+      <w:pPr>
+        <w:pStyle w:val="Fliesstext"/>
+        <w:ind w:firstLine="283"/>
+      </w:pPr>
+      <w:r>
+        <w:t>Und dann der Fall, der so harmlos aussieht, dass ich ihn am häufigsten sehe. Eine E-Mail-Kette, zwanzig Nachrichten, zwei Anhänge, und du lässt dir zusammenfassen, worum es geht, um dann zu antworten. Der typische Fehler einer Zusammenfassung ist nicht die falsche Aussage, sondern die fehlende. Ein falscher Satz fällt auf, weil er sich an etwas reibt, das du weißt; ein fehlender reibt sich an gar nichts. Der Halbsatz, in dem jemand einen Vorbehalt gemacht hat, ist nicht drin, und du antwortest, als hätte es ihn nie gegeben. Ich lasse mir deshalb nichts zusammenfassen, was ich anschließend verantworten muss.</w:t>
+      </w:r>
+    </w:p>
+    <w:p>
+      <w:pPr>
+        <w:pStyle w:val="Fliesstext"/>
+        <w:ind w:firstLine="283"/>
+      </w:pPr>
+      <w:r>
+        <w:t>In dieser Ecke gibt es zwei ehrliche Antworten: eine Prüfung davor, die diesen Namen verdient, oder es lassen. Es gibt auch eine dritte, unehrliche — es trotzdem machen und hoffen. Die funktioniert erstaunlich lange, und das ist ihr Problem.</w:t>
       </w:r>
     </w:p>
     <w:p>
@@ -12655,7 +12655,7 @@
         <w:ind w:firstLine="283"/>
       </w:pPr>
       <w:r>
-        <w:t>Bei Zahlen prüfe ich vier Dinge fast automatisch. Was ist der Nenner — Prozent wovon? Aus welchem Jahr stammt die Zahl, und womit wird sie verglichen? Welche Einheit, und passt die Größenordnung zu etwas, das ich kenne? Und wer hat gezählt, in wessen Auftrag? Das dauert selten länger als eine Minute. Ein Beispiel, das in jeder Firma so ähnlich vorkommt: „Vierzig Prozent unserer Tickets sind Standardfälle." Schöne Zahl, Grundlage für ein Automatisierungsvorhaben. Vierzig Prozent von welchen Tickets — allen, oder denen aus dem einen Postfach, das ausgewertet wurde? Über welchen Zeitraum, und war der normal? Und wer hat entschieden, was ein Standardfall ist? Ich habe noch kein Projekt erlebt, in dem diese Rückfragen die Zahl unverändert gelassen hätten.</w:t>
+        <w:t>Bei Zahlen prüfe ich vier Dinge fast automatisch. Was ist der Nenner — Prozent wovon? Aus welchem Jahr stammt die Zahl, und womit wird sie verglichen? Passt die Größenordnung zu etwas, das ich kenne? Und wer hat gezählt, in wessen Auftrag? Ein Beispiel, das in jeder Firma so ähnlich vorkommt: „Vierzig Prozent unserer Tickets sind Standardfälle." Schöne Zahl, Grundlage für ein Automatisierungsvorhaben. Vierzig Prozent von welchen Tickets — allen, oder denen aus dem einen Postfach, das ausgewertet wurde? Über welchen Zeitraum, und war der normal? Und wer hat entschieden, was ein Standardfall ist? Ich habe noch kein Projekt erlebt, in dem diese Rückfragen die Zahl unverändert gelassen hätten. Im Meeting greift man dafür übrigens besser nicht die Zahl an, sondern fragt nach der Herkunft. „Aus welchem Feld kommt das denn?" ist keine Unterstellung, und wenn die Antwort „das kann ich nachliefern" lautet, haben es alle gehört, ohne dass jemand vorgeführt wurde.</w:t>
       </w:r>
     </w:p>
     <w:p>
@@ -12673,7 +12673,7 @@
         <w:ind w:firstLine="283"/>
       </w:pPr>
       <w:r>
-        <w:t>Bleibt die schwierigste Frage: Woran merkst du, dass eine Antwort plausibel klingt und trotzdem falsch ist, wenn du nicht jede Behauptung nachschlagen kannst? Ich habe darauf keine Methode, nur Warnsignale, und die gebe ich als Erfahrung weiter, nicht als Befund. Erstens: Die Antwort ist glatter als der Sachverhalt. Bei komplizierten Dingen ist Reibung ein Qualitätsmerkmal; fehlt sie, fehlt etwas. Zweitens: runde Zahlen ohne Fundstelle. Drittens: Präzision an der falschen Stelle — exaktes Datum, Seitenzahl, aber kein Wort dazu, wie belastbar der Befund ist. Und viertens, mein bestes Signal: Widersprich einmal. Ein Modell, das dir sofort zustimmt, obwohl du gerade Unsinn geschrieben hast, hat dir vorgeführt, was seine Zustimmung wert ist.</w:t>
+        <w:t>Bleibt die schwierigste Frage: Woran merkst du, dass eine Antwort plausibel klingt und trotzdem falsch ist, wenn du nicht jede Behauptung nachschlagen kannst? Ich habe darauf keine Methode, nur Warnsignale, und die gebe ich als Erfahrung weiter, nicht als Befund. Die Antwort ist glatter als der Sachverhalt — bei komplizierten Dingen ist Reibung ein Qualitätsmerkmal, und fehlt sie, fehlt etwas. Runde Zahlen ohne Fundstelle. Präzision an der falschen Stelle, also exaktes Datum und Seitenzahl, aber kein Wort dazu, wie belastbar der Befund ist. Und mein bestes Signal: Widersprich einmal. Ein Modell, das dir sofort zustimmt, obwohl du gerade Unsinn geschrieben hast, hat dir vorgeführt, was seine Zustimmung wert ist.</w:t>
       </w:r>
     </w:p>
     <w:p>
@@ -12691,15 +12691,6 @@
         <w:ind w:firstLine="283"/>
       </w:pPr>
       <w:r>
-        <w:t>Und im Meeting hilft es, nicht die Zahl anzugreifen, sondern die Herkunft zu erfragen. „Aus welchem Feld kommt das denn?" ist keine Unterstellung. Lautet die Antwort „das kann ich nachliefern", ist die Zahl eben noch keine Zahl, und alle haben es gehört, ohne dass jemand vorgeführt wurde.</w:t>
-      </w:r>
-    </w:p>
-    <w:p>
-      <w:pPr>
-        <w:pStyle w:val="Fliesstext"/>
-        <w:ind w:firstLine="283"/>
-      </w:pPr>
-      <w:r>
         <w:t xml:space="preserve">Und jetzt der Teil, den die Produktivitätsversprechen gern unterschlagen: Prüfen kostet. Manchmal kostet es fast nichts — Tests laufen lassen, eine Übersetzung in einer Sprache lesen, die du kannst, eine Zusammenfassung gegen ein Dokument halten, das vor dir liegt. Manchmal kostet es fast so viel wie die Arbeit selbst, und dann ist der Gewinn weg. Ein randomisiertes Experiment von METR ist dafür der beste Beleg, den ich kenne: Sechzehn erfahrene Open-Source-Entwickler arbeiteten mit KI-Werkzeugen an ihren eigenen, großen Repositories — und brauchten neunzehn Prozent </w:t>
       </w:r>
       <w:r>
@@ -12718,7 +12709,7 @@
         <w:ind w:firstLine="283"/>
       </w:pPr>
       <w:r>
-        <w:t>Daneben steht ein Befund, der auf den ersten Blick das Gegenteil sagt. In einem kontrollierten Experiment, in dem Entwickler einen HTTP-Server in JavaScript bauen sollten, war die Gruppe mit GitHub Copilot rund 56 Prozent schneller, einundsiebzig gegen hundertsechzig Minuten — ein nicht begutachtetes Arbeitspapier und eine Laboraufgabe, das gehört dazugesagt.[17] Beides kann stimmen, und die Kombination ist aufschlussreicher als jede der beiden Zahlen für sich. Eine abgegrenzte, neue Aufgabe, deren Ergebnis man sofort testen kann, liegt in der billigen, sichtbaren Ecke der Fläche von vorhin. Eine gewachsene Codebasis, die man seit Jahren kennt, liegt woanders: Fehler teuer, Prüfen mühsam, eigenes Wissen schneller. Das sind keine widersprüchlichen Studien, sondern dieselbe Landkarte mit Messwerten.</w:t>
+        <w:t>Daneben steht ein Befund, der das Gegenteil zu sagen scheint. In einem kontrollierten Experiment, in dem Entwickler einen HTTP-Server in JavaScript bauen sollten, war die Gruppe mit GitHub Copilot rund 56 Prozent schneller, einundsiebzig gegen hundertsechzig Minuten — nicht begutachtetes Arbeitspapier, Laboraufgabe, das gehört dazugesagt.[17] Beides kann stimmen. Eine abgegrenzte, neue Aufgabe, deren Ergebnis man sofort testen kann, liegt in der billigen, sichtbaren Ecke; eine gewachsene Codebasis, die man seit Jahren kennt, liegt woanders. Keine widersprüchlichen Studien, sondern dieselbe Landkarte mit Messwerten.</w:t>
       </w:r>
     </w:p>
     <w:p>
@@ -12840,16 +12831,16 @@
         <w:ind w:firstLine="283"/>
       </w:pPr>
       <w:r>
-        <w:t>Wer verbreitet das? Damit ist nicht deine Tante gemeint, sie hat es weitergeleitet. Gemeint ist das Konto, an dem es ursprünglich hängt: Wie alt ist es, was postet es sonst, verdient es Geld mit Reichweite? Dann: Wo taucht es zum ersten Mal auf? Ein Standbild in die Rückwärtssuche, und du siehst die früheste Fundstelle. Kursiert ein „aktuelles" Video seit 2019, ist die Sache erledigt, ohne dass du ein einziges Pixel angesehen hast. Dann: Was war der Anlass? Material taucht selten grundlos auf, und Timing ist ein Befund — zwei Tage vor einer Wahl, am Morgen einer Abstimmung, mitten in der Woche, in der über genau dieses Thema gestritten wird. Dann: Was ist weggeschnitten? Bei den billigen Fälschungen liegt der Trick fast immer im Rahmen, nicht im Bild. Was passierte dreißig Sekunden davor, was danach, und gibt es die ungeschnittene Aufnahme? Und schließlich: Berichtet außer diesem einen Kanal jemand darüber, der etwas zu verlieren hat, wenn er sich irrt?</w:t>
-      </w:r>
-    </w:p>
-    <w:p>
-      <w:pPr>
-        <w:pStyle w:val="Fliesstext"/>
-        <w:ind w:firstLine="283"/>
-      </w:pPr>
-      <w:r>
-        <w:t>Diese Fragen sind aus drei Gründen die bessere Investition. Das meiste Material, das dich erreicht, ist gar keine KI-Fälschung, sondern echtes Material im falschen Rahmen — dagegen hilft kein Detektor, weil am Bild nichts zu erkennen ist. Artefakte veralten außerdem; jede Modellgeneration räumt ein paar weg, während sich die Frage, wer etwas wann in Umlauf gebracht hat, nicht wegentwickeln lässt. Und die Kontextprüfung funktioniert in beide Richtungen. In meinen Workshops erlebe ich es inzwischen häufiger, dass jemand ein echtes Foto für generiert erklärt, als dass jemand auf eine Fälschung hereinfällt. Das ist meine Beobachtung, keine Statistik, aber sie beunruhigt mich mehr als die andere Richtung. Wer alles für gefälscht hält, ist nicht kritisch, sondern nur nicht mehr ansprechbar.</w:t>
+        <w:t>Wer verbreitet das? Damit ist nicht deine Tante gemeint, sie hat es weitergeleitet. Gemeint ist das Konto, an dem es ursprünglich hängt: Wie alt ist es, was postet es sonst, verdient es Geld mit Reichweite? Wo taucht es zum ersten Mal auf? Ein Standbild in die Rückwärtssuche, und du siehst die früheste Fundstelle. Kursiert ein „aktuelles" Video seit 2019, ist die Sache erledigt, ohne dass du ein einziges Pixel angesehen hast. Was war der Anlass? Material taucht selten grundlos auf, und Timing ist ein Befund — zwei Tage vor einer Wahl, am Morgen einer Abstimmung. Was ist weggeschnitten? Bei den billigen Fälschungen liegt der Trick fast immer im Rahmen, nicht im Bild: Was passierte dreißig Sekunden davor, was danach, gibt es die ungeschnittene Aufnahme? Und berichtet außer diesem einen Kanal jemand darüber, der etwas zu verlieren hat, wenn er sich irrt?</w:t>
+      </w:r>
+    </w:p>
+    <w:p>
+      <w:pPr>
+        <w:pStyle w:val="Fliesstext"/>
+        <w:ind w:firstLine="283"/>
+      </w:pPr>
+      <w:r>
+        <w:t>Diese Fragen sind aus drei Gründen die bessere Investition. Das meiste Material, das dich erreicht, ist gar keine KI-Fälschung, sondern echtes Material im falschen Rahmen — dagegen hilft kein Detektor, weil am Bild nichts zu erkennen ist. Artefakte veralten außerdem, während sich die Frage, wer etwas wann in Umlauf gebracht hat, nicht wegentwickeln lässt. Und die Kontextprüfung wirkt in beide Richtungen. In meinen Workshops erlebe ich es inzwischen häufiger, dass jemand ein echtes Foto für generiert erklärt, als dass jemand auf eine Fälschung hereinfällt. Das ist meine Beobachtung, keine Statistik, aber sie beunruhigt mich mehr als die andere Richtung. Wer alles für gefälscht hält, ist nicht kritisch, sondern nur nicht mehr ansprechbar.</w:t>
       </w:r>
     </w:p>
     <w:p>
@@ -12937,15 +12928,6 @@
         <w:ind w:firstLine="283"/>
       </w:pPr>
       <w:r>
-        <w:t>Und was ich nur sage, wenn ich gefragt werde, weil es nicht mein Fachgebiet ist: Ein Chatfenster, das nachts um zwei antwortet, ist kein Mensch, der dich kennt. Es ist auch nicht nichts. Aber es weiß am Dienstag nicht mehr, wie es dir am Montag ging, und es wird niemanden anrufen. Wer mich das fragt, bekommt keine Diagnose, sondern eine Telefonnummer und das Angebot, sich hinzusetzen.</w:t>
-      </w:r>
-    </w:p>
-    <w:p>
-      <w:pPr>
-        <w:pStyle w:val="Fliesstext"/>
-        <w:ind w:firstLine="283"/>
-      </w:pPr>
-      <w:r>
         <w:t>Und dann sage ich noch etwas, das nichts mit Technik zu tun hat. Jeder ist seines Glückes Schmied. Das Werkzeug entscheidet nicht, wo du landest. Es beschleunigt nur den, der schon losgelaufen ist.</w:t>
       </w:r>
     </w:p>
@@ -13068,25 +13050,16 @@
         <w:ind w:firstLine="283"/>
       </w:pPr>
       <w:r>
-        <w:t>Bevor jemand fragt, ob ein Modell gut genug ist, stelle ich eine andere Frage, und sie erzeugt fast immer eine Pause: Wie gut ist es denn heute? Wie viele Vorgänge werden im Moment falsch bearbeitet — im Urlaub, am Freitagnachmittag, in der Einarbeitung eines neuen Kollegen? Fast nie weiß das jemand. Ohne diese Zahl ist jede Diskussion über Modellqualität eine Meinungsäußerung, denn der Maßstab ist nicht Fehlerfreiheit, den erfüllt kein Prozess der Welt, sondern der heutige Zustand. Und der ist regelmäßig schlechter, als alle Beteiligten annehmen.</w:t>
-      </w:r>
-    </w:p>
-    <w:p>
-      <w:pPr>
-        <w:pStyle w:val="Fliesstext"/>
-        <w:ind w:firstLine="283"/>
-      </w:pPr>
-      <w:r>
-        <w:t>Läuft es dann, lasse ich es erst einmal mitlaufen, ohne dass es entscheidet. Das System bekommt jeden Fall, sagt, was es täte, und ein Mensch arbeitet weiter wie bisher. Nach ein paar Wochen vergleicht man. Interessant sind nicht die Übereinstimmungen, sondern die Abweichungen — nicht weil dort feststünde, wer recht hat, sondern weil dort die unklaren Regeln liegen.</w:t>
-      </w:r>
-    </w:p>
-    <w:p>
-      <w:pPr>
-        <w:pStyle w:val="Fliesstext"/>
-        <w:ind w:firstLine="283"/>
-      </w:pPr>
-      <w:r>
-        <w:t>Benenne namentlich, wer prüft, und gib dieser Person die Zeit dafür. Beides wird gern zugesagt und selten getan. Ob es echt ist, erkennst du an einer Frage: Wie viele Fälle hat sie im letzten Quartal zurückgeschickt? Ist die Antwort null, prüft niemand, egal was im Prozessdiagramm steht. Prüfermüdung ist dabei ein Konstruktionsproblem, kein Charakterproblem. Wer hundert korrekte Vorschläge hintereinander abnickt, nickt den hunderteinsten auch ab, und das ist keine Nachlässigkeit, sondern die Art, wie Aufmerksamkeit funktioniert. Dagegen hilft nur Bauweise: Stichproben mit bekannten Fehlern, Rotation, und die Prüfperson wird nicht am Durchsatz gemessen. Wer sie am Durchsatz misst, hat die Kontrolle abgeschafft und die Dokumentation behalten.</w:t>
+        <w:t>Bevor jemand fragt, ob ein Modell gut genug ist, stelle ich eine andere Frage, und sie erzeugt fast immer eine Pause: Wie gut ist es denn heute? Wie viele Vorgänge werden im Moment falsch bearbeitet — im Urlaub, am Freitagnachmittag, in der Einarbeitung eines neuen Kollegen? Fast nie weiß das jemand. Ohne diese Zahl ist jede Diskussion über Modellqualität eine Meinungsäußerung, denn der Maßstab ist nicht Fehlerfreiheit, den erfüllt kein Prozess der Welt, sondern der heutige Zustand. Danach lasse ich das System eine Weile mitlaufen, ohne dass es entscheidet: Es bekommt jeden Fall, sagt, was es täte, und ein Mensch arbeitet weiter wie bisher. Interessant sind hinterher nicht die Übereinstimmungen, sondern die Abweichungen — nicht weil dort feststünde, wer recht hat, sondern weil dort die unklaren Regeln liegen.</w:t>
+      </w:r>
+    </w:p>
+    <w:p>
+      <w:pPr>
+        <w:pStyle w:val="Fliesstext"/>
+        <w:ind w:firstLine="283"/>
+      </w:pPr>
+      <w:r>
+        <w:t>Benenne namentlich, wer prüft, und gib dieser Person die Zeit dafür. Beides wird gern zugesagt und selten getan. Ob es echt ist, erkennst du an einer Frage: Wie viele Fälle hat sie im letzten Quartal zurückgeschickt? Ist die Antwort null, prüft niemand, egal was im Prozessdiagramm steht. Prüfermüdung ist dabei ein Konstruktionsproblem, kein Charakterproblem. Wer hundert korrekte Vorschläge hintereinander abnickt, nickt den hunderteinsten auch ab. Dagegen hilft nur Bauweise: Stichproben mit bekannten Fehlern, Rotation, und die Prüfperson wird nicht am Durchsatz gemessen. Wer sie am Durchsatz misst, hat die Kontrolle abgeschafft und die Dokumentation behalten.</w:t>
       </w:r>
     </w:p>
     <w:p>
@@ -13104,34 +13077,25 @@
         <w:ind w:firstLine="283"/>
       </w:pPr>
       <w:r>
-        <w:t>Zur Rückfallebene eine Frage, die ich in der ersten Sitzung stelle: Könnt ihr zwei Wochen ohne? Lautet die Antwort, dann breche der Betrieb zusammen, habt ihr kein Automatisierungsvorhaben gebaut, sondern eine Abhängigkeit. Der alte Weg muss eine Weile am Leben bleiben, auch wenn er Geld kostet und niemand ihn mag. Und wenn jemand in einer Abteilung still eine Excel-Liste parallel weiterführt, ist das kein Verstoß gegen die neue Ordnung, sondern ein Symptom, meistens ein zutreffendes. Ich frage dann nicht, warum die Liste noch existiert, sondern was in ihr steht, das im System fehlt.</w:t>
-      </w:r>
-    </w:p>
-    <w:p>
-      <w:pPr>
-        <w:pStyle w:val="Fliesstext"/>
-        <w:ind w:firstLine="283"/>
-      </w:pPr>
-      <w:r>
-        <w:t>Bei der Abschaltbarkeit ist die entscheidende Frage nicht, ob es einen Notaus gibt, sondern wer ihn drücken darf, ohne vorher zu fragen. Ist die Antwort ein Gremium, das dienstags tagt, gibt es keinen Notaus. Es gibt einen Antrag.</w:t>
-      </w:r>
-    </w:p>
-    <w:p>
-      <w:pPr>
-        <w:pStyle w:val="Fliesstext"/>
-        <w:ind w:firstLine="283"/>
-      </w:pPr>
-      <w:r>
-        <w:t>Und sag ehrlich, was mit der eingesparten Zeit passiert, bevor jemand danach fragt. Der Punkt kostet am meisten Mut und spart am meisten Ärger. Solange es niemand ausspricht, nimmt jeder im Raum die für ihn schlechteste Variante an, und Gerüchte sind schneller als jede Kommunikationsplanung. Eine unbequeme, klare Ansage wird besser aufgenommen als eine freundliche, unklare — nicht weil die Nachricht gut wäre, sondern weil die Leute wieder planen können.</w:t>
-      </w:r>
-    </w:p>
-    <w:p>
-      <w:pPr>
-        <w:pStyle w:val="Fliesstext"/>
-        <w:ind w:firstLine="283"/>
-      </w:pPr>
-      <w:r>
-        <w:t>Und eine Selbstverständlichkeit, die keine ist: Nicht jeder Prozess braucht KI. Vieles, was heute als KI-Projekt verkauft wird, ist ein Regelwerk mit vierzehn Fällen, und dann bau ein Regelwerk. Es ist billiger, prüfbarer und es halluziniert nicht. Ich habe in den letzten Jahren mehr Projekte gerettet, indem ich Technik herausgenommen habe, als indem ich welche hinzufügte.</w:t>
+        <w:t>Zur Rückfallebene die Frage, die ich in der ersten Sitzung stelle: Könnt ihr zwei Wochen ohne? Lautet die Antwort, dann breche der Betrieb zusammen, habt ihr kein Automatisierungsvorhaben gebaut, sondern eine Abhängigkeit. Der alte Weg muss eine Weile am Leben bleiben, auch wenn er Geld kostet und niemand ihn mag. Und wenn jemand still eine Excel-Liste parallel weiterführt, ist das kein Verstoß gegen die neue Ordnung, sondern ein Symptom, meistens ein zutreffendes. Ich frage dann nicht, warum die Liste existiert, sondern was in ihr steht, das im System fehlt. Beim Notaus wiederum ist die entscheidende Frage nicht, ob es ihn gibt, sondern wer ihn drücken darf, ohne vorher zu fragen. Ist die Antwort ein Gremium, das dienstags tagt, gibt es keinen Notaus, sondern einen Antrag.</w:t>
+      </w:r>
+    </w:p>
+    <w:p>
+      <w:pPr>
+        <w:pStyle w:val="Fliesstext"/>
+        <w:ind w:firstLine="283"/>
+      </w:pPr>
+      <w:r>
+        <w:t>Und sag ehrlich, was mit der eingesparten Zeit passiert, bevor jemand danach fragt. Der Punkt kostet am meisten Mut und spart am meisten Ärger. Solange es niemand ausspricht, nimmt jeder im Raum die für ihn schlechteste Variante an, und Gerüchte sind schneller als jede Kommunikationsplanung.</w:t>
+      </w:r>
+    </w:p>
+    <w:p>
+      <w:pPr>
+        <w:pStyle w:val="Fliesstext"/>
+        <w:ind w:firstLine="283"/>
+      </w:pPr>
+      <w:r>
+        <w:t>Eine Selbstverständlichkeit, die keine ist, zum Schluss: Nicht jeder Prozess braucht KI. Vieles, was heute als KI-Projekt verkauft wird, ist ein Regelwerk mit vierzehn Fällen, und dann bau ein Regelwerk. Es ist billiger, prüfbarer und es halluziniert nicht. Ich habe in den letzten Jahren mehr Projekte gerettet, indem ich Technik herausgenommen habe, als indem ich welche hinzufügte.</w:t>
       </w:r>
     </w:p>
     <w:p>
@@ -13285,7 +13249,7 @@
         <w:ind w:firstLine="283"/>
       </w:pPr>
       <w:r>
-        <w:t>Ein zweiter Befund aus den Fortschreibungen, den ich gleich wieder aufgreife: Die Zahl der Unternehmen mit veröffentlichten Sicherheitsrahmenwerken für Spitzenmodelle hat sich seit Anfang 2025 mehr als verdoppelt, während erhebliche Lücken bleiben.[22] Das ist Fortschritt. Die Frage, die mich daran interessiert, ist eine andere: Wer schreibt diese Rahmenwerke?</w:t>
+        <w:t>Ein zweiter Befund aus den Fortschreibungen, den ich gleich wieder aufgreife: Die Zahl der Unternehmen mit veröffentlichten Sicherheitsrahmenwerken für Spitzenmodelle hat sich seit Anfang 2025 mehr als verdoppelt, während erhebliche Lücken bleiben.[22] Das ist Fortschritt. Mich interessiert daran eine andere Frage: Wer schreibt diese Rahmenwerke?</w:t>
       </w:r>
     </w:p>
     <w:p>
@@ -13337,16 +13301,16 @@
         <w:ind w:firstLine="283"/>
       </w:pPr>
       <w:r>
-        <w:t>Ich muss an dieser Stelle etwas offenlegen. Belastbare Marktanteilszahlen — wie viel Prozent der weltweiten Rechenleistung für KI auf wie viele Unternehmen entfallen — habe ich für dieses Buch nicht in einer Qualität recherchiert, die ich dir hier hinlegen würde. Also lege ich sie nicht hin. Was ich stattdessen habe, sind Anhaltspunkte, und die reichen für die Größenordnung.</w:t>
-      </w:r>
-    </w:p>
-    <w:p>
-      <w:pPr>
-        <w:pStyle w:val="Fliesstext"/>
-        <w:ind w:firstLine="283"/>
-      </w:pPr>
-      <w:r>
-        <w:t>Zum Ausmaß der Infrastruktur: Rechenzentren verbrauchten 2024 weltweit rund 415 Terawattstunden Strom, etwa 1,5 Prozent des globalen Verbrauchs, mit einem Wachstum von rund 12 Prozent pro Jahr seit 2017 — mehr als viermal so schnell wie der Gesamtstromverbrauch. Die Internationale Energieagentur rechnet in ihrem Basisszenario mit einer Verdopplung auf etwa 945 Terawattstunden bis 2030; der Strombedarf KI-optimierter Rechenzentren soll sich dabei mehr als vervierfachen.[2] Ich habe diese Zahlen im achten Kapitel benutzt, um die Umweltpanik zu entschärfen, und dazu taugen sie auch: knapp drei Prozent des Weltstroms sind relevant, aber nicht der Untergang. Hier taugen dieselben Zahlen für etwas anderes. Sie beschreiben, was gerade gebaut wird, und wer so etwas baut, hat Kapital in einer Größenordnung, die von sich aus konzentrierend wirkt. Eine Druckerpresse konnte sich eine Stadt leisten. Ein Umspannwerk konnte sich ein Konzern leisten. Ein Trainingslauf an der Spitze des Feldes können sich weltweit eine Handvoll Akteure leisten. Das ist meine Einschätzung, keine gemessene Größe — aber sie folgt aus dem, was da an Beton und Strom entsteht.</w:t>
+        <w:t>Ich muss an dieser Stelle etwas offenlegen. Belastbare Marktanteilszahlen — wie viel Prozent der weltweiten Rechenleistung für KI auf wie viele Unternehmen entfallen — habe ich für dieses Buch nicht in einer Qualität recherchiert, die ich dir hier hinlegen würde. Also lege ich sie nicht hin. Was ich habe, sind Anhaltspunkte, und die reichen für die Größenordnung.</w:t>
+      </w:r>
+    </w:p>
+    <w:p>
+      <w:pPr>
+        <w:pStyle w:val="Fliesstext"/>
+        <w:ind w:firstLine="283"/>
+      </w:pPr>
+      <w:r>
+        <w:t>Zum Ausmaß der Infrastruktur: Rechenzentren verbrauchten 2024 weltweit rund 415 Terawattstunden Strom, etwa 1,5 Prozent des globalen Verbrauchs, mit einem Wachstum von rund 12 Prozent pro Jahr seit 2017 — mehr als viermal so schnell wie der Gesamtstromverbrauch. Die Internationale Energieagentur rechnet in ihrem Basisszenario mit einer Verdopplung auf etwa 945 Terawattstunden bis 2030; der Strombedarf KI-optimierter Rechenzentren soll sich dabei mehr als vervierfachen.[2] Im achten Kapitel haben diese Zahlen die Umweltpanik entschärft, und dazu taugen sie auch: knapp drei Prozent des Weltstroms sind relevant, aber nicht der Untergang. Hier taugen sie für etwas anderes. Sie beschreiben, was gerade gebaut wird, und wer so etwas baut, hat Kapital in einer Größenordnung, die von sich aus konzentrierend wirkt. Eine Druckerpresse konnte sich eine Stadt leisten. Ein Umspannwerk konnte sich ein Konzern leisten. Einen Trainingslauf an der Spitze des Feldes können sich weltweit eine Handvoll Akteure leisten. Das ist meine Einschätzung, keine gemessene Größe — sie folgt aus dem, was da an Beton und Strom entsteht.</w:t>
       </w:r>
     </w:p>
     <w:p>
@@ -13382,7 +13346,7 @@
         <w:ind w:firstLine="283"/>
       </w:pPr>
       <w:r>
-        <w:t>Bei den Daten sieht man dieselbe Mechanik von einer anderen Seite. Diese Modelle entstehen aus großen, teils aus dem Netz gesammelten Textmengen, und die Rechtsfragen dazu sind nicht geklärt, sondern werden gerade geklärt. Der Europäische Datenschutzausschuss hat Ende 2024 festgehalten, dass die Anonymität eines Modells im Einzelfall zu prüfen ist, dass berechtigtes Interesse als Rechtsgrundlage taugen kann, aber nur nach einem dreistufigen Test — und dass eine ursprünglich unrechtmäßige Datenverarbeitung die weitere Nutzung des Modells beeinträchtigen kann.[24] Parallel lief in Großbritannien die Urheberrechtskonsultation mit über 11.500 Antworten, an deren Ende die Regierung ihre bevorzugte Opt-out-Lösung fallen ließ.[14] Beides ist richtig so. Beides heißt aber: Wer heute einsteigen will, braucht neben Rechenzentren eine Rechtsabteilung. Meine Lesart, ausdrücklich als Lesart markiert: Rechtsrisiko ist ein Fixkostenblock, und Fixkosten bevorzugen die Großen. Kein Argument gegen die Regeln — eines dafür, die Nebenwirkung mitzudenken.</w:t>
+        <w:t>Bei den Daten zeigt sich dieselbe Mechanik von einer anderen Seite. Diese Modelle entstehen aus großen, teils aus dem Netz gesammelten Textmengen, und die Rechtsfragen dazu werden gerade erst geklärt. Der Europäische Datenschutzausschuss hat Ende 2024 festgehalten, dass die Anonymität eines Modells im Einzelfall zu prüfen ist, dass berechtigtes Interesse als Rechtsgrundlage taugen kann, aber nur nach einem dreistufigen Test — und dass eine ursprünglich unrechtmäßige Datenverarbeitung die weitere Nutzung des Modells beeinträchtigen kann.[24] Parallel lief in Großbritannien die Urheberrechtskonsultation mit über 11.500 Antworten, an deren Ende die Regierung ihre bevorzugte Opt-out-Lösung fallen ließ.[14] Beides ist richtig so und heißt trotzdem: Wer heute einsteigen will, braucht neben Rechenzentren eine Rechtsabteilung. Meine Lesart, als Lesart markiert: Rechtsrisiko ist ein Fixkostenblock, und Fixkosten bevorzugen die Großen. Kein Argument gegen die Regeln — eines dafür, die Nebenwirkung mitzudenken.</w:t>
       </w:r>
     </w:p>
     <w:p>
@@ -13427,16 +13391,16 @@
         <w:ind w:firstLine="283"/>
       </w:pPr>
       <w:r>
-        <w:t>An dem Wort Druckprivileg lohnt es sich hängenzubleiben. Ein Privileg ist kein Verbot. Es ist ein verliehenes Recht, etwas zu dürfen, das andere nicht dürfen — ein zugeteiltes Monopol. Verliehen hat es dieselbe Obrigkeit, die auch darüber entschied, was gedruckt werden durfte. Wirtschaftliche Erlaubnis und inhaltliche Kontrolle lagen in einer Hand, und dieser Hand musste niemand ein Argument liefern. Sie musste die Erlaubnis nur nicht erneuern. Wer den Zugang kontrolliert, kontrolliert, was gedacht werden kann, ohne je eine Debatte zu gewinnen.</w:t>
-      </w:r>
-    </w:p>
-    <w:p>
-      <w:pPr>
-        <w:pStyle w:val="Fliesstext"/>
-        <w:ind w:firstLine="283"/>
-      </w:pPr>
-      <w:r>
-        <w:t>Was daraus wurde, hat Jahrhunderte gedauert und bestand aus zwei Erfindungen, die man selten zusammen denkt. Die eine begrenzte die Macht über den Zugang: Pressefreiheit, das Ende der Vorzensur. Die andere ordnete die Erträge: das Urheberrecht. Keine davon war eine Eigenschaft der Druckerpresse, und beide mussten gegen Leute durchgesetzt werden, denen der Zustand davor gut gefiel.</w:t>
+        <w:t>An dem Wort Druckprivileg lohnt es sich hängenzubleiben. Ein Privileg ist kein Verbot, sondern ein verliehenes Recht, etwas zu dürfen, das andere nicht dürfen — ein zugeteiltes Monopol. Verliehen hat es dieselbe Obrigkeit, die auch darüber entschied, was gedruckt werden durfte. Wirtschaftliche Erlaubnis und inhaltliche Kontrolle lagen in einer Hand, und dieser Hand musste niemand ein Argument liefern. Sie musste die Erlaubnis nur nicht erneuern. Wer den Zugang kontrolliert, kontrolliert, was gedacht werden kann, ohne je eine Debatte zu gewinnen.</w:t>
+      </w:r>
+    </w:p>
+    <w:p>
+      <w:pPr>
+        <w:pStyle w:val="Fliesstext"/>
+        <w:ind w:firstLine="283"/>
+      </w:pPr>
+      <w:r>
+        <w:t>Die Antwort darauf hat Jahrhunderte gedauert und bestand aus zwei Erfindungen, die man selten zusammen denkt. Die eine begrenzte die Macht über den Zugang: Pressefreiheit, das Ende der Vorzensur. Die andere ordnete die Erträge: das Urheberrecht. Beide mussten gegen Leute durchgesetzt werden, denen der Zustand davor gut gefiel.</w:t>
       </w:r>
     </w:p>
     <w:p>
@@ -13454,7 +13418,7 @@
         <w:ind w:firstLine="283"/>
       </w:pPr>
       <w:r>
-        <w:t>Beim zweiten Hinsehen ist an dieser Geschichte aber etwas anderes entscheidend: Warum ist Edison damit nicht durchgekommen? Nicht, weil das Publikum die Kampagne durchschaut hätte. Sondern weil es einen zweiten Anbieter gab, der genug Kapital hatte, um dagegenzuhalten — Westinghouse finanzierte sogar die Berufung des zum Tode verurteilten William Kemmler, weil sein Marktanteil daran hing.[6] Und weil es öffentliche Entscheidungspunkte gab: die Weltausstellung 1893, das Kraftwerk an den Niagarafällen ab 1895. Eine Angstkampagne verliert dort, wo ein Konkurrent mit eigenen Mitteln widersprechen kann und wo öffentlich verglichen wird. Das ist meine Wertung, und sie hat eine unbequeme Kehrseite: Wo es diesen Konkurrenten nicht gibt, verliert sie nicht.</w:t>
+        <w:t>Entscheidend ist an dieser Geschichte aber etwas anderes: Warum ist Edison damit nicht durchgekommen? Nicht, weil das Publikum die Kampagne durchschaut hätte, sondern weil es einen zweiten Anbieter mit genug Kapital gab — Westinghouse finanzierte sogar die Berufung des zum Tode verurteilten William Kemmler, weil sein Marktanteil daran hing.[6] Und weil es öffentliche Entscheidungspunkte gab: die Weltausstellung 1893, das Kraftwerk an den Niagarafällen ab 1895. Eine Angstkampagne verliert dort, wo ein Konkurrent widersprechen kann und öffentlich verglichen wird. Meine Wertung, mit unbequemer Kehrseite: Wo es den Konkurrenten nicht gibt, verliert sie nicht.</w:t>
       </w:r>
     </w:p>
     <w:p>
@@ -13542,16 +13506,16 @@
         <w:ind w:firstLine="283"/>
       </w:pPr>
       <w:r>
-        <w:t>Damit löst sich der scheinbare Widerspruch auf, und die Auflösung ist der eigentliche Punkt. Exposition ist keine Bedrohungsanzeige, sie ist eine Kontaktfläche. Wer exponiert ist, kann auch profitieren — wenn er die Infrastruktur, die Netze, die Ausbildung und die Zeit dazu hat. Wer nicht exponiert ist, weil es die Jobs gar nicht erst gibt, profitiert auch nicht. Die Warnung des IWF betrifft also nicht die Exposition, sondern die Teilhabefähigkeit. Die Schere geht nicht dort auf, wo die Technik zuschlägt, sondern dort, wo sie nicht ankommt.</w:t>
-      </w:r>
-    </w:p>
-    <w:p>
-      <w:pPr>
-        <w:pStyle w:val="Fliesstext"/>
-        <w:ind w:firstLine="283"/>
-      </w:pPr>
-      <w:r>
-        <w:t>Und jetzt leg die Rechenzentrumszahlen von vorhin daneben. Diese Anlagen entstehen dort, wo Netzkapazität, Kapital und Genehmigungen zusammenkommen — nicht dort, wo der Bedarf am größten wäre. Das ist meine Schlussfolgerung aus dem, was die Energieagentur zur Standortwahl beschreibt. Wenn sie stimmt, verstärkt der Ausbau selbst genau das Gefälle, um das der IWF sich sorgt.</w:t>
+        <w:t>Damit löst sich der scheinbare Widerspruch auf, und die Auflösung ist der eigentliche Punkt. Exposition ist keine Bedrohungsanzeige, sondern eine Kontaktfläche. Wer exponiert ist, kann profitieren — wenn er Infrastruktur, Netze, Ausbildung und Zeit dazu hat. Wer nicht exponiert ist, weil es die Jobs gar nicht erst gibt, profitiert auch nicht. Die Warnung des IWF betrifft also nicht die Exposition, sondern die Teilhabefähigkeit. Die Schere geht nicht dort auf, wo die Technik zuschlägt, sondern dort, wo sie nicht ankommt.</w:t>
+      </w:r>
+    </w:p>
+    <w:p>
+      <w:pPr>
+        <w:pStyle w:val="Fliesstext"/>
+        <w:ind w:firstLine="283"/>
+      </w:pPr>
+      <w:r>
+        <w:t>Und jetzt leg die Rechenzentrumszahlen von vorhin daneben. Diese Anlagen entstehen dort, wo Netzkapazität, Kapital und Genehmigungen zusammenkommen — nicht dort, wo der Bedarf am größten wäre. Das ist meine Schlussfolgerung aus dem, was die Energieagentur zur Standortwahl beschreibt. Wenn sie stimmt, verstärkt der Ausbau genau das Gefälle, um das der IWF sich sorgt.</w:t>
       </w:r>
     </w:p>
     <w:p>
@@ -13569,7 +13533,7 @@
         <w:t>Canaries in the Coal Mine</w:t>
       </w:r>
       <w:r>
-        <w:t xml:space="preserve"> findet auf Basis von Lohndaten für über 25 Millionen Beschäftigte seit der Verbreitung generativer KI einen relativen Beschäftigungsrückgang von etwa 13 bis 16 Prozent bei den 22- bis 25-Jährigen in den am stärksten exponierten Berufen, während ältere Kohorten zulegten; der Effekt konzentriert sich auf automatisierende, nicht auf erweiternde Anwendungen.[11] Ein Land, ein Datensatz, ein kurzer Zeitraum — das habe ich im sechsten Kapitel schon dazugesagt und sage es wieder. Übersetzt heißt der Befund: Es trifft die Einstiegsstufe. Und die Einstiegsstufe ist die Stufe, auf der man lernt, was man später kann. Ich habe zwei Jahrzehnte damit verbracht, Menschen die stumpfen Aufgaben abzunehmen. Was ich dabei zu lange übersehen habe: In manchen dieser stumpfen Aufgaben steckt die Ausbildung.</w:t>
+        <w:t xml:space="preserve"> findet auf Basis von Lohndaten für über 25 Millionen Beschäftigte seit der Verbreitung generativer KI einen relativen Beschäftigungsrückgang von etwa 13 bis 16 Prozent bei den 22- bis 25-Jährigen in den am stärksten exponierten Berufen, während ältere Kohorten zulegten; der Effekt konzentriert sich auf automatisierende, nicht auf erweiternde Anwendungen.[11] Ein Land, ein Datensatz, ein kurzer Zeitraum — das habe ich im sechsten Kapitel dazugesagt und sage es wieder. Es trifft die Einstiegsstufe. Und die Einstiegsstufe ist die Stufe, auf der man lernt, was man später kann. Ich habe zwei Jahrzehnte damit verbracht, Menschen die stumpfen Aufgaben abzunehmen. Was ich zu lange übersehen habe: In manchen dieser stumpfen Aufgaben steckt die Ausbildung.</w:t>
       </w:r>
     </w:p>
     <w:p>
@@ -13675,7 +13639,7 @@
         <w:ind w:firstLine="283"/>
       </w:pPr>
       <w:r>
-        <w:t>Im Betrieb sieht dasselbe anders aus, und dort ist es teurer. Eine Vorlage entsteht mit Unterstützung eines Modells, geht durch drei Hände und landet in einer Entscheidung. Jede dieser Hände liest sie, findet sie sauber und ordentlich formuliert und geht davon aus, dass jemand anderes die Zahlen geprüft hat. Das nennt man dann Vier-Augen-Prinzip. Es sind null Augen, und der Grund ist nicht Schlamperei, sondern eine falsche Annahme über die anderen. Mit KI hat das insofern zu tun, als sie die Vorlage so gut aussehen lässt, dass der Zweifel keinen Anlass mehr findet. Früher war ein sauber gebautes Dokument ein schwacher Hinweis darauf, dass sich jemand Mühe gegeben hatte. Dieser Hinweis ist nicht schwächer geworden, er ist weg — und unsere Prüfgewohnheiten hängen noch hinterher. Das ist meine Erfahrung, keine Studienlage.</w:t>
+        <w:t>Im Betrieb sieht dasselbe anders aus, und dort ist es teurer. Eine Vorlage entsteht mit Unterstützung eines Modells, geht durch drei Hände und landet in einer Entscheidung. Jede dieser Hände liest sie, findet sie sauber formuliert und geht davon aus, dass jemand anderes die Zahlen geprüft hat. Das nennt man dann Vier-Augen-Prinzip. Es sind null Augen, und der Grund ist nicht Schlamperei, sondern eine falsche Annahme über die anderen. Früher war ein sauber gebautes Dokument ein schwacher Hinweis darauf, dass sich jemand Mühe gegeben hatte. Dieser Hinweis ist nicht schwächer geworden, er ist weg — und unsere Prüfgewohnheiten hängen hinterher. Meine Erfahrung, keine Studienlage.</w:t>
       </w:r>
     </w:p>
     <w:p>
@@ -13693,15 +13657,6 @@
         <w:ind w:firstLine="283"/>
       </w:pPr>
       <w:r>
-        <w:t>Dazu passt ein Befund, den ich in Kapitel 7 aus einer anderen Richtung gelesen habe. Anil Doshi und Oliver Hauser fanden, dass mit KI geschriebene Kurzgeschichten einzeln besser bewertet werden und einander zugleich stärker ähneln als rein menschliche.[30] Das ist nicht nur ein Kreativitätsproblem. Wenn alle mit demselben Werkzeug zur selben Mitte gezogen werden, sieht die Übereinstimmung am Ende aus wie Konsens. Sie ist nur ein gemeinsamer Ausgangspunkt.</w:t>
-      </w:r>
-    </w:p>
-    <w:p>
-      <w:pPr>
-        <w:pStyle w:val="Fliesstext"/>
-        <w:ind w:firstLine="283"/>
-      </w:pPr>
-      <w:r>
         <w:t xml:space="preserve">Und jetzt der Bogen ganz zurück an den Anfang. Der König Thamus wirft in Platons </w:t>
       </w:r>
       <w:r>
@@ -13818,16 +13773,16 @@
         <w:t>Was Unternehmen tun können,</w:t>
       </w:r>
       <w:r>
-        <w:t xml:space="preserve"> dazu rede ich aus der Praxis, weil das mein Beruf ist. Erstens: Betroffene früh einbeziehen. Nicht in einem Kommunikationstermin nach der Entscheidung, sondern in der Analyse davor. Die Leute, deren Prozess du automatisierst, wissen als Einzige, welcher Teil ihrer Arbeit das eigentliche Handwerk war — und in meiner Erfahrung ist das fast nie der Teil, den die Prozessdokumentation für den wichtigen hält. Zweitens: Verantwortlichkeiten klären, bevor das System live geht. Für jede Entscheidung, die ein Modell vorbereitet, muss ein Mensch mit Namen benennbar sein, der sie verantwortet. Und dieser Mensch braucht drei Dinge, die man ihm gern vergisst mitzugeben: die Zeit zum Prüfen, die Kompetenz zum Prüfen und das Recht, nein zu sagen, ohne dafür bestraft zu werden. Fehlt eines davon, hast du keine Kontrollinstanz, sondern einen Haftungsträger. Drittens: Prüfbarkeit und Abschaltbarkeit einbauen. Protokollieren, was das System entschieden hat und auf welcher Grundlage; und einen Weg vorsehen, es abzuschalten, ohne dass der Betrieb stillsteht. Das ist Collingridge in Ingenieurssprache — revidierbar bauen, solange man noch kann.[18]</w:t>
-      </w:r>
-    </w:p>
-    <w:p>
-      <w:pPr>
-        <w:pStyle w:val="Fliesstext"/>
-        <w:ind w:firstLine="283"/>
-      </w:pPr>
-      <w:r>
-        <w:t>Viertens, und diesen Punkt habe ich mir selbst zu spät zurechtgelegt: Frag in jedem Automatisierungsvorhaben, wer hier eigentlich noch etwas lernt. Wenn dabei die Aufgaben verschwinden, an denen bisher die Neuen ihr Handwerk gelernt haben, automatisierst du nicht nur einen Prozess, sondern deine eigene Nachwuchssicherung. Das ist keine moralische Ermahnung, das ist Personalplanung. Auf dem Arbeitsmarkt heißt dieser Effekt Kanarienvogel-Studie; im einzelnen Unternehmen sieht er aus wie eine Abteilung, in der in fünf Jahren nur noch Erfahrene sitzen, die niemand ersetzen kann.</w:t>
+        <w:t xml:space="preserve"> dazu rede ich aus der Praxis, weil das mein Beruf ist. Erstens: Betroffene früh einbeziehen. Nicht in einem Kommunikationstermin nach der Entscheidung, sondern in der Analyse davor. Die Leute, deren Prozess du automatisierst, wissen als Einzige, welcher Teil ihrer Arbeit das eigentliche Handwerk war — und in meiner Erfahrung ist das fast nie der Teil, den die Prozessdokumentation für den wichtigen hält. Zweitens: Verantwortlichkeiten klären, bevor das System live geht. Für jede Entscheidung, die ein Modell vorbereitet, muss ein Mensch mit Namen benennbar sein, der sie verantwortet — und der braucht dreierlei, das man ihm gern vergisst mitzugeben: Zeit zum Prüfen, Kompetenz zum Prüfen und das Recht, nein zu sagen, ohne dafür bestraft zu werden. Fehlt eines davon, hast du keine Kontrollinstanz, sondern einen Haftungsträger. Drittens: Prüfbarkeit und Abschaltbarkeit einbauen. Protokollieren, was das System entschieden hat und auf welcher Grundlage; und einen Weg vorsehen, es abzuschalten, ohne dass der Betrieb stillsteht. Das ist Collingridge in Ingenieurssprache — revidierbar bauen, solange man noch kann.[18]</w:t>
+      </w:r>
+    </w:p>
+    <w:p>
+      <w:pPr>
+        <w:pStyle w:val="Fliesstext"/>
+        <w:ind w:firstLine="283"/>
+      </w:pPr>
+      <w:r>
+        <w:t>Viertens, und diesen Punkt habe ich mir zu spät zurechtgelegt: Frag in jedem Automatisierungsvorhaben, wer hier eigentlich noch etwas lernt. Verschwinden dabei die Aufgaben, an denen bisher die Neuen ihr Handwerk gelernt haben, automatisierst du nicht nur einen Prozess, sondern deine eigene Nachwuchssicherung. Das ist keine moralische Ermahnung, das ist Personalplanung. Im einzelnen Unternehmen sieht der Kanarienvogel-Effekt aus wie eine Abteilung, in der in fünf Jahren nur noch Erfahrene sitzen, die niemand ersetzen kann.</w:t>
       </w:r>
     </w:p>
     <w:p>
@@ -13887,7 +13842,7 @@
         <w:ind w:firstLine="283"/>
       </w:pPr>
       <w:r>
-        <w:t>Eines fehlt in dieser Liste noch, und es entspricht meiner dritten Frage. Wer prüft eigentlich nach — nicht als Einzelner, sondern als Institution? Dafür gibt es eine erprobte Antwort. Die Vereinigten Staaten hatten von 1974 bis 1995 ein Office of Technology Assessment, das den Kongress unabhängig beriet und rund 750 Studien vorlegte, bis es Budgetkürzungen zum Opfer fiel; in Deutschland arbeitet seit 1990 das Büro für Technikfolgen-Abschätzung beim Bundestag.[31] Meine Forderung, klar als solche markiert: So etwas braucht Geld, Personal und Zugang zu den Systemen, über die es urteilen soll. Ein Parlament, das eine Technologie regulieren will, deren Wirkung es nur aus den Unterlagen der Anbieter kennt, reguliert nicht. Es unterschreibt.</w:t>
+        <w:t>Eines fehlt in dieser Liste noch, und es entspricht meiner dritten Frage. Wer prüft nach — nicht als Einzelner, sondern als Institution? Dafür gibt es eine erprobte Antwort. Die USA hatten von 1974 bis 1995 ein Office of Technology Assessment, das den Kongress unabhängig beriet und rund 750 Studien vorlegte, bis es Budgetkürzungen zum Opfer fiel; in Deutschland arbeitet seit 1990 das Büro für Technikfolgen-Abschätzung beim Bundestag.[30] Meine Forderung, klar als solche markiert: So etwas braucht Geld, Personal und Zugang zu den Systemen, über die es urteilen soll. Ein Parlament, das eine Technologie regulieren will, deren Wirkung es nur aus den Unterlagen der Anbieter kennt, reguliert nicht. Es unterschreibt.</w:t>
       </w:r>
     </w:p>
     <w:p>
@@ -15303,7 +15258,7 @@
         <w:pStyle w:val="Anmerkung"/>
       </w:pPr>
       <w:r>
-        <w:t xml:space="preserve">[7] ▲ Zur Inkunabelzeit: Gutenberg-Bibel (42 Zeilen), Mainz um 1454/55; Ausbreitung des Drucks (u. a. Köln und Subiaco 1465, Venedig 1469, Paris 1470, Krakau 1473, Westminster/Caxton 1476); Druckorte bis 1500; Zahl der verzeichneten Inkunabel-Ausgaben und Spannbreite der Auflagenschätzungen. → QUELLEN.md Nr. 200. </w:t>
+        <w:t xml:space="preserve">[7] ▲ Zur Inkunabelzeit: Gutenberg-Bibel (42 Zeilen), Mainz um 1454/55; Ausbreitung des Drucks (u. a. Köln und Subiaco 1465, Venedig 1469, Paris 1470, Krakau 1473, Westminster/Caxton 1476); Druckorte bis 1500; Zahl der verzeichneten Inkunabel-Ausgaben und Spannbreite der Auflagenschätzungen. → QUELLEN.md Nr. 119. </w:t>
       </w:r>
       <w:r>
         <w:rPr>
@@ -15326,7 +15281,7 @@
         <w:t>Schedelsche Weltchronik</w:t>
       </w:r>
       <w:r>
-        <w:t xml:space="preserve">, 1493). → QUELLEN.md Nr. 201. </w:t>
+        <w:t xml:space="preserve">, 1493). → QUELLEN.md Nr. 120. </w:t>
       </w:r>
       <w:r>
         <w:rPr>
@@ -15340,7 +15295,7 @@
         <w:pStyle w:val="Anmerkung"/>
       </w:pPr>
       <w:r>
-        <w:t xml:space="preserve">[9] ▲ Zur Biografie: Johannes Trithemius, geb. 1462 in Trittenheim, ab 1483 Abt von Sponheim, 1506 Weggang nach Würzburg (St. Jakob), gest. 1516; Ausbau der Klosterbibliothek von wenigen Dutzend auf rund zweitausend Bände. → QUELLEN.md Nr. 202. </w:t>
+        <w:t xml:space="preserve">[9] ▲ Zur Biografie: Johannes Trithemius, geb. 1462 in Trittenheim, ab 1483 Abt von Sponheim, 1506 Weggang nach Würzburg (St. Jakob), gest. 1516; Ausbau der Klosterbibliothek von wenigen Dutzend auf rund zweitausend Bände. → QUELLEN.md Nr. 121. </w:t>
       </w:r>
       <w:r>
         <w:rPr>
@@ -15363,7 +15318,7 @@
         <w:t>Liber de scriptoribus ecclesiasticis</w:t>
       </w:r>
       <w:r>
-        <w:t xml:space="preserve">, Basel 1494 — frühe gedruckte Bibliografie. → QUELLEN.md Nr. 203. </w:t>
+        <w:t xml:space="preserve">, Basel 1494 — frühe gedruckte Bibliografie. → QUELLEN.md Nr. 122. </w:t>
       </w:r>
       <w:r>
         <w:rPr>
@@ -15386,7 +15341,7 @@
         <w:t>Steganographia</w:t>
       </w:r>
       <w:r>
-        <w:t xml:space="preserve">, um 1499 verfasst, Erstdruck 1606, kurz darauf indiziert. → QUELLEN.md Nr. 204. </w:t>
+        <w:t xml:space="preserve">, um 1499 verfasst, Erstdruck 1606, kurz darauf indiziert. → QUELLEN.md Nr. 123. </w:t>
       </w:r>
       <w:r>
         <w:rPr>
@@ -15432,7 +15387,7 @@
         <w:t>Siebter Brief</w:t>
       </w:r>
       <w:r>
-        <w:t xml:space="preserve"> 341c–d — von den letzten Dingen gebe es keine Schrift. Echtheit in der Forschung umstritten; im Text ausdrücklich als umstritten gekennzeichnet. → QUELLEN.md Nr. 205.</w:t>
+        <w:t xml:space="preserve"> 341c–d — von den letzten Dingen gebe es keine Schrift. Echtheit in der Forschung umstritten; im Text ausdrücklich als umstritten gekennzeichnet. → QUELLEN.md Nr. 124.</w:t>
       </w:r>
     </w:p>
     <w:p>
@@ -15467,7 +15422,7 @@
         <w:t>Adagia</w:t>
       </w:r>
       <w:r>
-        <w:t xml:space="preserve">; aldinische Warnung vor Lyoner Nachdrucken. → QUELLEN.md Nr. 206, ergänzend Nr. 4. </w:t>
+        <w:t xml:space="preserve">; aldinische Warnung vor Lyoner Nachdrucken. → QUELLEN.md Nr. 125, ergänzend Nr. 4. </w:t>
       </w:r>
       <w:r>
         <w:rPr>
@@ -15490,7 +15445,7 @@
         <w:t>Too Much to Know. Managing Scholarly Information before the Modern Age</w:t>
       </w:r>
       <w:r>
-        <w:t>. Yale University Press, New Haven 2010. — Standardwerk zur frühneuzeitlichen Informationsfülle und ihren Hilfsmitteln (Register, Florilegien, Kompendien). → QUELLEN.md Nr. 207.</w:t>
+        <w:t>. Yale University Press, New Haven 2010. — Standardwerk zur frühneuzeitlichen Informationsfülle und ihren Hilfsmitteln (Register, Florilegien, Kompendien). → QUELLEN.md Nr. 126.</w:t>
       </w:r>
     </w:p>
     <w:p>
@@ -15507,7 +15462,7 @@
         <w:t>Bibliotheca universalis</w:t>
       </w:r>
       <w:r>
-        <w:t xml:space="preserve">, Zürich 1545 — Versuch eines Gesamtverzeichnisses der lateinischen, griechischen und hebräischen Literatur. → QUELLEN.md Nr. 208. </w:t>
+        <w:t xml:space="preserve">, Zürich 1545 — Versuch eines Gesamtverzeichnisses der lateinischen, griechischen und hebräischen Literatur. → QUELLEN.md Nr. 127. </w:t>
       </w:r>
       <w:r>
         <w:rPr>
@@ -15521,7 +15476,7 @@
         <w:pStyle w:val="Anmerkung"/>
       </w:pPr>
       <w:r>
-        <w:t xml:space="preserve">[17] ▲ Gedruckte Messkataloge der Frankfurter Buchmesse ab 1564 (Georg Willer, Augsburg). → QUELLEN.md Nr. 209. </w:t>
+        <w:t xml:space="preserve">[17] ▲ Gedruckte Messkataloge der Frankfurter Buchmesse ab 1564 (Georg Willer, Augsburg). → QUELLEN.md Nr. 128. </w:t>
       </w:r>
       <w:r>
         <w:rPr>
@@ -15553,7 +15508,7 @@
         <w:t>Philosophical Transactions of the Royal Society</w:t>
       </w:r>
       <w:r>
-        <w:t xml:space="preserve"> (London, ab 6. März 1665, hrsg. Henry Oldenburg) als erste wissenschaftliche Zeitschriften; systematische Begutachtung erst später. → QUELLEN.md Nr. 210. </w:t>
+        <w:t xml:space="preserve"> (London, ab 6. März 1665, hrsg. Henry Oldenburg) als erste wissenschaftliche Zeitschriften; systematische Begutachtung erst später. → QUELLEN.md Nr. 129. </w:t>
       </w:r>
       <w:r>
         <w:rPr>
@@ -15585,7 +15540,7 @@
         <w:t>The Nature of the Book. Print and Knowledge in the Making</w:t>
       </w:r>
       <w:r>
-        <w:t>. University of Chicago Press 1998. — Forschungsstreit über „fixity"/Standardisierung als Eigenschaft des Drucks; im Text als Streit kenntlich gemacht. → QUELLEN.md Nr. 211.</w:t>
+        <w:t>. University of Chicago Press 1998. — Forschungsstreit über „fixity"/Standardisierung als Eigenschaft des Drucks; im Text als Streit kenntlich gemacht. → QUELLEN.md Nr. 130.</w:t>
       </w:r>
     </w:p>
     <w:p>
@@ -15602,7 +15557,7 @@
         <w:t>Brand Luther</w:t>
       </w:r>
       <w:r>
-        <w:t xml:space="preserve">. Penguin, New York 2015. — Wittenberg als Druckort, Luthers Nutzung der Flugschrift, Anteil seiner Schriften an der deutschen Druckproduktion nach 1518, Septembertestament 1522 und Nachdruck im Dezember. → QUELLEN.md Nr. 212. </w:t>
+        <w:t xml:space="preserve">. Penguin, New York 2015. — Wittenberg als Druckort, Luthers Nutzung der Flugschrift, Anteil seiner Schriften an der deutschen Druckproduktion nach 1518, Septembertestament 1522 und Nachdruck im Dezember. → QUELLEN.md Nr. 131. </w:t>
       </w:r>
       <w:r>
         <w:rPr>
@@ -15634,7 +15589,7 @@
         <w:t>De humani corporis fabrica</w:t>
       </w:r>
       <w:r>
-        <w:t xml:space="preserve">, Basel 1543. → QUELLEN.md Nr. 213. </w:t>
+        <w:t xml:space="preserve">, Basel 1543. → QUELLEN.md Nr. 132. </w:t>
       </w:r>
       <w:r>
         <w:rPr>
@@ -15666,7 +15621,7 @@
         <w:t>Summis desiderantes affectibus</w:t>
       </w:r>
       <w:r>
-        <w:t xml:space="preserve"> (1484); umstrittene Approbation der Kölner theologischen Fakultät; Kramers Scheitern in Innsbruck 1485; Auflagengeschichte in zwei Wellen. → QUELLEN.md Nr. 214. </w:t>
+        <w:t xml:space="preserve"> (1484); umstrittene Approbation der Kölner theologischen Fakultät; Kramers Scheitern in Innsbruck 1485; Auflagengeschichte in zwei Wellen. → QUELLEN.md Nr. 133. </w:t>
       </w:r>
       <w:r>
         <w:rPr>
@@ -15680,7 +15635,7 @@
         <w:pStyle w:val="Anmerkung"/>
       </w:pPr>
       <w:r>
-        <w:t xml:space="preserve">[23] ▲ Zur Chronologie und Größenordnung der europäischen Hexenverfolgung: Höhepunkt etwa 1560–1630; Schätzungen der Hinrichtungszahlen meist zwischen 40.000 und 60.000. → QUELLEN.md Nr. 215. </w:t>
+        <w:t xml:space="preserve">[23] ▲ Zur Chronologie und Größenordnung der europäischen Hexenverfolgung: Höhepunkt etwa 1560–1630; Schätzungen der Hinrichtungszahlen meist zwischen 40.000 und 60.000. → QUELLEN.md Nr. 134. </w:t>
       </w:r>
       <w:r>
         <w:rPr>
@@ -15712,7 +15667,7 @@
         <w:t>Cautio Criminalis</w:t>
       </w:r>
       <w:r>
-        <w:t xml:space="preserve">, Rinteln 1631 (anonym erschienen). — Gedruckte Gegenschriften zur Hexenverfolgung. → QUELLEN.md Nr. 216. </w:t>
+        <w:t xml:space="preserve">, Rinteln 1631 (anonym erschienen). — Gedruckte Gegenschriften zur Hexenverfolgung. → QUELLEN.md Nr. 135. </w:t>
       </w:r>
       <w:r>
         <w:rPr>
@@ -15753,7 +15708,7 @@
         <w:t>Areopagitica</w:t>
       </w:r>
       <w:r>
-        <w:t xml:space="preserve">, London 1644, ohne Lizenz gedruckt. → QUELLEN.md Nr. 217. </w:t>
+        <w:t xml:space="preserve">, London 1644, ohne Lizenz gedruckt. → QUELLEN.md Nr. 136. </w:t>
       </w:r>
       <w:r>
         <w:rPr>
@@ -15776,7 +15731,7 @@
         <w:t>Statute of Anne</w:t>
       </w:r>
       <w:r>
-        <w:t xml:space="preserve"> 1710 als erstes modernes Urheberrechtsgesetz. → QUELLEN.md Nr. 218. </w:t>
+        <w:t xml:space="preserve"> 1710 als erstes modernes Urheberrechtsgesetz. → QUELLEN.md Nr. 137. </w:t>
       </w:r>
       <w:r>
         <w:rPr>
@@ -16001,7 +15956,7 @@
         <w:pStyle w:val="Anmerkung"/>
       </w:pPr>
       <w:r>
-        <w:t xml:space="preserve">[10] ▲ Harriet Davis (USA, 1890): Bitte um Polizeischutz, weil Strom aus leeren Lampenfassungen „auslaufe" und sie vergifte. → QUELLEN.md Nr. 120. </w:t>
+        <w:t xml:space="preserve">[10] ▲ Harriet Davis (USA, 1890): Bitte um Polizeischutz, weil Strom aus leeren Lampenfassungen „auslaufe" und sie vergifte. → QUELLEN.md Nr. 138. </w:t>
       </w:r>
       <w:r>
         <w:rPr>
@@ -16015,7 +15970,7 @@
         <w:pStyle w:val="Anmerkung"/>
       </w:pPr>
       <w:r>
-        <w:t xml:space="preserve">[11] ▲ Zeitgenössische Debatte über die Augenschädlichkeit des elektrischen Lichts (Blendung, Flimmern, Anpassung der Pupille bei Bogen- und Glühlicht), kontrovers geführt in medizinischen Periodika der Zeit. → QUELLEN.md Nr. 121. </w:t>
+        <w:t xml:space="preserve">[11] ▲ Zeitgenössische Debatte über die Augenschädlichkeit des elektrischen Lichts (Blendung, Flimmern, Anpassung der Pupille bei Bogen- und Glühlicht), kontrovers geführt in medizinischen Periodika der Zeit. → QUELLEN.md Nr. 139. </w:t>
       </w:r>
       <w:r>
         <w:rPr>
@@ -16038,7 +15993,7 @@
         <w:t>Legende von der Eisenbahnkrankheit</w:t>
       </w:r>
       <w:r>
-        <w:t xml:space="preserve"> (Archiv 2007). — Legendenstatus der Bahnwarnung und ihre Verwendung als Analogie in späteren Technikdebatten, namentlich der deutschen Mobilfunkdiskussion. → QUELLEN.md Nr. 122. </w:t>
+        <w:t xml:space="preserve"> (Archiv 2007). — Legendenstatus der Bahnwarnung und ihre Verwendung als Analogie in späteren Technikdebatten, namentlich der deutschen Mobilfunkdiskussion. → QUELLEN.md Nr. 140. </w:t>
       </w:r>
       <w:r>
         <w:rPr>
@@ -16516,7 +16471,7 @@
         <w:pStyle w:val="Anmerkung"/>
       </w:pPr>
       <w:r>
-        <w:t>[18] ▲ Telefonistinnen („Hello Girls") als einer der ersten großen weiblichen Angestelltenberufe; spätere Auseinandersetzungen um Arbeitsrechte von Frauen am Arbeitsplatz. → QUELLEN.md Nr. 121. *</w:t>
+        <w:t>[18] ▲ Telefonistinnen („Hello Girls") als einer der ersten großen weiblichen Angestelltenberufe; spätere Auseinandersetzungen um Arbeitsrechte von Frauen am Arbeitsplatz. → QUELLEN.md Nr. 143. *</w:t>
       </w:r>
       <w:r>
         <w:rPr>
@@ -16553,7 +16508,7 @@
         <w:t>Wired Fears: Electricity and Technophobia in the Nineteenth Century</w:t>
       </w:r>
       <w:r>
-        <w:t xml:space="preserve"> (2024). → QUELLEN.md Nr. 119. </w:t>
+        <w:t xml:space="preserve"> (2024). → QUELLEN.md Nr. 141. </w:t>
       </w:r>
       <w:r>
         <w:rPr>
@@ -16576,7 +16531,7 @@
         <w:t>Telephone History — Social Reaction</w:t>
       </w:r>
       <w:r>
-        <w:t xml:space="preserve">. → QUELLEN.md Nr. 120. </w:t>
+        <w:t xml:space="preserve">. → QUELLEN.md Nr. 142. </w:t>
       </w:r>
       <w:r>
         <w:rPr>
@@ -17025,7 +16980,7 @@
         <w:t>A History of Panic Over Entertainment Technology</w:t>
       </w:r>
       <w:r>
-        <w:t xml:space="preserve">. — Überblicksbeleg für den wiederkehrenden Bogen von Telefon, Radio, Kino, Comics und Fernsehen bis zu Videospielen und die anschließende Normalisierung; hier als Stützbeleg für den wiederkehrenden Fokus auf Kinder und Jugendliche. → QUELLEN.md Nr. 119. ▲ </w:t>
+        <w:t xml:space="preserve">. — Überblicksbeleg für den wiederkehrenden Bogen von Telefon, Radio, Kino, Comics und Fernsehen bis zu Videospielen und die anschließende Normalisierung; hier als Stützbeleg für den wiederkehrenden Fokus auf Kinder und Jugendliche. → QUELLEN.md Nr. 150. ▲ </w:t>
       </w:r>
       <w:r>
         <w:rPr>
@@ -17100,7 +17055,7 @@
         <w:t>Die Klassenzimmer-Szene ist im Text als Rekonstruktion aus dokumentierten Argumenten gekennzeichnet, nicht als überliefertes Ereignis.</w:t>
       </w:r>
       <w:r>
-        <w:t xml:space="preserve"> → QUELLEN.md Nr. 119.</w:t>
+        <w:t xml:space="preserve"> → QUELLEN.md Nr. 151.</w:t>
       </w:r>
     </w:p>
     <w:p>
@@ -17221,7 +17176,7 @@
         <w:t>Zeitgeschichte der Informationsgesellschaft.</w:t>
       </w:r>
       <w:r>
-        <w:t xml:space="preserve"> — Medien als „Verstärker" der Computerängste; „Automation" löste „Sorgen, Ängste, ja Furcht" aus; „wegrationalisiert" als Schlagwort des Jahrzehnts. → QUELLEN.md Nr. 120.</w:t>
+        <w:t xml:space="preserve"> — Medien als „Verstärker" der Computerängste; „Automation" löste „Sorgen, Ängste, ja Furcht" aus; „wegrationalisiert" als Schlagwort des Jahrzehnts. → QUELLEN.md Nr. 152.</w:t>
       </w:r>
     </w:p>
     <w:p>
@@ -17378,7 +17333,7 @@
         <w:t>Future Shock.</w:t>
       </w:r>
       <w:r>
-        <w:t xml:space="preserve"> 1970. — Popularisierung des Begriffs „information overload", ein Vierteljahrhundert vor der Internet-Debatte. → QUELLEN.md Nr. 121.</w:t>
+        <w:t xml:space="preserve"> 1970. — Popularisierung des Begriffs „information overload", ein Vierteljahrhundert vor der Internet-Debatte. → QUELLEN.md Nr. 153.</w:t>
       </w:r>
     </w:p>
     <w:p>
@@ -17586,7 +17541,7 @@
         <w:t>Macquarie Dictionary</w:t>
       </w:r>
       <w:r>
-        <w:t>; Zusammenhang mit geringerer Beziehungs- und Lebenszufriedenheit bis zu depressiven Symptomen; Effektstärken und Kausalitätsrichtung offen (im Text so gekennzeichnet). → QUELLEN.md Nr. 122.</w:t>
+        <w:t>; Zusammenhang mit geringerer Beziehungs- und Lebenszufriedenheit bis zu depressiven Symptomen; Effektstärken und Kausalitätsrichtung offen (im Text so gekennzeichnet). → QUELLEN.md Nr. 154.</w:t>
       </w:r>
     </w:p>
     <w:p>
@@ -18409,7 +18364,7 @@
         <w:t>The 2 Sigma Problem: The Search for Methods of Group Instruction as Effective as One-to-One Tutoring</w:t>
       </w:r>
       <w:r>
-        <w:t xml:space="preserve">, Educational Researcher 13(6):4–16, 1984. — Einzelunterricht hebt Lernergebnisse um rund zwei Standardabweichungen gegenüber konventionellem Klassenunterricht; Ausgangspunkt der Skalierungsdebatte, an die die KI-Tutoring-Studien anschließen. Die im Text vorgenommene Umrechnung „zwei Standardabweichungen ≈ oberhalb von rund 98 Prozent der Vergleichsgruppe" ist die rechnerische Bedeutung des Maßes bei Normalverteilung, kein zusätzlicher Studienbefund. → QUELLEN.md Nr. 123. </w:t>
+        <w:t xml:space="preserve">, Educational Researcher 13(6):4–16, 1984. — Einzelunterricht hebt Lernergebnisse um rund zwei Standardabweichungen gegenüber konventionellem Klassenunterricht; Ausgangspunkt der Skalierungsdebatte, an die die KI-Tutoring-Studien anschließen. Die im Text vorgenommene Umrechnung „zwei Standardabweichungen ≈ oberhalb von rund 98 Prozent der Vergleichsgruppe" ist die rechnerische Bedeutung des Maßes bei Normalverteilung, kein zusätzlicher Studienbefund. → QUELLEN.md Nr. 155. </w:t>
       </w:r>
       <w:r>
         <w:rPr>
@@ -18423,7 +18378,7 @@
         <w:pStyle w:val="Anmerkung"/>
       </w:pPr>
       <w:r>
-        <w:t xml:space="preserve">[13] ▲ Verwertungsgesellschaften in Deutschland (VG Wort, GEMA) als bestehende Modelle kollektiver Lizenzierung und Ausschüttung; im Text nur als Analogie zum von der Authors Guild diskutierten kollektiven Lizenzmodell verwendet, ohne Aussage über die Übertragbarkeit auf KI-Trainingsdaten. → QUELLEN.md Nr. 124. </w:t>
+        <w:t xml:space="preserve">[13] ▲ Verwertungsgesellschaften in Deutschland (VG Wort, GEMA) als bestehende Modelle kollektiver Lizenzierung und Ausschüttung; im Text nur als Analogie zum von der Authors Guild diskutierten kollektiven Lizenzmodell verwendet, ohne Aussage über die Übertragbarkeit auf KI-Trainingsdaten. → QUELLEN.md Nr. 156. </w:t>
       </w:r>
       <w:r>
         <w:rPr>
@@ -18471,7 +18426,7 @@
         <w:pStyle w:val="Anmerkung"/>
       </w:pPr>
       <w:r>
-        <w:t xml:space="preserve">[2] ▲ Northpointe (heute equivant): Gegendarstellung zur ProPublica-Analyse — Kalibrierung bzw. predictive parity als Fairness-Maßstab; die ungleichen Falsch-Positiv-Raten seien rechnerische Folge ungleicher Basisraten. Hier referiert über das Recherchedossier b2 und die Unmöglichkeits-Literatur (Nr. 80). → QUELLEN.md Nr. 120. </w:t>
+        <w:t xml:space="preserve">[2] ▲ Northpointe (heute equivant): Gegendarstellung zur ProPublica-Analyse — Kalibrierung bzw. predictive parity als Fairness-Maßstab; die ungleichen Falsch-Positiv-Raten seien rechnerische Folge ungleicher Basisraten. Hier referiert über das Recherchedossier b2 und die Unmöglichkeits-Literatur (Nr. 80). → QUELLEN.md Nr. 158. </w:t>
       </w:r>
       <w:r>
         <w:rPr>
@@ -18514,7 +18469,7 @@
         <w:pStyle w:val="Anmerkung"/>
       </w:pPr>
       <w:r>
-        <w:t xml:space="preserve">[4] ▲ Rechenbeispiel „Gruppe A / Gruppe B": vom Autor konstruiert, keine Realdaten. Dient ausschließlich der Veranschaulichung von Beleg [3]; im Text ausdrücklich als erfunden gekennzeichnet. → QUELLEN.md Nr. 119. </w:t>
+        <w:t xml:space="preserve">[4] ▲ Rechenbeispiel „Gruppe A / Gruppe B": vom Autor konstruiert, keine Realdaten. Dient ausschließlich der Veranschaulichung von Beleg [3]; im Text ausdrücklich als erfunden gekennzeichnet. → QUELLEN.md Nr. 157. </w:t>
       </w:r>
       <w:r>
         <w:rPr>
@@ -18852,10 +18807,33 @@
     </w:p>
     <w:p>
       <w:pPr>
+        <w:pStyle w:val="Zwischen"/>
+      </w:pPr>
+      <w:r>
+        <w:t>Kapitel 9 — Die Stimmen der Propheten</w:t>
+      </w:r>
+    </w:p>
+    <w:p>
+      <w:pPr>
         <w:pStyle w:val="Anmerkung"/>
       </w:pPr>
       <w:r>
-        <w:t>---</w:t>
+        <w:t xml:space="preserve">[1] Demis Hassabis &amp; John Jumper: Nobelpreis für Chemie 2024 (gemeinsam mit David Baker für Proteindesign); AlphaFold2 (2020), ca. 200 Mio. vorhergesagte Proteinstrukturen; AlphaFold-Datenbank von über 2 Mio. Forschenden in 190 Ländern genutzt; von DeepMind angeführte Anwendungsbeispiele (u. a. Enzyme zum Kunststoffabbau, vernachlässigte Tropenkrankheiten, Malariaforschung). NobelPrize.org; Google DeepMind. → QUELLEN.md Nr. 92. </w:t>
+      </w:r>
+      <w:r>
+        <w:rPr>
+          <w:b/>
+        </w:rPr>
+        <w:t>[belegt]</w:t>
+      </w:r>
+      <w:r>
+        <w:t xml:space="preserve"> — </w:t>
+      </w:r>
+      <w:r>
+        <w:rPr>
+          <w:i/>
+        </w:rPr>
+        <w:t>Die Anwendungsbeispiele sind im Text ausdrücklich als Angaben von DeepMind gekennzeichnet.</w:t>
       </w:r>
     </w:p>
     <w:p>
@@ -18863,13 +18841,22 @@
         <w:pStyle w:val="Anmerkung"/>
       </w:pPr>
       <w:r>
+        <w:t xml:space="preserve">[2] ▲ Demis Hassabis zu einem „skalierbaren Prozess" gegen praktisch alle Krankheiten in 10–20 Jahren; Isomorphic Labs (DeepMind-Spin-off 2021, Milliardenfinanzierung, Ziel 1–2 Jahre Entdeckungsphase). Interviews/Berichterstattung 2025–26 (u. a. Fortune, The AI Insider). → QUELLEN.md Nr. 91. </w:t>
+      </w:r>
+      <w:r>
         <w:rPr>
           <w:b/>
         </w:rPr>
-        <w:t>Redaktionsnotiz (nicht Teil des Buchtexts):</w:t>
-      </w:r>
-      <w:r>
-        <w:t xml:space="preserve"> Die im Kapitel referenzierten „Prüffragen aus dem fünften Kapitel" sind hier in der Fassung wiedergegeben — (1) dokumentiert oder ausgemalt, (2) wer trägt den Schaden und wann, (3) Herkunft der Zahl, (4) Bilanz aus Verlust und Gewinn, ergänzt um die Einhegungsfrage. Kapitel 5 ist noch nicht geschrieben; die Formulierung dort ist mit dieser Stelle zu harmonisieren.</w:t>
+        <w:t>[Prognose]</w:t>
+      </w:r>
+      <w:r>
+        <w:t xml:space="preserve"> — </w:t>
+      </w:r>
+      <w:r>
+        <w:rPr>
+          <w:i/>
+        </w:rPr>
+        <w:t>Wortlaut und Finanzierungszahl vor Drucklegung an der Primärquelle prüfen; die Einschränkung „skalierbarer Prozess, nicht Endsieg über jede Krankheit" ist im Text mitgeführt. Die Aufzählung der nachgelagerten Entwicklungsphasen ist allgemeines Fachwissen der Arzneimittelentwicklung, keine Aussage von Hassabis.</w:t>
       </w:r>
     </w:p>
     <w:p>
@@ -18877,13 +18864,733 @@
         <w:pStyle w:val="Anmerkung"/>
       </w:pPr>
       <w:r>
+        <w:t xml:space="preserve">[3] Reid Hoffman &amp; Greg Beato: </w:t>
+      </w:r>
+      <w:r>
+        <w:rPr>
+          <w:i/>
+        </w:rPr>
+        <w:t>Superagency: What Could Possibly Go Right with Our AI Future</w:t>
+      </w:r>
+      <w:r>
+        <w:t xml:space="preserve">. Simon &amp; Schuster, 2025; „smart risk taking" als Selbstbeschreibung; kritische Rezeption u. a. Kirkus Reviews („poor arguments and little critical analysis"). → QUELLEN.md Nr. 93. </w:t>
+      </w:r>
+      <w:r>
         <w:rPr>
           <w:b/>
         </w:rPr>
-        <w:t>Redaktionsnotiz 2 (nicht Teil des Buchtexts):</w:t>
-      </w:r>
-      <w:r>
-        <w:t xml:space="preserve"> Kontrollwerte zum konstruierten Rechenbeispiel, vor Drucklegung von einer zweiten Person nachzurechnen. Gruppe A (1.000 Personen, 300 rückfällig): hochriskant 280 / davon 210 rückfällig; Kalibrierung 75 %, FPR 70/700 = 10 %, FNR 90/300 = 30 %. Gruppe B (1.000 Personen, 600 rückfällig), Variante Kalibrierung: hochriskant 640 / davon 480 rückfällig; Kalibrierung 75 %, FPR 160/400 = 40 %, FNR 120/600 = 20 %. Gruppe B, Variante Fehlerratenausgleich: hochriskant 400 / davon 360 rückfällig; Kalibrierung 90 %, FPR 40/400 = 10 %, FNR 240/600 = 40 %.</w:t>
+        <w:t>[Meinung]</w:t>
+      </w:r>
+      <w:r>
+        <w:t xml:space="preserve"> — </w:t>
+      </w:r>
+      <w:r>
+        <w:rPr>
+          <w:i/>
+        </w:rPr>
+        <w:t>Die Bemerkung zur prinzipiellen Prüfbarkeit der These ist im Text als Einschätzung des Autors gekennzeichnet.</w:t>
+      </w:r>
+    </w:p>
+    <w:p>
+      <w:pPr>
+        <w:pStyle w:val="Anmerkung"/>
+      </w:pPr>
+      <w:r>
+        <w:t xml:space="preserve">[4] ▲ Andrew Ng: „AI is the new electricity" (seit ca. 2016); Position gegen die Existenzrisiko-Furcht, reale Existenzrisiken Pandemien/Klimawandel/Asteroiden (Äußerungen 2023). → QUELLEN.md Nr. 94. </w:t>
+      </w:r>
+      <w:r>
+        <w:rPr>
+          <w:b/>
+        </w:rPr>
+        <w:t>[Meinung]</w:t>
+      </w:r>
+      <w:r>
+        <w:t xml:space="preserve"> — </w:t>
+      </w:r>
+      <w:r>
+        <w:rPr>
+          <w:i/>
+        </w:rPr>
+        <w:t>Im Text bewusst paraphrasiert; das kursierende wörtliche Zitat liegt nur über Sekundärberichterstattung vor und wurde deshalb nicht als Zitat gesetzt.</w:t>
+      </w:r>
+    </w:p>
+    <w:p>
+      <w:pPr>
+        <w:pStyle w:val="Anmerkung"/>
+      </w:pPr>
+      <w:r>
+        <w:t xml:space="preserve">[5] Marc Andreessen: </w:t>
+      </w:r>
+      <w:r>
+        <w:rPr>
+          <w:i/>
+        </w:rPr>
+        <w:t>Why AI Will Save the World</w:t>
+      </w:r>
+      <w:r>
+        <w:t xml:space="preserve">. a16z, Juni 2023. — Einordnung der Existenzangst als „moral panic"; KI-Mentor für jedes Kind; Plädoyer für offene Märkte statt Regulierung. → QUELLEN.md Nr. 95. </w:t>
+      </w:r>
+      <w:r>
+        <w:rPr>
+          <w:b/>
+        </w:rPr>
+        <w:t>[Meinung]</w:t>
+      </w:r>
+    </w:p>
+    <w:p>
+      <w:pPr>
+        <w:pStyle w:val="Anmerkung"/>
+      </w:pPr>
+      <w:r>
+        <w:t xml:space="preserve">[6] ▲ Geoffrey Hinton: Austritt bei Google (Mai 2023) mit der Begründung, frei über die Gefahren sprechen zu können; Dezember 2024 Einschätzung „10–20 %" Auslöschungsrisiko binnen ca. 30 Jahren. Washington Post (2.5.2023), CNN, MIT Technology Review. → QUELLEN.md Nr. 98. </w:t>
+      </w:r>
+      <w:r>
+        <w:rPr>
+          <w:b/>
+        </w:rPr>
+        <w:t>[Meinung / Risikoeinschätzung]</w:t>
+      </w:r>
+      <w:r>
+        <w:t xml:space="preserve"> — </w:t>
+      </w:r>
+      <w:r>
+        <w:rPr>
+          <w:i/>
+        </w:rPr>
+        <w:t>Austrittsbegründung im Text paraphrasiert, nicht als Wortzitat; vor Drucklegung am Originalinterview verifizieren.</w:t>
+      </w:r>
+    </w:p>
+    <w:p>
+      <w:pPr>
+        <w:pStyle w:val="Anmerkung"/>
+      </w:pPr>
+      <w:r>
+        <w:t xml:space="preserve">[7] Geoffrey Hinton &amp; John Hopfield: Nobelpreis für Physik 2024. NobelPrize.org. → QUELLEN.md Nr. 99. </w:t>
+      </w:r>
+      <w:r>
+        <w:rPr>
+          <w:b/>
+        </w:rPr>
+        <w:t>[belegt]</w:t>
+      </w:r>
+    </w:p>
+    <w:p>
+      <w:pPr>
+        <w:pStyle w:val="Anmerkung"/>
+      </w:pPr>
+      <w:r>
+        <w:t xml:space="preserve">[8] Center for AI Safety: </w:t>
+      </w:r>
+      <w:r>
+        <w:rPr>
+          <w:i/>
+        </w:rPr>
+        <w:t>Statement on AI Risk</w:t>
+      </w:r>
+      <w:r>
+        <w:t xml:space="preserve">, 30. Mai 2023 (Ein-Satz-Statement); Unterzeichner u. a. Hinton, Bengio, Altman, Hassabis, Amodei, Gates. safe.ai. → QUELLEN.md Nr. 100. </w:t>
+      </w:r>
+      <w:r>
+        <w:rPr>
+          <w:b/>
+        </w:rPr>
+        <w:t>[belegt]</w:t>
+      </w:r>
+      <w:r>
+        <w:t xml:space="preserve"> — </w:t>
+      </w:r>
+      <w:r>
+        <w:rPr>
+          <w:i/>
+        </w:rPr>
+        <w:t>Der Statement-Satz ist im Text sinngemäß auf Deutsch wiedergegeben; englischer Originalwortlaut für die Druckfassung vorhalten. Die Deutung des Ein-Satz-Formats (niedrige Unterschriftskosten, geringe Handlungsfolge) ist im Text als Überlegung des Autors gehalten.</w:t>
+      </w:r>
+    </w:p>
+    <w:p>
+      <w:pPr>
+        <w:pStyle w:val="Anmerkung"/>
+      </w:pPr>
+      <w:r>
+        <w:t xml:space="preserve">[9] </w:t>
+      </w:r>
+      <w:r>
+        <w:rPr>
+          <w:i/>
+        </w:rPr>
+        <w:t>International AI Safety Report</w:t>
+      </w:r>
+      <w:r>
+        <w:t xml:space="preserve">, Vorsitz Yoshua Bengio, 29. Januar 2025; ca. 100 Fachleute, Beirat aus 30 Ländern sowie UN/EU/OECD; ausdrücklich ohne Politikempfehlungen. → QUELLEN.md Nr. 101 (= Nr. 73). </w:t>
+      </w:r>
+      <w:r>
+        <w:rPr>
+          <w:b/>
+        </w:rPr>
+        <w:t>[belegt]</w:t>
+      </w:r>
+    </w:p>
+    <w:p>
+      <w:pPr>
+        <w:pStyle w:val="Anmerkung"/>
+      </w:pPr>
+      <w:r>
+        <w:t xml:space="preserve">[10] Stuart Russell: </w:t>
+      </w:r>
+      <w:r>
+        <w:rPr>
+          <w:i/>
+        </w:rPr>
+        <w:t>Human Compatible: Artificial Intelligence and the Problem of Control</w:t>
+      </w:r>
+      <w:r>
+        <w:t xml:space="preserve">. Viking/Penguin, 2019. → QUELLEN.md Nr. 102. </w:t>
+      </w:r>
+      <w:r>
+        <w:rPr>
+          <w:b/>
+        </w:rPr>
+        <w:t>[Meinung / Forschungsprogramm]</w:t>
+      </w:r>
+    </w:p>
+    <w:p>
+      <w:pPr>
+        <w:pStyle w:val="Anmerkung"/>
+      </w:pPr>
+      <w:r>
+        <w:t xml:space="preserve">[11] ▲ Yann LeCun (Turing-Preisträger 2018, langjähriger Chief AI Scientist bei Meta): LLMs seien kein Weg zu menschenähnlicher Intelligenz; World-Model-Ansatz; eigene Gründung. Interviews/Vorträge 2023–2025. → QUELLEN.md Nr. 107. </w:t>
+      </w:r>
+      <w:r>
+        <w:rPr>
+          <w:b/>
+        </w:rPr>
+        <w:t>[Meinung / Forschungsthese]</w:t>
+      </w:r>
+      <w:r>
+        <w:t xml:space="preserve"> — </w:t>
+      </w:r>
+      <w:r>
+        <w:rPr>
+          <w:i/>
+        </w:rPr>
+        <w:t>Position im Text paraphrasiert; konkretes Zitat vor Drucklegung an einem Originalinterview verankern.</w:t>
+      </w:r>
+    </w:p>
+    <w:p>
+      <w:pPr>
+        <w:pStyle w:val="Anmerkung"/>
+      </w:pPr>
+      <w:r>
+        <w:t xml:space="preserve">[12] Gary Marcus: </w:t>
+      </w:r>
+      <w:r>
+        <w:rPr>
+          <w:i/>
+        </w:rPr>
+        <w:t>Deep Learning Is Hitting a Wall</w:t>
+      </w:r>
+      <w:r>
+        <w:t xml:space="preserve">. Nautilus, März 2022; Fortschreibung im Substack „Marcus on AI" (2024, „diminishing returns"). → QUELLEN.md Nr. 103. </w:t>
+      </w:r>
+      <w:r>
+        <w:rPr>
+          <w:b/>
+        </w:rPr>
+        <w:t>[Meinung / teils empirisch gestützt]</w:t>
+      </w:r>
+      <w:r>
+        <w:t xml:space="preserve"> — </w:t>
+      </w:r>
+      <w:r>
+        <w:rPr>
+          <w:i/>
+        </w:rPr>
+        <w:t>Der im Text angeschlossene Einwand (mehrfach fortgeschriebene These bei weiterhin steigender Leistungsfähigkeit) ist Wertung des Autors.</w:t>
+      </w:r>
+    </w:p>
+    <w:p>
+      <w:pPr>
+        <w:pStyle w:val="Anmerkung"/>
+      </w:pPr>
+      <w:r>
+        <w:t xml:space="preserve">[13] Emily M. Bender, Timnit Gebru, Angelina McMillan-Major, Margaret Mitchell (als „Shmargaret Shmitchell"): </w:t>
+      </w:r>
+      <w:r>
+        <w:rPr>
+          <w:i/>
+        </w:rPr>
+        <w:t>On the Dangers of Stochastic Parrots: Can Language Models Be Too Big?</w:t>
+      </w:r>
+      <w:r>
+        <w:t xml:space="preserve"> FAccT '21, ACM, März 2021, DOI 10.1145/3442188.3445922. → QUELLEN.md Nr. 104. </w:t>
+      </w:r>
+      <w:r>
+        <w:rPr>
+          <w:b/>
+        </w:rPr>
+        <w:t>[belegt]</w:t>
+      </w:r>
+      <w:r>
+        <w:t xml:space="preserve"> — </w:t>
+      </w:r>
+      <w:r>
+        <w:rPr>
+          <w:i/>
+        </w:rPr>
+        <w:t>Im Text sind nur die im Paper dokumentierten Risiken zugeschrieben; das Argument „Weltuntergangsdebatte lenkt von Gegenwartsschäden ab" ist ausdrücklich als strukturelles Argument bzw. Einschätzung des Autors gekennzeichnet und keiner Person als Zitat unterstellt.</w:t>
+      </w:r>
+    </w:p>
+    <w:p>
+      <w:pPr>
+        <w:pStyle w:val="Anmerkung"/>
+      </w:pPr>
+      <w:r>
+        <w:t xml:space="preserve">[14] Timnit Gebru: Abgang bei Google im Dezember 2020 im Streit um das Stochastic-Parrots-Paper; Margaret Mitchell rund zwei Monate später entlassen. MIT Technology Review (4.12.2020). → QUELLEN.md Nr. 105. </w:t>
+      </w:r>
+      <w:r>
+        <w:rPr>
+          <w:b/>
+        </w:rPr>
+        <w:t>[belegt]</w:t>
+      </w:r>
+    </w:p>
+    <w:p>
+      <w:pPr>
+        <w:pStyle w:val="Anmerkung"/>
+      </w:pPr>
+      <w:r>
+        <w:t xml:space="preserve">[15] Joy Buolamwini &amp; Timnit Gebru: </w:t>
+      </w:r>
+      <w:r>
+        <w:rPr>
+          <w:i/>
+        </w:rPr>
+        <w:t>Gender Shades</w:t>
+      </w:r>
+      <w:r>
+        <w:t xml:space="preserve">. PMLR / MIT Media Lab, 2018 — Fehlerraten bis 34,7 % gegenüber 0,8 % je nach Gruppe. Call-back auf Kapitel 8. → QUELLEN.md Nr. 79. </w:t>
+      </w:r>
+      <w:r>
+        <w:rPr>
+          <w:b/>
+        </w:rPr>
+        <w:t>[belegt]</w:t>
+      </w:r>
+    </w:p>
+    <w:p>
+      <w:pPr>
+        <w:pStyle w:val="Anmerkung"/>
+      </w:pPr>
+      <w:r>
+        <w:t xml:space="preserve">[16] Daniel Kokotajlo, Eli Lifland, Thomas Larsen, Romeo Dean (Red. Scott Alexander): </w:t>
+      </w:r>
+      <w:r>
+        <w:rPr>
+          <w:i/>
+        </w:rPr>
+        <w:t>AI 2027</w:t>
+      </w:r>
+      <w:r>
+        <w:t xml:space="preserve">. April 2025, ai-2027.com; von den Autoren ausdrücklich als hypothetisches Planungswerkzeug deklariert; Szenario mit zwei alternativen Ausgängen; spätere Verschiebung der AGI-Mediane (Kokotajlo ca. 2030; Lifland um ca. 3 Jahre). → QUELLEN.md Nr. 106. </w:t>
+      </w:r>
+      <w:r>
+        <w:rPr>
+          <w:b/>
+        </w:rPr>
+        <w:t>[Prognose / Szenario]</w:t>
+      </w:r>
+      <w:r>
+        <w:t xml:space="preserve"> — </w:t>
+      </w:r>
+      <w:r>
+        <w:rPr>
+          <w:i/>
+        </w:rPr>
+        <w:t>▲ Die Angabe der zwei Verzweigungen (Endungen des Szenarios) ist vor Drucklegung an ai-2027.com zu verifizieren.</w:t>
+      </w:r>
+    </w:p>
+    <w:p>
+      <w:pPr>
+        <w:pStyle w:val="Anmerkung"/>
+      </w:pPr>
+      <w:r>
+        <w:t xml:space="preserve">[17] Goldman Sachs Research (Joseph Briggs &amp; Devesh Kodnani): </w:t>
+      </w:r>
+      <w:r>
+        <w:rPr>
+          <w:i/>
+        </w:rPr>
+        <w:t>Generative AI Could Raise Global GDP by 7%</w:t>
+      </w:r>
+      <w:r>
+        <w:t xml:space="preserve">. 2023 — ca. 7 % globales BIP über 10 Jahre (≈ 7 Bio. USD), +1,5 Prozentpunkte Produktivitätswachstum; ca. zwei Drittel der US-Berufe exponiert, davon 25–50 % der Tätigkeiten automatisierbar. → QUELLEN.md Nr. 96. </w:t>
+      </w:r>
+      <w:r>
+        <w:rPr>
+          <w:b/>
+        </w:rPr>
+        <w:t>[Prognose]</w:t>
+      </w:r>
+    </w:p>
+    <w:p>
+      <w:pPr>
+        <w:pStyle w:val="Anmerkung"/>
+      </w:pPr>
+      <w:r>
+        <w:t xml:space="preserve">[18] McKinsey Global Institute / McKinsey Digital: </w:t>
+      </w:r>
+      <w:r>
+        <w:rPr>
+          <w:i/>
+        </w:rPr>
+        <w:t>The Economic Potential of Generative AI</w:t>
+      </w:r>
+      <w:r>
+        <w:t xml:space="preserve">. Juni 2023 — 2,6–4,4 Bio. USD jährlich über 63 Anwendungsfälle; ca. 75 % des Werts in vier Funktionen (Marketing/Vertrieb, Customer Operations, Software-Engineering, F&amp;E). → QUELLEN.md Nr. 97. </w:t>
+      </w:r>
+      <w:r>
+        <w:rPr>
+          <w:b/>
+        </w:rPr>
+        <w:t>[Prognose]</w:t>
+      </w:r>
+    </w:p>
+    <w:p>
+      <w:pPr>
+        <w:pStyle w:val="Anmerkung"/>
+      </w:pPr>
+      <w:r>
+        <w:t xml:space="preserve">[19] Daron Acemoglu: </w:t>
+      </w:r>
+      <w:r>
+        <w:rPr>
+          <w:i/>
+        </w:rPr>
+        <w:t>The Simple Macroeconomics of AI</w:t>
+      </w:r>
+      <w:r>
+        <w:t xml:space="preserve">. NBER Working Paper Nr. 32487, April 2024 — max. ca. 0,66 % TFP-Zuwachs über 10 Jahre; Annahmen ca. 20 % exponierte Tätigkeiten, davon ca. 23 % profitabel automatisierbar. Call-back auf Kapitel 6. → QUELLEN.md Nr. 110. </w:t>
+      </w:r>
+      <w:r>
+        <w:rPr>
+          <w:b/>
+        </w:rPr>
+        <w:t>[Prognose / Modellrechnung]</w:t>
+      </w:r>
+      <w:r>
+        <w:t xml:space="preserve"> — </w:t>
+      </w:r>
+      <w:r>
+        <w:rPr>
+          <w:i/>
+        </w:rPr>
+        <w:t>Die im Text angeschlossene Rechnung „drei multiplizierte Schätzungen" ist eine Veranschaulichung des Autors, keine Angabe der zitierten Studien.</w:t>
+      </w:r>
+    </w:p>
+    <w:p>
+      <w:pPr>
+        <w:pStyle w:val="Anmerkung"/>
+      </w:pPr>
+      <w:r>
+        <w:t xml:space="preserve">[20] ▲ Clifford Stoll: </w:t>
+      </w:r>
+      <w:r>
+        <w:rPr>
+          <w:i/>
+        </w:rPr>
+        <w:t>Why the Web Won't Be Nirvana</w:t>
+      </w:r>
+      <w:r>
+        <w:t xml:space="preserve">. Newsweek, 26./27. Februar 1995; spätere Selbstkorrektur (2010). Call-back auf Kapitel 5. → QUELLEN.md Nr. 35. </w:t>
+      </w:r>
+      <w:r>
+        <w:rPr>
+          <w:b/>
+        </w:rPr>
+        <w:t>[belegt als Fehlprognose]</w:t>
+      </w:r>
+      <w:r>
+        <w:t xml:space="preserve"> — </w:t>
+      </w:r>
+      <w:r>
+        <w:rPr>
+          <w:i/>
+        </w:rPr>
+        <w:t>Die drei Vorhersagen sind im Text sinngemäß wiedergegeben; englischer Originalwortlaut vor Drucklegung an der Newsweek-Fassung prüfen.</w:t>
+      </w:r>
+    </w:p>
+    <w:p>
+      <w:pPr>
+        <w:pStyle w:val="Anmerkung"/>
+      </w:pPr>
+      <w:r>
+        <w:t xml:space="preserve">[21] ▲ Roy Amara (Institute for the Future): Amara's Law — kurzfristige Über-, langfristige Unterschätzung technischer Wirkung; Datierung meist auf ca. 1978, Erstnennung unsicher. Call-back auf Kapitel 4. → QUELLEN.md Nr. 53. </w:t>
+      </w:r>
+      <w:r>
+        <w:rPr>
+          <w:b/>
+        </w:rPr>
+        <w:t>[belegt als Zuschreibung, Datierung unsicher]</w:t>
+      </w:r>
+    </w:p>
+    <w:p>
+      <w:pPr>
+        <w:pStyle w:val="Anmerkung"/>
+      </w:pPr>
+      <w:r>
+        <w:t xml:space="preserve">[22] Zur „bayerischen Ärztewarnung" als wahrscheinliche Legende: </w:t>
+      </w:r>
+      <w:r>
+        <w:rPr>
+          <w:i/>
+        </w:rPr>
+        <w:t>Eisenbahnkrankheit</w:t>
+      </w:r>
+      <w:r>
+        <w:t xml:space="preserve"> (Forschungsstand); W. K. Mück (Archiv-Negativbefund). Call-back auf Kapitel 2. → QUELLEN.md Nr. 5, 6. </w:t>
+      </w:r>
+      <w:r>
+        <w:rPr>
+          <w:b/>
+        </w:rPr>
+        <w:t>[belegt als Mythos]</w:t>
+      </w:r>
+    </w:p>
+    <w:p>
+      <w:pPr>
+        <w:pStyle w:val="Anmerkung"/>
+      </w:pPr>
+      <w:r>
+        <w:t xml:space="preserve">[23] ▲ Christian B. Anfinsen: Nobelpreis für Chemie 1972; „Anfinsen-Dogma" — die Information für die native Faltung steckt in der Aminosäuresequenz. Cyrus Levinthal: </w:t>
+      </w:r>
+      <w:r>
+        <w:rPr>
+          <w:i/>
+        </w:rPr>
+        <w:t>How to Fold Graciously</w:t>
+      </w:r>
+      <w:r>
+        <w:t xml:space="preserve">, 1969 — Levinthal-Paradox. NobelPrize.org; strukturbiologische Standardliteratur. → QUELLEN.md Nr. 159. </w:t>
+      </w:r>
+      <w:r>
+        <w:rPr>
+          <w:b/>
+        </w:rPr>
+        <w:t>[belegt]</w:t>
+      </w:r>
+      <w:r>
+        <w:t xml:space="preserve"> — </w:t>
+      </w:r>
+      <w:r>
+        <w:rPr>
+          <w:i/>
+        </w:rPr>
+        <w:t>Jahreszahlen und Formulierung des Levinthal-Arguments vor Drucklegung prüfen; keine Wortzitate im Text.</w:t>
+      </w:r>
+    </w:p>
+    <w:p>
+      <w:pPr>
+        <w:pStyle w:val="Anmerkung"/>
+      </w:pPr>
+      <w:r>
+        <w:t xml:space="preserve">[24] ▲ CASP — </w:t>
+      </w:r>
+      <w:r>
+        <w:rPr>
+          <w:i/>
+        </w:rPr>
+        <w:t>Critical Assessment of Structure Prediction</w:t>
+      </w:r>
+      <w:r>
+        <w:t xml:space="preserve">, initiiert 1994 von John Moult u. a., zweijährliche Blindprüfung; CASP13 (2018) erster AlphaFold-Sieg; CASP14 (2020) AlphaFold2 mit einem Median-GDT-Wert um 92, Schwellenbereich um 90 als experimentnahe Genauigkeit; Einordnung der Organisatoren, das Problem sei in wesentlichem Sinn gelöst. predictioncenter.org; Nature 2020. → QUELLEN.md Nr. 160. </w:t>
+      </w:r>
+      <w:r>
+        <w:rPr>
+          <w:b/>
+        </w:rPr>
+        <w:t>[belegt]</w:t>
+      </w:r>
+      <w:r>
+        <w:t xml:space="preserve"> — </w:t>
+      </w:r>
+      <w:r>
+        <w:rPr>
+          <w:i/>
+        </w:rPr>
+        <w:t>Medianwert, Metrik und Aussage der Organisatoren am CASP14-Bericht verifizieren; im Text sinngemäß, ohne Wortzitat.</w:t>
+      </w:r>
+    </w:p>
+    <w:p>
+      <w:pPr>
+        <w:pStyle w:val="Anmerkung"/>
+      </w:pPr>
+      <w:r>
+        <w:t xml:space="preserve">[25] ▲ Protein Data Bank (seit 1971), Bestand zum Zeitpunkt von AlphaFold2 in der Größenordnung von 170.000 experimentell bestimmten Strukturen; AlphaFold2 in Nature, Juli 2021, samt Code; AlphaFold Protein Structure Database (DeepMind/EMBL-EBI), Start Juli 2021, Ausbau Juli 2022 auf über 200 Mio. Vorhersagen. → QUELLEN.md Nr. 161. </w:t>
+      </w:r>
+      <w:r>
+        <w:rPr>
+          <w:b/>
+        </w:rPr>
+        <w:t>[belegt]</w:t>
+      </w:r>
+      <w:r>
+        <w:t xml:space="preserve"> — </w:t>
+      </w:r>
+      <w:r>
+        <w:rPr>
+          <w:i/>
+        </w:rPr>
+        <w:t>Bestandszahl und Ausbaudaten an den Betreiberangaben prüfen.</w:t>
+      </w:r>
+    </w:p>
+    <w:p>
+      <w:pPr>
+        <w:pStyle w:val="Anmerkung"/>
+      </w:pPr>
+      <w:r>
+        <w:t xml:space="preserve">[26] ▲ Grenzen der Strukturvorhersage: Konfidenzmaß pLDDT je Rest; niedrige Konfidenz bei intrinsisch ungeordneten Bereichen; keine Aussage über Faltungsweg und Dynamik; unzuverlässige Erfassung der Effekte einzelner Mutationen; Molekülkomplexe erst mit Nachfolgemodellen (AlphaFold-Multimer; AlphaFold3, Nature, Mai 2024). → QUELLEN.md Nr. 162. </w:t>
+      </w:r>
+      <w:r>
+        <w:rPr>
+          <w:b/>
+        </w:rPr>
+        <w:t>[belegt]</w:t>
+      </w:r>
+      <w:r>
+        <w:t xml:space="preserve"> — </w:t>
+      </w:r>
+      <w:r>
+        <w:rPr>
+          <w:i/>
+        </w:rPr>
+        <w:t>An der AlphaFold2/3-Primärliteratur belegen. Die Bemerkung, das Modell stehe auf den Daten der experimentellen Strukturbiologie, ist Überlegung des Autors.</w:t>
+      </w:r>
+    </w:p>
+    <w:p>
+      <w:pPr>
+        <w:pStyle w:val="Anmerkung"/>
+      </w:pPr>
+      <w:r>
+        <w:t xml:space="preserve">[27] ▲ Andrew Ng: Mitgründer von Coursera, Gründer von DeepLearning.AI. → QUELLEN.md Nr. 163. </w:t>
+      </w:r>
+      <w:r>
+        <w:rPr>
+          <w:b/>
+        </w:rPr>
+        <w:t>[belegt]</w:t>
+      </w:r>
+      <w:r>
+        <w:t xml:space="preserve"> — </w:t>
+      </w:r>
+      <w:r>
+        <w:rPr>
+          <w:i/>
+        </w:rPr>
+        <w:t>Im Text nur als Interessenlage angeführt, ausdrücklich ohne Entwertung seiner Argumente.</w:t>
+      </w:r>
+    </w:p>
+    <w:p>
+      <w:pPr>
+        <w:pStyle w:val="Anmerkung"/>
+      </w:pPr>
+      <w:r>
+        <w:t xml:space="preserve">[28] ▲ Bundeszentrale für politische Bildung, </w:t>
+      </w:r>
+      <w:r>
+        <w:rPr>
+          <w:i/>
+        </w:rPr>
+        <w:t>Aus Politik und Zeitgeschichte</w:t>
+      </w:r>
+      <w:r>
+        <w:t xml:space="preserve"> 7/1980: </w:t>
+      </w:r>
+      <w:r>
+        <w:rPr>
+          <w:i/>
+        </w:rPr>
+        <w:t>Mikroelektronik — die dritte industrielle Revolution</w:t>
+      </w:r>
+      <w:r>
+        <w:t xml:space="preserve">. — Zeitgenössische Debatte über technologisch verursachte Massenarbeitslosigkeit. Call-back auf Kapitel 5 und 6. → QUELLEN.md Nr. 30. </w:t>
+      </w:r>
+      <w:r>
+        <w:rPr>
+          <w:b/>
+        </w:rPr>
+        <w:t>[belegt als zeitgenössische Debatte]</w:t>
+      </w:r>
+      <w:r>
+        <w:t xml:space="preserve"> — </w:t>
+      </w:r>
+      <w:r>
+        <w:rPr>
+          <w:i/>
+        </w:rPr>
+        <w:t>Belegstelle prüfen; die Bewertung des Ausgangs ist im Text als Einordnung des Autors markiert.</w:t>
+      </w:r>
+    </w:p>
+    <w:p>
+      <w:pPr>
+        <w:pStyle w:val="Anmerkung"/>
+      </w:pPr>
+      <w:r>
+        <w:t xml:space="preserve">[29] Berkeley Roundtable on the International Economy (BRIE): </w:t>
+      </w:r>
+      <w:r>
+        <w:rPr>
+          <w:i/>
+        </w:rPr>
+        <w:t>Automation and the Future of Work in Germany</w:t>
+      </w:r>
+      <w:r>
+        <w:t xml:space="preserve">, 2022; ergänzend OECD: </w:t>
+      </w:r>
+      <w:r>
+        <w:rPr>
+          <w:i/>
+        </w:rPr>
+        <w:t>The Risk of Automation for Jobs in OECD Countries</w:t>
+      </w:r>
+      <w:r>
+        <w:t xml:space="preserve">, 2016. — Keine überdurchschnittlichen Jobverluste in hochautomatisierten deutschen Regionen; Produktivitätszuwächse eher mit regionalem Beschäftigungswachstum verbunden. Call-back auf Kapitel 5. → QUELLEN.md Nr. 31. </w:t>
+      </w:r>
+      <w:r>
+        <w:rPr>
+          <w:b/>
+        </w:rPr>
+        <w:t>[belegt]</w:t>
+      </w:r>
+    </w:p>
+    <w:p>
+      <w:pPr>
+        <w:pStyle w:val="Anmerkung"/>
+      </w:pPr>
+      <w:r>
+        <w:t xml:space="preserve">[30] De Simone, Martín; Tiberti, Federico u. a. (Weltbank): </w:t>
+      </w:r>
+      <w:r>
+        <w:rPr>
+          <w:i/>
+        </w:rPr>
+        <w:t>From Chalkboards to Chatbots: Transforming Learning in Nigeria</w:t>
+      </w:r>
+      <w:r>
+        <w:t xml:space="preserve">, 2024/25 — Edo-State-Pilot, ca. 800 Schüler:innen, 9 Schulen, 6 Wochen, randomisiert, GPT-4 über Microsoft Copilot als begleiteter Tutor; Lernzuwachs verglichen mit ca. zwei Jahren regulärer Schulbildung, ca. 48 USD pro Kind; Caveats in Kapitel 7 ausgeführt. Call-back auf Kapitel 7. → QUELLEN.md Nr. 65. </w:t>
+      </w:r>
+      <w:r>
+        <w:rPr>
+          <w:b/>
+        </w:rPr>
+        <w:t>[belegt]</w:t>
+      </w:r>
+      <w:r>
+        <w:t xml:space="preserve"> — </w:t>
+      </w:r>
+      <w:r>
+        <w:rPr>
+          <w:i/>
+        </w:rPr>
+        <w:t>Im Text als Prüfung der Andreessen-Behauptung verwendet, nicht als Bestätigung des Essays insgesamt.</w:t>
       </w:r>
     </w:p>
     <w:p>
@@ -18891,7 +19598,7 @@
         <w:pStyle w:val="Zwischen"/>
       </w:pPr>
       <w:r>
-        <w:t>Kapitel 9 — Die Stimmen der Propheten</w:t>
+        <w:t>Kapitel 10 — Was vom Menschen bleibt</w:t>
       </w:r>
     </w:p>
     <w:p>
@@ -18899,13 +19606,194 @@
         <w:pStyle w:val="Anmerkung"/>
       </w:pPr>
       <w:r>
-        <w:t xml:space="preserve">[1] Demis Hassabis &amp; John Jumper: Nobelpreis für Chemie 2024 (gemeinsam mit David Baker für Proteindesign); AlphaFold2 (2020), ca. 200 Mio. vorhergesagte Proteinstrukturen; AlphaFold-Datenbank von über 2 Mio. Forschenden in 190 Ländern genutzt; von DeepMind angeführte Anwendungsbeispiele (u. a. Enzyme zum Kunststoffabbau, vernachlässigte Tropenkrankheiten, Malariaforschung). NobelPrize.org; Google DeepMind. → QUELLEN.md Nr. 92. </w:t>
+        <w:t xml:space="preserve">[1] Erik Brynjolfsson: </w:t>
+      </w:r>
+      <w:r>
+        <w:rPr>
+          <w:i/>
+        </w:rPr>
+        <w:t>The Turing Trap: The Promise &amp; Peril of Human-Like Artificial Intelligence</w:t>
+      </w:r>
+      <w:r>
+        <w:t>. Dædalus, Frühjahr 2022; auch arXiv:2201.04200. — Unterscheidung Automation/Augmentation; Verhandlungsmacht und Wertkonzentration bei Substitution; schiefe Anreizlage zugunsten von Automation. Ausdrücklich ökonomische Analyse und Position, keine Messung. → QUELLEN.md Nr. 108. ▲ *</w:t>
+      </w:r>
+      <w:r>
+        <w:rPr>
+          <w:i/>
+        </w:rPr>
+        <w:t>Der im Text erläuterte Bezug auf Turings Nachahmungsspiel als Namensgeber der „Falle" ist vor Drucklegung am Volltext des Papers zu verifizieren; ggf. Turing 1950 (</w:t>
+      </w:r>
+      <w:r>
+        <w:t>Computing Machinery and Intelligence</w:t>
+      </w:r>
+      <w:r>
+        <w:rPr>
+          <w:i/>
+        </w:rPr>
+        <w:t>) als eigene Quelle nachtragen.</w:t>
+      </w:r>
+      <w:r>
+        <w:rPr>
+          <w:i/>
+        </w:rPr>
+        <w:t xml:space="preserve"> — </w:t>
+      </w:r>
+      <w:r>
+        <w:t>Die vier Anreize im Abschnitt „Warum die Anreize in eine Richtung ziehen" und die vier Merkmale eines augmentierenden Entwurfs sind im Text als Beobachtung des Autors gekennzeichnet und werden Brynjolfsson nicht zugeschrieben.*</w:t>
+      </w:r>
+    </w:p>
+    <w:p>
+      <w:pPr>
+        <w:pStyle w:val="Anmerkung"/>
+      </w:pPr>
+      <w:r>
+        <w:t xml:space="preserve">[2] Erik Brynjolfsson, Bharat Chandar, Ruyu Chen (Stanford Digital Economy Lab): </w:t>
+      </w:r>
+      <w:r>
+        <w:rPr>
+          <w:i/>
+        </w:rPr>
+        <w:t>Canaries in the Coal Mine? Six Facts about the Recent Employment Effects of Artificial Intelligence</w:t>
+      </w:r>
+      <w:r>
+        <w:t xml:space="preserve">. 2025. ADP-Lohndaten von über 25 Mio. Beschäftigten. — Relativer Beschäftigungsrückgang ~13–16 % bei 22–25-Jährigen in stark KI-exponierten Berufen bei gleichzeitigem Zuwachs älterer Kohorten; Konzentration auf automatisierende statt augmentierende Anwendungen. → QUELLEN.md Nr. 63. ▲ </w:t>
       </w:r>
       <w:r>
         <w:rPr>
           <w:b/>
         </w:rPr>
-        <w:t>[belegt]</w:t>
+        <w:t>Effektgrößen und die Automation/Augmentation-Aufschlüsselung vor Drucklegung am PDF gegenlesen; ebenso die Aussage zu den älteren Kohorten. Einschränkungen (ein Land, ein Datensatz, kurzer Zeitraum, konstruierte Expositions- und Anwendungsmaße) sind im Text gekennzeichnet.</w:t>
+      </w:r>
+    </w:p>
+    <w:p>
+      <w:pPr>
+        <w:pStyle w:val="Anmerkung"/>
+      </w:pPr>
+      <w:r>
+        <w:t xml:space="preserve">[3] Erik Brynjolfsson, Danielle Li, Lindsey Raymond: </w:t>
+      </w:r>
+      <w:r>
+        <w:rPr>
+          <w:i/>
+        </w:rPr>
+        <w:t>Generative AI at Work</w:t>
+      </w:r>
+      <w:r>
+        <w:t>. Quarterly Journal of Economics 140(2), 2025, S. 889–942. — ~15 % mehr gelöste Vorgänge pro Stunde bei 5.172 Kundendienst-Mitarbeitenden; größte Gewinne bei wenig erfahrenen und gering qualifizierten Kräften. → QUELLEN.md Nr. 55.</w:t>
+      </w:r>
+    </w:p>
+    <w:p>
+      <w:pPr>
+        <w:pStyle w:val="Anmerkung"/>
+      </w:pPr>
+      <w:r>
+        <w:t xml:space="preserve">[4] OECD: </w:t>
+      </w:r>
+      <w:r>
+        <w:rPr>
+          <w:i/>
+        </w:rPr>
+        <w:t>OECD Employment Outlook 2025</w:t>
+      </w:r>
+      <w:r>
+        <w:t>. OECD Publishing, 2025. — Bislang wenig Belege für KI-bedingte Jobverluste; zwei Drittel der KI-nutzenden Beschäftigten erleben die Arbeit als weniger monoton oder gefährlich. → QUELLEN.md Nr. 59.</w:t>
+      </w:r>
+    </w:p>
+    <w:p>
+      <w:pPr>
+        <w:pStyle w:val="Anmerkung"/>
+      </w:pPr>
+      <w:r>
+        <w:t xml:space="preserve">[5] METR: </w:t>
+      </w:r>
+      <w:r>
+        <w:rPr>
+          <w:i/>
+        </w:rPr>
+        <w:t>Measuring the Impact of Early-2025 AI on Experienced Open-Source Developer Productivity</w:t>
+      </w:r>
+      <w:r>
+        <w:t>. 2025; arXiv:2507.09089. — 16 erfahrene Entwickler:innen, RCT, 19 % längere Bearbeitungszeit mit KI bei gegenteiliger Selbsteinschätzung. → QUELLEN.md Nr. 64.</w:t>
+      </w:r>
+    </w:p>
+    <w:p>
+      <w:pPr>
+        <w:pStyle w:val="Anmerkung"/>
+      </w:pPr>
+      <w:r>
+        <w:t xml:space="preserve">[6] Anil R. Doshi, Oliver P. Hauser: </w:t>
+      </w:r>
+      <w:r>
+        <w:rPr>
+          <w:i/>
+        </w:rPr>
+        <w:t>Generative AI enhances individual creativity but reduces the collective diversity of novel content</w:t>
+      </w:r>
+      <w:r>
+        <w:t>. Science Advances 10(28), 2024, eadn5290, DOI 10.1126/sciadv.adn5290. — Rückverweis auf Kapitel 7. → QUELLEN.md Nr. 69.</w:t>
+      </w:r>
+    </w:p>
+    <w:p>
+      <w:pPr>
+        <w:pStyle w:val="Anmerkung"/>
+      </w:pPr>
+      <w:r>
+        <w:t xml:space="preserve">[7] Pawel Gmyrek, Janine Berg et al. (ILO/NASK): </w:t>
+      </w:r>
+      <w:r>
+        <w:rPr>
+          <w:i/>
+        </w:rPr>
+        <w:t>Generative AI and Jobs: A Refined Global Index of Occupational Exposure</w:t>
+      </w:r>
+      <w:r>
+        <w:t xml:space="preserve">. ILO Working Paper 140, Mai 2025. — ~1 von 4 Beschäftigten weltweit exponiert; 34 % (Hocheinkommen) vs. 11 % (Niedrigeinkommen); höchste Expositionsstufe 3,3 % der weltweiten Beschäftigung, Frauen 4,7 % vs. Männer 2,4 %; Transformation statt Ersatz. → QUELLEN.md Nr. 61. ▲ </w:t>
+      </w:r>
+      <w:r>
+        <w:rPr>
+          <w:b/>
+        </w:rPr>
+        <w:t>Die im Text angeschlossene Deutung („Exposition folgt der Bildschirmnähe, nicht dem Anspruch der Tätigkeit") ist als Lesart des Autors gekennzeichnet und keine Aussage der Studie.</w:t>
+      </w:r>
+    </w:p>
+    <w:p>
+      <w:pPr>
+        <w:pStyle w:val="Anmerkung"/>
+      </w:pPr>
+      <w:r>
+        <w:t xml:space="preserve">[8] Mauro Cazzaniga et al. (IWF): </w:t>
+      </w:r>
+      <w:r>
+        <w:rPr>
+          <w:i/>
+        </w:rPr>
+        <w:t>Gen-AI: Artificial Intelligence and the Future of Work</w:t>
+      </w:r>
+      <w:r>
+        <w:t>. IMF Staff Discussion Note, Januar 2024. — ~40 % der Jobs weltweit exponiert, ~60 % in fortgeschrittenen Volkswirtschaften, ~26 % in Niedrigeinkommensländern; ausdrückliche Warnung vor wachsender Ungleichheit. → QUELLEN.md Nr. 62.</w:t>
+      </w:r>
+    </w:p>
+    <w:p>
+      <w:pPr>
+        <w:pStyle w:val="Anmerkung"/>
+      </w:pPr>
+      <w:r>
+        <w:t xml:space="preserve">[9] OpenResearch: </w:t>
+      </w:r>
+      <w:r>
+        <w:rPr>
+          <w:i/>
+        </w:rPr>
+        <w:t>Unconditional Cash Study</w:t>
+      </w:r>
+      <w:r>
+        <w:t xml:space="preserve">, Ergebnisse veröffentlicht 21. Juli 2024; finanziell gestützt von Sam Altman. — 1.000 Teilnehmende, 1.000 USD/Monat über drei Jahre, Kontrollgruppe 50 USD; mehr Gründungen, Bildung, Vorsorge und medizinische Versorgung; geringer Effekt auf die Arbeitszeit (Größenordnung ~5 Std./Monat weniger Erwerbsarbeit). → QUELLEN.md Nr. 109. ▲ </w:t>
+      </w:r>
+      <w:r>
+        <w:rPr>
+          <w:b/>
+        </w:rPr>
+        <w:t>Genaue Effektgröße zur Arbeitszeit vor Drucklegung an der Originalveröffentlichung bestätigen.</w:t>
       </w:r>
       <w:r>
         <w:t xml:space="preserve"> — </w:t>
@@ -18914,7 +19802,7 @@
         <w:rPr>
           <w:i/>
         </w:rPr>
-        <w:t>Die Anwendungsbeispiele sind im Text ausdrücklich als Angaben von DeepMind gekennzeichnet.</w:t>
+        <w:t>Die im Text genannten Grenzen (Befristung auf drei Jahre, Stichprobengröße, Finanzierung von außen, US-Kontext der Gesundheitsversorgung) sind ausdrücklich als Einordnung des Autors gekennzeichnet, nicht als Aussagen der Studie.</w:t>
       </w:r>
     </w:p>
     <w:p>
@@ -18922,13 +19810,933 @@
         <w:pStyle w:val="Anmerkung"/>
       </w:pPr>
       <w:r>
-        <w:t xml:space="preserve">[2] ▲ Demis Hassabis zu einem „skalierbaren Prozess" gegen praktisch alle Krankheiten in 10–20 Jahren; Isomorphic Labs (DeepMind-Spin-off 2021, Milliardenfinanzierung, Ziel 1–2 Jahre Entdeckungsphase). Interviews/Berichterstattung 2025–26 (u. a. Fortune, The AI Insider). → QUELLEN.md Nr. 91. </w:t>
+        <w:t xml:space="preserve">[10] Daron Acemoglu: </w:t>
+      </w:r>
+      <w:r>
+        <w:rPr>
+          <w:i/>
+        </w:rPr>
+        <w:t>The Simple Macroeconomics of AI</w:t>
+      </w:r>
+      <w:r>
+        <w:t>. NBER Working Paper Nr. 32487, April 2024. — Höchstens ~0,66 % zusätzliche TFP über zehn Jahre; ausdrücklich Modellrechnung/Prognose. → QUELLEN.md Nr. 110.</w:t>
+      </w:r>
+    </w:p>
+    <w:p>
+      <w:pPr>
+        <w:pStyle w:val="Anmerkung"/>
+      </w:pPr>
+      <w:r>
+        <w:t xml:space="preserve">[11] World Economic Forum: </w:t>
+      </w:r>
+      <w:r>
+        <w:rPr>
+          <w:i/>
+        </w:rPr>
+        <w:t>The Future of Jobs Report 2025</w:t>
+      </w:r>
+      <w:r>
+        <w:t>. 2025. — 170 Mio. neue, 92 Mio. wegfallende, netto +78 Mio. Stellen bis 2030; Basis ~1.000 Unternehmen in 55 Volkswirtschaften. Prognose auf Befragungsbasis. → QUELLEN.md Nr. 57.</w:t>
+      </w:r>
+    </w:p>
+    <w:p>
+      <w:pPr>
+        <w:pStyle w:val="Anmerkung"/>
+      </w:pPr>
+      <w:r>
+        <w:t xml:space="preserve">[12] IAB — Institut für Arbeitsmarkt- und Berufsforschung: </w:t>
+      </w:r>
+      <w:r>
+        <w:rPr>
+          <w:i/>
+        </w:rPr>
+        <w:t>KI und Arbeitsmarkt</w:t>
+      </w:r>
+      <w:r>
+        <w:t xml:space="preserve">, IAB-Forschungsbericht 2025. — Beschäftigungswachstum in stark KI-exponierten Berufen (+5,9 %) höher als in gering (+2,5 %) oder nicht exponierten (−1,7 %). → QUELLEN.md Nr. 58. ▲ </w:t>
       </w:r>
       <w:r>
         <w:rPr>
           <w:b/>
         </w:rPr>
-        <w:t>[Prognose]</w:t>
+        <w:t>Einzelzahlen vor Drucklegung direkt am IAB-Volltext prüfen.</w:t>
+      </w:r>
+    </w:p>
+    <w:p>
+      <w:pPr>
+        <w:pStyle w:val="Anmerkung"/>
+      </w:pPr>
+      <w:r>
+        <w:t xml:space="preserve">[13] OECD: </w:t>
+      </w:r>
+      <w:r>
+        <w:rPr>
+          <w:i/>
+        </w:rPr>
+        <w:t>OECD Employment Outlook 2023 — Artificial Intelligence and the Labour Market</w:t>
+      </w:r>
+      <w:r>
+        <w:t xml:space="preserve"> (Arbeitgeber- und Beschäftigten-Surveys 2022). — Lohnprämie für KI-spezifische Kompetenzen gegenüber vergleichbaren fortgeschrittenen Fähigkeiten. → QUELLEN.md Nr. 60.</w:t>
+      </w:r>
+    </w:p>
+    <w:p>
+      <w:pPr>
+        <w:pStyle w:val="Anmerkung"/>
+      </w:pPr>
+      <w:r>
+        <w:t xml:space="preserve">[14] Alan M. Turing: </w:t>
+      </w:r>
+      <w:r>
+        <w:rPr>
+          <w:i/>
+        </w:rPr>
+        <w:t>Computing Machinery and Intelligence</w:t>
+      </w:r>
+      <w:r>
+        <w:t xml:space="preserve">. Mind LIX (236), Oktober 1950, S. 433–460. — Ersetzung der Frage „Können Maschinen denken?" durch das Nachahmungsspiel (imitation game); Kommunikation ausschließlich über Fernschreiber; Prüfkriterium ist die Unterscheidbarkeit durch einen menschlichen Fragesteller. → QUELLEN.md Nr. 164. ▲ </w:t>
+      </w:r>
+      <w:r>
+        <w:rPr>
+          <w:b/>
+        </w:rPr>
+        <w:t>Im Text durchgehend paraphrasiert, kein Wortzitat. Aufbau des Spiels (Turings ursprüngliche Fassung mit Mann und Frau als Vorlage) und Seitenangabe vor Drucklegung am Originalaufsatz prüfen.</w:t>
+      </w:r>
+    </w:p>
+    <w:p>
+      <w:pPr>
+        <w:pStyle w:val="Zwischen"/>
+      </w:pPr>
+      <w:r>
+        <w:t>Kapitel 11 — Vertrauen ist eine Fähigkeit</w:t>
+      </w:r>
+    </w:p>
+    <w:p>
+      <w:pPr>
+        <w:pStyle w:val="Anmerkung"/>
+      </w:pPr>
+      <w:r>
+        <w:t xml:space="preserve">[1] Jeffrey Dastin (Reuters): </w:t>
+      </w:r>
+      <w:r>
+        <w:rPr>
+          <w:i/>
+        </w:rPr>
+        <w:t>Amazon scraps secret AI recruiting tool that showed bias against women</w:t>
+      </w:r>
+      <w:r>
+        <w:t>, Oktober 2018. — Training auf zehn Jahren überwiegend männlicher Bewerbungen; Abwertung von „women's" und reinen Frauen-Colleges; Projekt eingestellt. → QUELLEN.md Nr. 78.</w:t>
+      </w:r>
+    </w:p>
+    <w:p>
+      <w:pPr>
+        <w:pStyle w:val="Anmerkung"/>
+      </w:pPr>
+      <w:r>
+        <w:t>[2] Verordnung (EU) 2024/1689 (EU AI Act); Implementation Timeline des AI Act Service Desk der Europäischen Kommission. — Risikobasierter Ansatz mit vier Stufen; verbotene Praktiken nach Art. 5 (u. a. Social Scoring durch Behörden, ungezieltes Scraping von Gesichtsbildern, Emotionserkennung am Arbeitsplatz und in der Bildung) anwendbar seit 2.2.2025; Hochrisiko-Systeme nach Anhang III und Transparenzpflichten nach Art. 50 anwendbar seit 2.8.2026. → QUELLEN.md Nr. 84.</w:t>
+      </w:r>
+    </w:p>
+    <w:p>
+      <w:pPr>
+        <w:pStyle w:val="Anmerkung"/>
+      </w:pPr>
+      <w:r>
+        <w:t xml:space="preserve">[3] Gary Marcus: </w:t>
+      </w:r>
+      <w:r>
+        <w:rPr>
+          <w:i/>
+        </w:rPr>
+        <w:t>Deep Learning Is Hitting a Wall</w:t>
+      </w:r>
+      <w:r>
+        <w:t xml:space="preserve">, Nautilus 2022, fortgeführt im Substack „Marcus on AI" (2024). — Position: Halluzinationen und Reasoning-Schwächen lassen sich durch reines Hochskalieren nicht lösen. Im Text als Position gekennzeichnet, nicht als Konsens; die </w:t>
+      </w:r>
+      <w:r>
+        <w:rPr>
+          <w:i/>
+        </w:rPr>
+        <w:t>Existenz</w:t>
+      </w:r>
+      <w:r>
+        <w:t xml:space="preserve"> der Grenze (Halluzination) ist in der Recherchelage unstrittig, quantitative Fehlerraten werden im Text bewusst nicht genannt. → QUELLEN.md Nr. 103.</w:t>
+      </w:r>
+    </w:p>
+    <w:p>
+      <w:pPr>
+        <w:pStyle w:val="Anmerkung"/>
+      </w:pPr>
+      <w:r>
+        <w:t xml:space="preserve">[4] METR: </w:t>
+      </w:r>
+      <w:r>
+        <w:rPr>
+          <w:i/>
+        </w:rPr>
+        <w:t>Measuring the Impact of Early-2025 AI on Experienced Open-Source Developer Productivity</w:t>
+      </w:r>
+      <w:r>
+        <w:t>, 2025, arXiv:2507.09089; Update Februar 2026. — 16 erfahrene Entwickler:innen, RCT, 19 % langsamer bei gegenteiliger Selbsteinschätzung (~20 % schneller); Einschränkungen und das spätere METR-Update sind im Text genannt. → QUELLEN.md Nr. 64.</w:t>
+      </w:r>
+    </w:p>
+    <w:p>
+      <w:pPr>
+        <w:pStyle w:val="Anmerkung"/>
+      </w:pPr>
+      <w:r>
+        <w:t xml:space="preserve">[5] Hao-Ping Lee et al. (Microsoft Research / Carnegie Mellon): </w:t>
+      </w:r>
+      <w:r>
+        <w:rPr>
+          <w:i/>
+        </w:rPr>
+        <w:t>The Impact of Generative AI on Critical Thinking</w:t>
+      </w:r>
+      <w:r>
+        <w:t>, CHI 2025, DOI 10.1145/3706598.3713778. — 319 Berufstätige, 936 reale Anwendungsfälle; höheres Vertrauen in die KI korreliert mit weniger kritischem Denken, höheres Selbstvertrauen mit mehr. → QUELLEN.md Nr. 67.</w:t>
+      </w:r>
+    </w:p>
+    <w:p>
+      <w:pPr>
+        <w:pStyle w:val="Anmerkung"/>
+      </w:pPr>
+      <w:r>
+        <w:t xml:space="preserve">[6] Nataliya Kosmyna et al. (MIT Media Lab): </w:t>
+      </w:r>
+      <w:r>
+        <w:rPr>
+          <w:i/>
+        </w:rPr>
+        <w:t>Your Brain on ChatGPT: Accumulation of Cognitive Debt…</w:t>
+      </w:r>
+      <w:r>
+        <w:t>, 2025, arXiv:2506.08872. — EEG-Studie, n=54; schwächste neuronale Konnektivität bei LLM-Nutzung; Begriff „cognitive debt". Preprint, kleine Stichprobe, methodische Kritik in einem Folge-Kommentar — im Text ausdrücklich vermerkt. → QUELLEN.md Nr. 66.</w:t>
+      </w:r>
+    </w:p>
+    <w:p>
+      <w:pPr>
+        <w:pStyle w:val="Anmerkung"/>
+      </w:pPr>
+      <w:r>
+        <w:t xml:space="preserve">[7] Ray Hembree &amp; Donald J. Dessart: </w:t>
+      </w:r>
+      <w:r>
+        <w:rPr>
+          <w:i/>
+        </w:rPr>
+        <w:t>Effects of Hand-Held Calculators in Precollege Mathematics Education: A Meta-Analysis</w:t>
+      </w:r>
+      <w:r>
+        <w:t>, Journal for Research in Mathematics Education 17(2), 1986, S. 83–99. — Überwiegend neutrale bis positive Effekte über die Klassenstufen hinweg, mit Ausnahme der vierten Klasse. → QUELLEN.md Nr. 28.</w:t>
+      </w:r>
+    </w:p>
+    <w:p>
+      <w:pPr>
+        <w:pStyle w:val="Anmerkung"/>
+      </w:pPr>
+      <w:r>
+        <w:t xml:space="preserve">[8] Zusammenfassende Recherche zu KI-Desinformation in den Wahlen 2024–2025 (State of Surveillance / Recorded Future u. a.). — „Cheap fakes" deutlich häufiger als KI-Generate; dokumentierte Einzelfälle: KI-generierte Biden-Robocalls mit bis zu ca. 25.000 erreichten Wählern in New Hampshire, gefälschtes Kandidaten-Audio in der Slowakei, Annullierung der rumänischen Präsidentschaftswahl 2024; kausale Wirkung meist nicht quantifiziert. → QUELLEN.md Nr. 75. ▲ </w:t>
+      </w:r>
+      <w:r>
+        <w:rPr>
+          <w:b/>
+        </w:rPr>
+        <w:t>Einzelzahlen vor Drucklegung an Primärberichten prüfen.</w:t>
+      </w:r>
+    </w:p>
+    <w:p>
+      <w:pPr>
+        <w:pStyle w:val="Anmerkung"/>
+      </w:pPr>
+      <w:r>
+        <w:t xml:space="preserve">[9] Yoshua Bengio et al.: </w:t>
+      </w:r>
+      <w:r>
+        <w:rPr>
+          <w:i/>
+        </w:rPr>
+        <w:t>International AI Safety Report 2025</w:t>
+      </w:r>
+      <w:r>
+        <w:t xml:space="preserve"> sowie </w:t>
+      </w:r>
+      <w:r>
+        <w:rPr>
+          <w:i/>
+        </w:rPr>
+        <w:t>Second Key Update: Technical Safeguards and Risk Management</w:t>
+      </w:r>
+      <w:r>
+        <w:t>, arXiv:2511.19863. — Wasserzeichen und Detektion KI-generierter Inhalte werden behandelt; versierte Angreifer umgehen aktuelle Schutzmaßnahmen oft, reale Wirksamkeit vieler Safeguards unsicher. → QUELLEN.md Nr. 73 und Nr. 74.</w:t>
+      </w:r>
+    </w:p>
+    <w:p>
+      <w:pPr>
+        <w:pStyle w:val="Anmerkung"/>
+      </w:pPr>
+      <w:r>
+        <w:t xml:space="preserve">[10] European Data Protection Board: </w:t>
+      </w:r>
+      <w:r>
+        <w:rPr>
+          <w:i/>
+        </w:rPr>
+        <w:t>Opinion 28/2024 on certain data protection aspects related to the processing of personal data in the context of AI models</w:t>
+      </w:r>
+      <w:r>
+        <w:t>, 17.12.2024. — Anonymität eines Modells ist im Einzelfall zu prüfen; es muss „sehr unwahrscheinlich" sein, Personen zu identifizieren oder personenbezogene Daten per Anfrage zu extrahieren. → QUELLEN.md Nr. 85.</w:t>
+      </w:r>
+    </w:p>
+    <w:p>
+      <w:pPr>
+        <w:pStyle w:val="Anmerkung"/>
+      </w:pPr>
+      <w:r>
+        <w:t xml:space="preserve">[11] UNESCO: </w:t>
+      </w:r>
+      <w:r>
+        <w:rPr>
+          <w:i/>
+        </w:rPr>
+        <w:t>Guidance for Generative AI in Education and Research</w:t>
+      </w:r>
+      <w:r>
+        <w:t>, 2023. — Empfohlenes Mindestalter 13 für die eigenständige Nutzung generativer KI-Plattformen; Hinweis auf die DSGVO-Schwelle von 16 Jahren. Im Text als institutionelle Position gekennzeichnet, nicht als eigenes pädagogisches Urteil. → QUELLEN.md Nr. 68.</w:t>
+      </w:r>
+    </w:p>
+    <w:p>
+      <w:pPr>
+        <w:pStyle w:val="Anmerkung"/>
+      </w:pPr>
+      <w:r>
+        <w:t xml:space="preserve">[12] Garante per la protezione dei dati personali; Berichterstattung Euronews/Reuters. — Bußgeld von 15 Mio. € gegen OpenAI am 20.12.2024 (u. a. fehlende Rechtsgrundlage für Trainingsdatenverarbeitung, Transparenzverstöße); Annullierung durch ein italienisches Gericht 2026 aus Zuständigkeitsgründen, nicht wegen Entkräftung der inhaltlichen DSGVO-Vorwürfe. → QUELLEN.md Nr. 83. ▲ </w:t>
+      </w:r>
+      <w:r>
+        <w:rPr>
+          <w:b/>
+        </w:rPr>
+        <w:t>[PRÜFEN]</w:t>
+      </w:r>
+      <w:r>
+        <w:t xml:space="preserve"> genaues Urteilsdatum/Instanz 2026.</w:t>
+      </w:r>
+    </w:p>
+    <w:p>
+      <w:pPr>
+        <w:pStyle w:val="Anmerkung"/>
+      </w:pPr>
+      <w:r>
+        <w:t xml:space="preserve">[13] New York State Department of Financial Services: </w:t>
+      </w:r>
+      <w:r>
+        <w:rPr>
+          <w:i/>
+        </w:rPr>
+        <w:t>Report on the Apple Card Investigation</w:t>
+      </w:r>
+      <w:r>
+        <w:t>, März 2021. — Rund 400.000 New Yorker Anträge geprüft; kein Nachweis unrechtmäßiger Diskriminierung, Geschlecht kein Faktor. → QUELLEN.md Nr. 81.</w:t>
+      </w:r>
+    </w:p>
+    <w:p>
+      <w:pPr>
+        <w:pStyle w:val="Anmerkung"/>
+      </w:pPr>
+      <w:r>
+        <w:t xml:space="preserve">[14] Julia Angwin, Jeff Larson, Surya Mattu, Lauren Kirchner (ProPublica): </w:t>
+      </w:r>
+      <w:r>
+        <w:rPr>
+          <w:i/>
+        </w:rPr>
+        <w:t>Machine Bias</w:t>
+      </w:r>
+      <w:r>
+        <w:t>, 2016. — COMPAS/Northpointe, Broward County; unter den nicht erneut Straffälligen 45 % Falsch-Positiv-Rate bei schwarzen gegenüber 24 % bei weißen Angeklagten. → QUELLEN.md Nr. 77.</w:t>
+      </w:r>
+    </w:p>
+    <w:p>
+      <w:pPr>
+        <w:pStyle w:val="Anmerkung"/>
+      </w:pPr>
+      <w:r>
+        <w:t xml:space="preserve">[15] Alexandra Chouldechova: </w:t>
+      </w:r>
+      <w:r>
+        <w:rPr>
+          <w:i/>
+        </w:rPr>
+        <w:t>Fair prediction with disparate impact</w:t>
+      </w:r>
+      <w:r>
+        <w:t xml:space="preserve">, 2017; Jon Kleinberg, Sendhil Mullainathan, Manish Raghavan: </w:t>
+      </w:r>
+      <w:r>
+        <w:rPr>
+          <w:i/>
+        </w:rPr>
+        <w:t>Inherent Trade-Offs in the Fair Determination of Risk Scores</w:t>
+      </w:r>
+      <w:r>
+        <w:t>, 2016, arXiv:1703.00056. — „Unmöglichkeitstheorem": Bei ungleichen Basisraten sind Kalibrierung und Fehlerratenbalance nicht gleichzeitig erfüllbar. → QUELLEN.md Nr. 80.</w:t>
+      </w:r>
+    </w:p>
+    <w:p>
+      <w:pPr>
+        <w:pStyle w:val="Anmerkung"/>
+      </w:pPr>
+      <w:r>
+        <w:t xml:space="preserve">[16] Joy Buolamwini &amp; Timnit Gebru: </w:t>
+      </w:r>
+      <w:r>
+        <w:rPr>
+          <w:i/>
+        </w:rPr>
+        <w:t>Gender Shades: Intersectional Accuracy Disparities in Commercial Gender Classification</w:t>
+      </w:r>
+      <w:r>
+        <w:t>, PMLR / Conference on Fairness, Accountability and Transparency, 2018. — Drei kommerzielle Systeme zur Geschlechtsklassifikation; höchste Fehlerrate bei dunkelhäutigen Frauen bis 34,7 %, niedrigste bei hellhäutigen Männern 0,8 %. Die im Text angeschlossene Folgerung („der Durchschnitt versteckt das Problem", Frage nach der schlechtesten Gruppe in der Abnahme) ist Schlussfolgerung des Autors, keine Aussage der Studie. → QUELLEN.md Nr. 79.</w:t>
+      </w:r>
+    </w:p>
+    <w:p>
+      <w:pPr>
+        <w:pStyle w:val="Anmerkung"/>
+      </w:pPr>
+      <w:r>
+        <w:t xml:space="preserve">[17] Sida Peng, Eirini Kalliamvakou, Peter Cihon, Mert Demirer: </w:t>
+      </w:r>
+      <w:r>
+        <w:rPr>
+          <w:i/>
+        </w:rPr>
+        <w:t>The Impact of AI on Developer Productivity: Evidence from GitHub Copilot</w:t>
+      </w:r>
+      <w:r>
+        <w:t>, 2023, arXiv:2302.06590. — Randomisiertes Experiment, Implementierung eines HTTP-Servers in JavaScript; Gruppe mit Copilot rund 56 % schneller (71 vs. 160 Minuten). Nicht begutachtetes Arbeitspapier, Laborsetting — im Text ausdrücklich gekennzeichnet. Die Gegenüberstellung mit dem METR-Ergebnis [4] ist die Deutung des Autors. → QUELLEN.md Nr. 56.</w:t>
+      </w:r>
+    </w:p>
+    <w:p>
+      <w:pPr>
+        <w:pStyle w:val="Anmerkung"/>
+      </w:pPr>
+      <w:r>
+        <w:t xml:space="preserve">[18] Martín De Simone, Federico Tiberti et al. (Weltbank): </w:t>
+      </w:r>
+      <w:r>
+        <w:rPr>
+          <w:i/>
+        </w:rPr>
+        <w:t>From Chalkboards to Chatbots: Transforming Learning in Nigeria</w:t>
+      </w:r>
+      <w:r>
+        <w:t>, 2024/2025. — Randomisierter Pilot in Edo State, ca. 800 Schülerinnen und Schüler, sechs Wochen Nachmittagsunterricht in Englisch mit GPT-4/Copilot als Tutor; Lernzuwachs von der Weltbank mit etwa zwei Jahren regulärer Schulbildung verglichen, ca. 48 USD pro Schüler:in. Einschränkungen (kleiner Pilot, kurze Dauer, offene Skalierbarkeit) sind im Text genannt. → QUELLEN.md Nr. 65.</w:t>
+      </w:r>
+    </w:p>
+    <w:p>
+      <w:pPr>
+        <w:pStyle w:val="Anmerkung"/>
+      </w:pPr>
+      <w:r>
+        <w:rPr>
+          <w:i/>
+        </w:rPr>
+        <w:t>Nicht belegt und daher im Text ausdrücklich als Erfahrung, Angewohnheit oder Haltung des Autors gekennzeichnet:</w:t>
+      </w:r>
+      <w:r>
+        <w:t xml:space="preserve"> die Flur-Szene nach dem Workshop; sämtliche Projektszenen (der Ausnahmen-Workshop zum leeren Feld, der Schattenbetrieb, die Rückfrage nach zurückgeschickten Fällen, die Excel-Liste in der Abteilung); die Grenze beim Übersetzen von Amtsbriefen für die eigene Mutter; die Warnsignale für plausible Falschantworten, die Konsistenzprobe und die Fangfrage; die Beobachtung, dass in Workshops eher echtes Material für generiert erklärt wird als umgekehrt; das Familien-Codewort gegen Stimmfälschungen; sämtliche Empfehlungen an Organisationen und an Jugendliche.</w:t>
+      </w:r>
+    </w:p>
+    <w:p>
+      <w:pPr>
+        <w:pStyle w:val="Zwischen"/>
+      </w:pPr>
+      <w:r>
+        <w:t>Kapitel 12 — Wovor wir uns wirklich fürchten sollten</w:t>
+      </w:r>
+    </w:p>
+    <w:p>
+      <w:pPr>
+        <w:pStyle w:val="Anmerkung"/>
+      </w:pPr>
+      <w:r>
+        <w:t xml:space="preserve">[1] Bengio, Y. u. a. (Expert Panel): </w:t>
+      </w:r>
+      <w:r>
+        <w:rPr>
+          <w:i/>
+        </w:rPr>
+        <w:t>International AI Safety Report 2025</w:t>
+      </w:r>
+      <w:r>
+        <w:t>, Januar 2025, arXiv:2501.17805 / internationalaisafetyreport.org. — Rund 96 Fachleute, Vorsitz Bengio, getragen von 30 Ländern sowie EU/OECD/UN; breiter Konsens, dass heutige universelle KI kein Kontrollverlust-Risiko darstellt; Experteneinschätzungen zur nahen Zukunft divergieren stark („implausibel" bis „wahrscheinlich"); der Bericht legt bewusst keine gesicherten Positionen vor, wo kein Konsens besteht. → QUELLEN.md Nr. 73, 101.</w:t>
+      </w:r>
+    </w:p>
+    <w:p>
+      <w:pPr>
+        <w:pStyle w:val="Anmerkung"/>
+      </w:pPr>
+      <w:r>
+        <w:t xml:space="preserve">[2] IEA: </w:t>
+      </w:r>
+      <w:r>
+        <w:rPr>
+          <w:i/>
+        </w:rPr>
+        <w:t>Energy and AI</w:t>
+      </w:r>
+      <w:r>
+        <w:t>, April 2025. — Rechenzentren 2024: ca. 415 TWh / ca. 1,5 % des globalen Stromverbrauchs; Wachstum ca. 12 % p. a. seit 2017; Base Case ca. 945 TWh bis 2030 (knapp 3 %); Strombedarf KI-optimierter Rechenzentren bis 2030 mehr als vervierfacht. → QUELLEN.md Nr. 86.</w:t>
+      </w:r>
+    </w:p>
+    <w:p>
+      <w:pPr>
+        <w:pStyle w:val="Anmerkung"/>
+      </w:pPr>
+      <w:r>
+        <w:t xml:space="preserve">[3] VO (EU) 2024/1689 (EU AI Act), Art. 99 und Art. 113; EU-Kommission, AI Act Service Desk, </w:t>
+      </w:r>
+      <w:r>
+        <w:rPr>
+          <w:i/>
+        </w:rPr>
+        <w:t>Implementation Timeline</w:t>
+      </w:r>
+      <w:r>
+        <w:t xml:space="preserve">. — In Kraft 1.8.2024; Verbote 2.2.2025; Pflichten für GPAI-Modelle 2.8.2025; Hochrisiko/Transparenz 2.8.2026; volle Anwendbarkeit 2.8.2027; Bußgelder bis 35 Mio. € oder 7 % des weltweiten Jahresumsatzes. → QUELLEN.md Nr. 84. — </w:t>
+      </w:r>
+      <w:r>
+        <w:rPr>
+          <w:i/>
+        </w:rPr>
+        <w:t>Der Inhalt der GPAI-Pflichten wird im Text bewusst nicht referiert; belegt ist hier nur die Existenz der Kategorie und ihr Anwendungsdatum. Die Deutung „eigene Kategorie = Nadelöhr" ist als Deutung des Autors gekennzeichnet.</w:t>
+      </w:r>
+    </w:p>
+    <w:p>
+      <w:pPr>
+        <w:pStyle w:val="Anmerkung"/>
+      </w:pPr>
+      <w:r>
+        <w:t xml:space="preserve">[4] ▲ Stanford HAI: </w:t>
+      </w:r>
+      <w:r>
+        <w:rPr>
+          <w:i/>
+        </w:rPr>
+        <w:t>AI Index Report</w:t>
+      </w:r>
+      <w:r>
+        <w:t xml:space="preserve">, Kapitel „Economy", 2025/2026. — Organisationale KI-Adoption 2024 ca. 78 % gegenüber 55 % im Vorjahr. → QUELLEN.md Nr. 72. </w:t>
+      </w:r>
+      <w:r>
+        <w:rPr>
+          <w:b/>
+        </w:rPr>
+        <w:t>Adoptionswert und Bezugsjahr vor Drucklegung direkt am AI-Index-Kapitel verifizieren.</w:t>
+      </w:r>
+    </w:p>
+    <w:p>
+      <w:pPr>
+        <w:pStyle w:val="Anmerkung"/>
+      </w:pPr>
+      <w:r>
+        <w:t>[5] ▲ Rückverweis auf Kapitel 1 (Zensurbehörden, Druckprivilegien, Index der verbotenen Bücher als unmittelbare Machtreaktion auf den Buchdruck). — *</w:t>
+      </w:r>
+      <w:r>
+        <w:rPr>
+          <w:i/>
+        </w:rPr>
+        <w:t xml:space="preserve">Diese Angabe ist in Kapitel 1 ohne Einzelbeleg dargestellt; vor Drucklegung mit fachhistorischer Standardliteratur zur frühneuzeitlichen Zensur und zum </w:t>
+      </w:r>
+      <w:r>
+        <w:t>Index Librorum Prohibitorum</w:t>
+      </w:r>
+      <w:r>
+        <w:rPr>
+          <w:i/>
+        </w:rPr>
+        <w:t xml:space="preserve"> zu unterlegen. Das gilt ausdrücklich auch für die in diesem Kapitel ergänzte Bestimmung des Druckprivilegs als verliehenes Monopol in der Hand derselben Instanz, die über die Zulässigkeit von Inhalten entschied.</w:t>
+      </w:r>
+      <w:r>
+        <w:rPr>
+          <w:i/>
+        </w:rPr>
+      </w:r>
+    </w:p>
+    <w:p>
+      <w:pPr>
+        <w:pStyle w:val="Anmerkung"/>
+      </w:pPr>
+      <w:r>
+        <w:t>[6] Zum „Stromkrieg": Edisons Angstkampagne gegen Wechselstrom, öffentliche Tier-Elektrokutionen, „to be Westinghoused"; erste Hinrichtung auf dem elektrischen Stuhl (William Kemmler) am 6.8.1890 mit Wechselstrom; Westinghouse finanzierte Kemmlers Berufungsverfahren (Anwalt W. Bourke Cockran); Wendepunkte Weltausstellung Chicago 1893 und Niagara-Kraftwerk ab 1895. Ausführlich in Kapitel 2. → QUELLEN.md Nr. 9, 10, 11.</w:t>
+      </w:r>
+    </w:p>
+    <w:p>
+      <w:pPr>
+        <w:pStyle w:val="Anmerkung"/>
+      </w:pPr>
+      <w:r>
+        <w:t xml:space="preserve">[7] Bender, E. M.; Gebru, T.; McMillan-Major, A.; „Shmargaret Shmitchell" (M. Mitchell): </w:t>
+      </w:r>
+      <w:r>
+        <w:rPr>
+          <w:i/>
+        </w:rPr>
+        <w:t>On the Dangers of Stochastic Parrots: Can Language Models Be Too Big?</w:t>
+      </w:r>
+      <w:r>
+        <w:t xml:space="preserve"> FAccT '21, ACM, März 2021, DOI 10.1145/3442188.3445922. — Begriff „stochastische Papageien"; benannte Risiken u. a. Bias, Umwelt-/Ressourcenkosten und Verdrängung kritischer Forschung. → QUELLEN.md Nr. 104.</w:t>
+      </w:r>
+    </w:p>
+    <w:p>
+      <w:pPr>
+        <w:pStyle w:val="Anmerkung"/>
+      </w:pPr>
+      <w:r>
+        <w:t xml:space="preserve">[8] Timnit Gebru: Abgang/Entlassung bei Google, 2. Dezember 2020, im Streit um das Stochastic-Parrots-Papier; Margaret Mitchell rund zwei Monate später entlassen (MIT Technology Review, 4.12.2020). → QUELLEN.md Nr. 105. — </w:t>
+      </w:r>
+      <w:r>
+        <w:rPr>
+          <w:i/>
+        </w:rPr>
+        <w:t>Die Umstände werden von den Beteiligten unterschiedlich dargestellt; im Text ist nur der unstrittige Ablauf wiedergegeben.</w:t>
+      </w:r>
+    </w:p>
+    <w:p>
+      <w:pPr>
+        <w:pStyle w:val="Anmerkung"/>
+      </w:pPr>
+      <w:r>
+        <w:t xml:space="preserve">[9] Gmyrek, P.; Berg, J. u. a. (ILO/NASK): </w:t>
+      </w:r>
+      <w:r>
+        <w:rPr>
+          <w:i/>
+        </w:rPr>
+        <w:t>Generative AI and Jobs: A Refined Global Index of Occupational Exposure</w:t>
+      </w:r>
+      <w:r>
+        <w:t>, ILO Working Paper 140, 20.5.2025. — Ca. jeder vierte Beschäftigte weltweit exponiert; Transformation statt Ersatz; 34 % der Beschäftigung in Hocheinkommens- vs. 11 % in Niedrigeinkommensländern; höchste Expositionskategorie 3,3 % weltweit, davon Frauen 4,7 % vs. Männer 2,4 %. → QUELLEN.md Nr. 61.</w:t>
+      </w:r>
+    </w:p>
+    <w:p>
+      <w:pPr>
+        <w:pStyle w:val="Anmerkung"/>
+      </w:pPr>
+      <w:r>
+        <w:t xml:space="preserve">[10] Cazzaniga, M. u. a. (IWF): </w:t>
+      </w:r>
+      <w:r>
+        <w:rPr>
+          <w:i/>
+        </w:rPr>
+        <w:t>Gen-AI: Artificial Intelligence and the Future of Work</w:t>
+      </w:r>
+      <w:r>
+        <w:t>, Januar 2024. — Ca. 40 % der Jobs weltweit exponiert; fortgeschrittene Volkswirtschaften ca. 60 %, Niedrigeinkommensländer ca. 26 %; ausdrückliche Warnung vor wachsender Ungleichheit. → QUELLEN.md Nr. 62.</w:t>
+      </w:r>
+    </w:p>
+    <w:p>
+      <w:pPr>
+        <w:pStyle w:val="Anmerkung"/>
+      </w:pPr>
+      <w:r>
+        <w:t xml:space="preserve">[11] Brynjolfsson, E.; Chandar, B.; Chen, R. (Stanford Digital Economy Lab): </w:t>
+      </w:r>
+      <w:r>
+        <w:rPr>
+          <w:i/>
+        </w:rPr>
+        <w:t>Canaries in the Coal Mine? Six Facts about the Recent Employment Effects of Artificial Intelligence</w:t>
+      </w:r>
+      <w:r>
+        <w:t xml:space="preserve">, 2025. — ADP-Lohndaten von über 25 Mio. Beschäftigten; relativer Beschäftigungsrückgang von ca. 13–16 % bei 22- bis 25-Jährigen in stark KI-exponierten Berufen; Effekt konzentriert auf automatisierende, nicht augmentierende Anwendungen. → QUELLEN.md Nr. 63. — </w:t>
+      </w:r>
+      <w:r>
+        <w:rPr>
+          <w:i/>
+        </w:rPr>
+        <w:t>Einschränkung (ein Land, ein Datensatz, kurzer Zeitraum) im Text genannt.</w:t>
+      </w:r>
+    </w:p>
+    <w:p>
+      <w:pPr>
+        <w:pStyle w:val="Anmerkung"/>
+      </w:pPr>
+      <w:r>
+        <w:t xml:space="preserve">[12] Erik Brynjolfsson: </w:t>
+      </w:r>
+      <w:r>
+        <w:rPr>
+          <w:i/>
+        </w:rPr>
+        <w:t>The Turing Trap: The Promise &amp; Peril of Human-Like Artificial Intelligence</w:t>
+      </w:r>
+      <w:r>
+        <w:t xml:space="preserve">, Dædalus 2022 / arXiv:2201.04200. — Automation senkt die Verhandlungsmacht Arbeitender und konzentriert den geschaffenen Wert; Augmentation lässt Menschen daran teilhaben; derzeitige Anreize begünstigen Automation. → QUELLEN.md Nr. 108. — </w:t>
+      </w:r>
+      <w:r>
+        <w:rPr>
+          <w:i/>
+        </w:rPr>
+        <w:t>Ökonomische Position, keine Messung; im Text als solche gekennzeichnet.</w:t>
+      </w:r>
+    </w:p>
+    <w:p>
+      <w:pPr>
+        <w:pStyle w:val="Anmerkung"/>
+      </w:pPr>
+      <w:r>
+        <w:t xml:space="preserve">[13] Zum Luddismus 1811–1816 (Strumpfwirker, </w:t>
+      </w:r>
+      <w:r>
+        <w:rPr>
+          <w:i/>
+        </w:rPr>
+        <w:t>wide frames</w:t>
+      </w:r>
+      <w:r>
+        <w:t xml:space="preserve">, billige „cut-ups", Lohnsenkungen, Umgehung des Lehrlingsrechts; selektive, disziplinierte Aktionen): Wikipedia (en) </w:t>
+      </w:r>
+      <w:r>
+        <w:rPr>
+          <w:i/>
+        </w:rPr>
+        <w:t>Luddite</w:t>
+      </w:r>
+      <w:r>
+        <w:t xml:space="preserve">; Nottinghamshire Heritage Gateway, </w:t>
+      </w:r>
+      <w:r>
+        <w:rPr>
+          <w:i/>
+        </w:rPr>
+        <w:t>Luddites — Overview</w:t>
+      </w:r>
+      <w:r>
+        <w:t xml:space="preserve">; Richard Conniff: </w:t>
+      </w:r>
+      <w:r>
+        <w:rPr>
+          <w:i/>
+        </w:rPr>
+        <w:t>What the Luddites Really Fought Against</w:t>
+      </w:r>
+      <w:r>
+        <w:t>, Smithsonian Magazine, März 2011. Ausführlich in Kapitel 4. → QUELLEN.md Nr. 44, 45.</w:t>
+      </w:r>
+    </w:p>
+    <w:p>
+      <w:pPr>
+        <w:pStyle w:val="Anmerkung"/>
+      </w:pPr>
+      <w:r>
+        <w:t xml:space="preserve">[14] UK Government / Intellectual Property Office: </w:t>
+      </w:r>
+      <w:r>
+        <w:rPr>
+          <w:i/>
+        </w:rPr>
+        <w:t>Report on Copyright and Artificial Intelligence</w:t>
+      </w:r>
+      <w:r>
+        <w:t>, 2025 (Konsultation 17.12.2024–25.02.2025, über 11.500 Antworten). — Die zunächst bevorzugte TDM-Ausnahme mit Opt-out wurde nach Widerstand der Kreativwirtschaft fallengelassen; es gibt keine bevorzugte Option mehr. → QUELLEN.md Nr. 70.</w:t>
+      </w:r>
+    </w:p>
+    <w:p>
+      <w:pPr>
+        <w:pStyle w:val="Anmerkung"/>
+      </w:pPr>
+      <w:r>
+        <w:t xml:space="preserve">[15] Lee, H.-P. u. a. (Microsoft Research / Carnegie Mellon): </w:t>
+      </w:r>
+      <w:r>
+        <w:rPr>
+          <w:i/>
+        </w:rPr>
+        <w:t>The Impact of Generative AI on Critical Thinking</w:t>
+      </w:r>
+      <w:r>
+        <w:t xml:space="preserve">, CHI 2025, DOI 10.1145/3706598.3713778. — Befragung von 319 Berufstätigen zu 936 realen Anwendungsfällen; höheres Vertrauen in die KI korreliert mit weniger berichtetem kritischem Denken, höheres Selbstvertrauen mit mehr. → QUELLEN.md Nr. 67. — </w:t>
+      </w:r>
+      <w:r>
+        <w:rPr>
+          <w:i/>
+        </w:rPr>
+        <w:t>Selbstauskünfte, keine Leistungsmessung.</w:t>
+      </w:r>
+    </w:p>
+    <w:p>
+      <w:pPr>
+        <w:pStyle w:val="Anmerkung"/>
+      </w:pPr>
+      <w:r>
+        <w:t xml:space="preserve">[16] ▲ Kosmyna, N. u. a. (MIT Media Lab): </w:t>
+      </w:r>
+      <w:r>
+        <w:rPr>
+          <w:i/>
+        </w:rPr>
+        <w:t>Your Brain on ChatGPT: Accumulation of Cognitive Debt…</w:t>
+      </w:r>
+      <w:r>
+        <w:t xml:space="preserve">, 2025, arXiv:2506.08872. — EEG-Studie, n = 54; schwächste neuronale Konnektivität bei LLM-Nutzung; Begriff „cognitive debt". </w:t>
+      </w:r>
+      <w:r>
+        <w:rPr>
+          <w:b/>
+        </w:rPr>
+        <w:t>Preprint, kleine Stichprobe, methodische Kritik in einem Folge-Kommentar; im Text ausdrücklich als Hinweis, nicht als Beleg gekennzeichnet.</w:t>
+      </w:r>
+      <w:r>
+        <w:t xml:space="preserve"> → QUELLEN.md Nr. 66.</w:t>
+      </w:r>
+    </w:p>
+    <w:p>
+      <w:pPr>
+        <w:pStyle w:val="Anmerkung"/>
+      </w:pPr>
+      <w:r>
+        <w:t xml:space="preserve">[17] ▲ Platon: </w:t>
+      </w:r>
+      <w:r>
+        <w:rPr>
+          <w:i/>
+        </w:rPr>
+        <w:t>Phaidros</w:t>
+      </w:r>
+      <w:r>
+        <w:t xml:space="preserve"> 274c–275b (Theuth und Thamus; die Schrift mache „scheinbar weise statt weise"). Ausführlich in Kapitel 1. → QUELLEN.md Nr. 111. </w:t>
+      </w:r>
+      <w:r>
+        <w:rPr>
+          <w:b/>
+        </w:rPr>
+        <w:t>Deutsche Übersetzung und Stellenangabe vor Drucklegung festlegen; im Text Paraphrase, kein Wortzitat.</w:t>
+      </w:r>
+    </w:p>
+    <w:p>
+      <w:pPr>
+        <w:pStyle w:val="Anmerkung"/>
+      </w:pPr>
+      <w:r>
+        <w:t xml:space="preserve">[18] David Collingridge: </w:t>
+      </w:r>
+      <w:r>
+        <w:rPr>
+          <w:i/>
+        </w:rPr>
+        <w:t>The Social Control of Technology</w:t>
+      </w:r>
+      <w:r>
+        <w:t>, 1980. — Steuerungsdilemma (Informationsproblem vs. Machtproblem); Gegenrezepte: Optionen offenhalten, revidierbar und modular bauen, Feedback einbauen. Ausführlich in Kapitel 4. → QUELLEN.md Nr. 51.</w:t>
+      </w:r>
+    </w:p>
+    <w:p>
+      <w:pPr>
+        <w:pStyle w:val="Anmerkung"/>
+      </w:pPr>
+      <w:r>
+        <w:t xml:space="preserve">[19] OpenResearch: </w:t>
+      </w:r>
+      <w:r>
+        <w:rPr>
+          <w:i/>
+        </w:rPr>
+        <w:t>Unconditional Cash Study</w:t>
+      </w:r>
+      <w:r>
+        <w:t xml:space="preserve">, Ergebnisse veröffentlicht 21.7.2024. — 1.000 Teilnehmende erhielten über drei Jahre 1.000 USD/Monat (Kontrollgruppe 50 USD); mehr Handlungsfähigkeit (Gründungen, Bildung, Vorsorge, medizinische Versorgung), nur geringer Effekt auf die Arbeitszeit. → QUELLEN.md Nr. 109. — </w:t>
+      </w:r>
+      <w:r>
+        <w:rPr>
+          <w:i/>
+        </w:rPr>
+        <w:t>Belegt UBI-Effekte, nicht die These „KI zerstört die Arbeit"; im Text so gekennzeichnet.</w:t>
+      </w:r>
+    </w:p>
+    <w:p>
+      <w:pPr>
+        <w:pStyle w:val="Anmerkung"/>
+      </w:pPr>
+      <w:r>
+        <w:t xml:space="preserve">[20] OECD: </w:t>
+      </w:r>
+      <w:r>
+        <w:rPr>
+          <w:i/>
+        </w:rPr>
+        <w:t>Employment Outlook 2025</w:t>
+      </w:r>
+      <w:r>
+        <w:t>. — Bislang wenig Belege für KI-bedingte Jobverluste; zwei Drittel der bereits mit KI arbeitenden Beschäftigten empfinden ihre Arbeit als weniger monoton oder gefährlich. → QUELLEN.md Nr. 59.</w:t>
+      </w:r>
+    </w:p>
+    <w:p>
+      <w:pPr>
+        <w:pStyle w:val="Anmerkung"/>
+      </w:pPr>
+      <w:r>
+        <w:t xml:space="preserve">[21] ▲ </w:t>
+      </w:r>
+      <w:r>
+        <w:rPr>
+          <w:i/>
+        </w:rPr>
+        <w:t>International AI Safety Report 2025</w:t>
+      </w:r>
+      <w:r>
+        <w:t xml:space="preserve"> (Bengio u. a.) sowie Berichterstattung zu den Fortschreibungen 2025/2026. — Belegte Missbrauchsrisiken: Erleichterung und Beschleunigung von Cyberangriffen mit demonstrierten Fähigkeiten bei Aufgaben geringer und mittlerer Komplexität; im Bereich Bio/Chemie „einige Fähigkeit" bei Anleitung und Fehlerbehebung zu bekannten Waffen; 2025 veröffentlichten mehrere Anbieter Modelle bewusst mit zusätzlichen Sicherheitsvorkehrungen, weil Tests vor der Veröffentlichung eine substanzielle Hilfe für Laien nicht ausschließen konnten. → QUELLEN.md Nr. 73, 74. </w:t>
+      </w:r>
+      <w:r>
+        <w:rPr>
+          <w:b/>
+        </w:rPr>
+        <w:t>Die Angabe zu den Zusatz-Safeguards 2025 stammt aus der Berichterstattung über die Fortschreibungen; vor Drucklegung am Originalbericht verifizieren.</w:t>
+      </w:r>
+    </w:p>
+    <w:p>
+      <w:pPr>
+        <w:pStyle w:val="Anmerkung"/>
+      </w:pPr>
+      <w:r>
+        <w:t xml:space="preserve">[22] </w:t>
+      </w:r>
+      <w:r>
+        <w:rPr>
+          <w:i/>
+        </w:rPr>
+        <w:t>International AI Safety Report 2025 — Second Key Update: Technical Safeguards and Risk Management</w:t>
+      </w:r>
+      <w:r>
+        <w:t xml:space="preserve">, arXiv:2511.19863. — Zahl der Unternehmen mit veröffentlichten Frontier-AI-Safety-Frameworks seit Anfang 2025 mehr als verdoppelt; zugleich „significant gaps remain". → QUELLEN.md Nr. 74. — </w:t>
+      </w:r>
+      <w:r>
+        <w:rPr>
+          <w:i/>
+        </w:rPr>
+        <w:t>Die Einordnung als Selbstverpflichtung aus demselben Haus ist eine Wertung des Autors.</w:t>
+      </w:r>
+    </w:p>
+    <w:p>
+      <w:pPr>
+        <w:pStyle w:val="Anmerkung"/>
+      </w:pPr>
+      <w:r>
+        <w:t xml:space="preserve">[23] ▲ IEA: </w:t>
+      </w:r>
+      <w:r>
+        <w:rPr>
+          <w:i/>
+        </w:rPr>
+        <w:t>Energy and AI</w:t>
+      </w:r>
+      <w:r>
+        <w:t xml:space="preserve"> (April 2025) sowie IEA-Meldung zum Jahr 2025 („Data centre electricity use surged in 2025"). — Stromverbrauch KI-fokussierter Rechenzentren 2025 um rund 50 % gestiegen; rund 1.200 TWh bis 2035; Erneuerbare decken knapp die Hälfte der Zusatznachfrage, dahinter Erdgas und Kohle, Kernkraft gegen Ende des Jahrzehnts; Energieverbrauch pro KI-Aufgabe sinkt in beispiellosem Tempo. → QUELLEN.md Nr. 86 und Nr. 119. </w:t>
+      </w:r>
+      <w:r>
+        <w:rPr>
+          <w:b/>
+        </w:rPr>
+        <w:t>2025er-Zuwachszahl und Energiequellen-Aufteilung vor Drucklegung an der IEA-Primärquelle gegenlesen.</w:t>
       </w:r>
       <w:r>
         <w:t xml:space="preserve"> — </w:t>
@@ -18937,7 +20745,7 @@
         <w:rPr>
           <w:i/>
         </w:rPr>
-        <w:t>Wortlaut und Finanzierungszahl vor Drucklegung an der Primärquelle prüfen; die Einschränkung „skalierbarer Prozess, nicht Endsieg über jede Krankheit" ist im Text mitgeführt. Die Aufzählung der nachgelagerten Entwicklungsphasen ist allgemeines Fachwissen der Arzneimittelentwicklung, keine Aussage von Hassabis.</w:t>
+        <w:t>Die Deutung des Ausbaus als Verhandlungsposition gegenüber Netzbetreibern, Kommunen und Regierungen ist eine Einschätzung des Autors.</w:t>
       </w:r>
     </w:p>
     <w:p>
@@ -18945,31 +20753,96 @@
         <w:pStyle w:val="Anmerkung"/>
       </w:pPr>
       <w:r>
-        <w:t xml:space="preserve">[3] Reid Hoffman &amp; Greg Beato: </w:t>
-      </w:r>
-      <w:r>
-        <w:rPr>
-          <w:i/>
-        </w:rPr>
-        <w:t>Superagency: What Could Possibly Go Right with Our AI Future</w:t>
-      </w:r>
-      <w:r>
-        <w:t xml:space="preserve">. Simon &amp; Schuster, 2025; „smart risk taking" als Selbstbeschreibung; kritische Rezeption u. a. Kirkus Reviews („poor arguments and little critical analysis"). → QUELLEN.md Nr. 93. </w:t>
+        <w:t xml:space="preserve">[24] European Data Protection Board: </w:t>
+      </w:r>
+      <w:r>
+        <w:rPr>
+          <w:i/>
+        </w:rPr>
+        <w:t>Opinion 28/2024</w:t>
+      </w:r>
+      <w:r>
+        <w:t xml:space="preserve"> (personenbezogene Daten im Kontext von KI-Modellen), 17.12.2024. — Anonymität im Einzelfall zu prüfen; berechtigtes Interesse nur nach dreistufigem Test; ursprünglich unrechtmäßige Verarbeitung kann die weitere Nutzung des Modells beeinträchtigen. → QUELLEN.md Nr. 85. — </w:t>
+      </w:r>
+      <w:r>
+        <w:rPr>
+          <w:i/>
+        </w:rPr>
+        <w:t>Die Folgerung, dass Rechtsrisiko als Fixkostenblock größere Anbieter begünstigt, ist als Lesart des Autors markiert.</w:t>
+      </w:r>
+    </w:p>
+    <w:p>
+      <w:pPr>
+        <w:pStyle w:val="Anmerkung"/>
+      </w:pPr>
+      <w:r>
+        <w:t xml:space="preserve">[25] Buolamwini, J.; Gebru, T.: </w:t>
+      </w:r>
+      <w:r>
+        <w:rPr>
+          <w:i/>
+        </w:rPr>
+        <w:t>Gender Shades: Intersectional Accuracy Disparities in Commercial Gender Classification</w:t>
+      </w:r>
+      <w:r>
+        <w:t>, PMLR / FAccT 2018. — Drei kommerzielle Systeme; Fehlerrate bei dunkelhäutigen Frauen bis 34,7 %, bei hellhäutigen Männern 0,8 %; Nachweis verzerrter Trainingsdatensätze; maßgeblicher Anstoß für die Debatte um repräsentative Daten. → QUELLEN.md Nr. 79.</w:t>
+      </w:r>
+    </w:p>
+    <w:p>
+      <w:pPr>
+        <w:pStyle w:val="Anmerkung"/>
+      </w:pPr>
+      <w:r>
+        <w:t xml:space="preserve">[26] Cazzaniga, M. u. a. (IWF): </w:t>
+      </w:r>
+      <w:r>
+        <w:rPr>
+          <w:i/>
+        </w:rPr>
+        <w:t>Gen-AI: Artificial Intelligence and the Future of Work</w:t>
+      </w:r>
+      <w:r>
+        <w:t>, Januar 2024. — Von den ca. 60 % exponierten Jobs in fortgeschrittenen Volkswirtschaften läuft etwa die Hälfte Gefahr sinkender Arbeitsnachfrage und Löhne. → QUELLEN.md Nr. 62.</w:t>
+      </w:r>
+    </w:p>
+    <w:p>
+      <w:pPr>
+        <w:pStyle w:val="Anmerkung"/>
+      </w:pPr>
+      <w:r>
+        <w:t xml:space="preserve">[27] OECD: </w:t>
+      </w:r>
+      <w:r>
+        <w:rPr>
+          <w:i/>
+        </w:rPr>
+        <w:t>Employment Outlook 2025</w:t>
+      </w:r>
+      <w:r>
+        <w:t>. — Berufe mit dem höchsten Automatisierungsrisiko machen 27 % der Beschäftigung im OECD-Raum aus. → QUELLEN.md Nr. 59.</w:t>
+      </w:r>
+    </w:p>
+    <w:p>
+      <w:pPr>
+        <w:pStyle w:val="Anmerkung"/>
+      </w:pPr>
+      <w:r>
+        <w:t xml:space="preserve">[28] ▲ IAB: </w:t>
+      </w:r>
+      <w:r>
+        <w:rPr>
+          <w:i/>
+        </w:rPr>
+        <w:t>KI und Arbeitsmarkt</w:t>
+      </w:r>
+      <w:r>
+        <w:t xml:space="preserve">, IAB-Forschungsbericht 2025. — Beschäftigungswachstum in Berufen mit hoher KI-Exposition +5,9 % gegenüber +2,5 % (geringe) und −1,7 % (ohne Exposition). → QUELLEN.md Nr. 58. </w:t>
       </w:r>
       <w:r>
         <w:rPr>
           <w:b/>
         </w:rPr>
-        <w:t>[Meinung]</w:t>
-      </w:r>
-      <w:r>
-        <w:t xml:space="preserve"> — </w:t>
-      </w:r>
-      <w:r>
-        <w:rPr>
-          <w:i/>
-        </w:rPr>
-        <w:t>Die Bemerkung zur prinzipiellen Prüfbarkeit der These ist im Text als Einschätzung des Autors gekennzeichnet.</w:t>
+        <w:t>Einzelwerte vor Drucklegung am Forschungsbericht verifizieren.</w:t>
       </w:r>
     </w:p>
     <w:p>
@@ -18977,22 +20850,22 @@
         <w:pStyle w:val="Anmerkung"/>
       </w:pPr>
       <w:r>
-        <w:t xml:space="preserve">[4] ▲ Andrew Ng: „AI is the new electricity" (seit ca. 2016); Position gegen die Existenzrisiko-Furcht, reale Existenzrisiken Pandemien/Klimawandel/Asteroiden (Äußerungen 2023). → QUELLEN.md Nr. 94. </w:t>
-      </w:r>
-      <w:r>
-        <w:rPr>
-          <w:b/>
-        </w:rPr>
-        <w:t>[Meinung]</w:t>
-      </w:r>
-      <w:r>
-        <w:t xml:space="preserve"> — </w:t>
-      </w:r>
-      <w:r>
-        <w:rPr>
-          <w:i/>
-        </w:rPr>
-        <w:t>Im Text bewusst paraphrasiert; das kursierende wörtliche Zitat liegt nur über Sekundärberichterstattung vor und wurde deshalb nicht als Zitat gesetzt.</w:t>
+        <w:t xml:space="preserve">[29] </w:t>
+      </w:r>
+      <w:r>
+        <w:rPr>
+          <w:i/>
+        </w:rPr>
+        <w:t>Destruction of Stocking Frames, etc. Act 1812</w:t>
+      </w:r>
+      <w:r>
+        <w:t xml:space="preserve"> („Frame Breaking Act", 52 Geo. 3 c. 16), königliche Bestätigung 20.3.1812 (Todesstrafe für das Zerstören von Strumpf- und Spitzenstühlen); Lord Byrons Antrittsrede im Oberhaus dagegen am 27.2.1812. Ausführlich in Kapitel 4. → QUELLEN.md Nr. 46. — </w:t>
+      </w:r>
+      <w:r>
+        <w:rPr>
+          <w:i/>
+        </w:rPr>
+        <w:t>Zu Zahl und Umfang der nachfolgenden Hinrichtungen wird wie in Kapitel 4 bewusst keine Angabe gemacht.</w:t>
       </w:r>
     </w:p>
     <w:p>
@@ -19000,1984 +20873,7 @@
         <w:pStyle w:val="Anmerkung"/>
       </w:pPr>
       <w:r>
-        <w:t xml:space="preserve">[5] Marc Andreessen: </w:t>
-      </w:r>
-      <w:r>
-        <w:rPr>
-          <w:i/>
-        </w:rPr>
-        <w:t>Why AI Will Save the World</w:t>
-      </w:r>
-      <w:r>
-        <w:t xml:space="preserve">. a16z, Juni 2023. — Einordnung der Existenzangst als „moral panic"; KI-Mentor für jedes Kind; Plädoyer für offene Märkte statt Regulierung. → QUELLEN.md Nr. 95. </w:t>
-      </w:r>
-      <w:r>
-        <w:rPr>
-          <w:b/>
-        </w:rPr>
-        <w:t>[Meinung]</w:t>
-      </w:r>
-    </w:p>
-    <w:p>
-      <w:pPr>
-        <w:pStyle w:val="Anmerkung"/>
-      </w:pPr>
-      <w:r>
-        <w:t xml:space="preserve">[6] ▲ Geoffrey Hinton: Austritt bei Google (Mai 2023) mit der Begründung, frei über die Gefahren sprechen zu können; Dezember 2024 Einschätzung „10–20 %" Auslöschungsrisiko binnen ca. 30 Jahren. Washington Post (2.5.2023), CNN, MIT Technology Review. → QUELLEN.md Nr. 98. </w:t>
-      </w:r>
-      <w:r>
-        <w:rPr>
-          <w:b/>
-        </w:rPr>
-        <w:t>[Meinung / Risikoeinschätzung]</w:t>
-      </w:r>
-      <w:r>
-        <w:t xml:space="preserve"> — </w:t>
-      </w:r>
-      <w:r>
-        <w:rPr>
-          <w:i/>
-        </w:rPr>
-        <w:t>Austrittsbegründung im Text paraphrasiert, nicht als Wortzitat; vor Drucklegung am Originalinterview verifizieren.</w:t>
-      </w:r>
-    </w:p>
-    <w:p>
-      <w:pPr>
-        <w:pStyle w:val="Anmerkung"/>
-      </w:pPr>
-      <w:r>
-        <w:t xml:space="preserve">[7] Geoffrey Hinton &amp; John Hopfield: Nobelpreis für Physik 2024. NobelPrize.org. → QUELLEN.md Nr. 99. </w:t>
-      </w:r>
-      <w:r>
-        <w:rPr>
-          <w:b/>
-        </w:rPr>
-        <w:t>[belegt]</w:t>
-      </w:r>
-    </w:p>
-    <w:p>
-      <w:pPr>
-        <w:pStyle w:val="Anmerkung"/>
-      </w:pPr>
-      <w:r>
-        <w:t xml:space="preserve">[8] Center for AI Safety: </w:t>
-      </w:r>
-      <w:r>
-        <w:rPr>
-          <w:i/>
-        </w:rPr>
-        <w:t>Statement on AI Risk</w:t>
-      </w:r>
-      <w:r>
-        <w:t xml:space="preserve">, 30. Mai 2023 (Ein-Satz-Statement); Unterzeichner u. a. Hinton, Bengio, Altman, Hassabis, Amodei, Gates. safe.ai. → QUELLEN.md Nr. 100. </w:t>
-      </w:r>
-      <w:r>
-        <w:rPr>
-          <w:b/>
-        </w:rPr>
-        <w:t>[belegt]</w:t>
-      </w:r>
-      <w:r>
-        <w:t xml:space="preserve"> — </w:t>
-      </w:r>
-      <w:r>
-        <w:rPr>
-          <w:i/>
-        </w:rPr>
-        <w:t>Der Statement-Satz ist im Text sinngemäß auf Deutsch wiedergegeben; englischer Originalwortlaut für die Druckfassung vorhalten. Die Deutung des Ein-Satz-Formats (niedrige Unterschriftskosten, geringe Handlungsfolge) ist im Text als Überlegung des Autors gehalten.</w:t>
-      </w:r>
-    </w:p>
-    <w:p>
-      <w:pPr>
-        <w:pStyle w:val="Anmerkung"/>
-      </w:pPr>
-      <w:r>
-        <w:t xml:space="preserve">[9] </w:t>
-      </w:r>
-      <w:r>
-        <w:rPr>
-          <w:i/>
-        </w:rPr>
-        <w:t>International AI Safety Report</w:t>
-      </w:r>
-      <w:r>
-        <w:t xml:space="preserve">, Vorsitz Yoshua Bengio, 29. Januar 2025; ca. 100 Fachleute, Beirat aus 30 Ländern sowie UN/EU/OECD; ausdrücklich ohne Politikempfehlungen. → QUELLEN.md Nr. 101 (= Nr. 73). </w:t>
-      </w:r>
-      <w:r>
-        <w:rPr>
-          <w:b/>
-        </w:rPr>
-        <w:t>[belegt]</w:t>
-      </w:r>
-    </w:p>
-    <w:p>
-      <w:pPr>
-        <w:pStyle w:val="Anmerkung"/>
-      </w:pPr>
-      <w:r>
-        <w:t xml:space="preserve">[10] Stuart Russell: </w:t>
-      </w:r>
-      <w:r>
-        <w:rPr>
-          <w:i/>
-        </w:rPr>
-        <w:t>Human Compatible: Artificial Intelligence and the Problem of Control</w:t>
-      </w:r>
-      <w:r>
-        <w:t xml:space="preserve">. Viking/Penguin, 2019. → QUELLEN.md Nr. 102. </w:t>
-      </w:r>
-      <w:r>
-        <w:rPr>
-          <w:b/>
-        </w:rPr>
-        <w:t>[Meinung / Forschungsprogramm]</w:t>
-      </w:r>
-    </w:p>
-    <w:p>
-      <w:pPr>
-        <w:pStyle w:val="Anmerkung"/>
-      </w:pPr>
-      <w:r>
-        <w:t xml:space="preserve">[11] ▲ Yann LeCun (Turing-Preisträger 2018, langjähriger Chief AI Scientist bei Meta): LLMs seien kein Weg zu menschenähnlicher Intelligenz; World-Model-Ansatz; eigene Gründung. Interviews/Vorträge 2023–2025. → QUELLEN.md Nr. 107. </w:t>
-      </w:r>
-      <w:r>
-        <w:rPr>
-          <w:b/>
-        </w:rPr>
-        <w:t>[Meinung / Forschungsthese]</w:t>
-      </w:r>
-      <w:r>
-        <w:t xml:space="preserve"> — </w:t>
-      </w:r>
-      <w:r>
-        <w:rPr>
-          <w:i/>
-        </w:rPr>
-        <w:t>Position im Text paraphrasiert; konkretes Zitat vor Drucklegung an einem Originalinterview verankern.</w:t>
-      </w:r>
-    </w:p>
-    <w:p>
-      <w:pPr>
-        <w:pStyle w:val="Anmerkung"/>
-      </w:pPr>
-      <w:r>
-        <w:t xml:space="preserve">[12] Gary Marcus: </w:t>
-      </w:r>
-      <w:r>
-        <w:rPr>
-          <w:i/>
-        </w:rPr>
-        <w:t>Deep Learning Is Hitting a Wall</w:t>
-      </w:r>
-      <w:r>
-        <w:t xml:space="preserve">. Nautilus, März 2022; Fortschreibung im Substack „Marcus on AI" (2024, „diminishing returns"). → QUELLEN.md Nr. 103. </w:t>
-      </w:r>
-      <w:r>
-        <w:rPr>
-          <w:b/>
-        </w:rPr>
-        <w:t>[Meinung / teils empirisch gestützt]</w:t>
-      </w:r>
-      <w:r>
-        <w:t xml:space="preserve"> — </w:t>
-      </w:r>
-      <w:r>
-        <w:rPr>
-          <w:i/>
-        </w:rPr>
-        <w:t>Der im Text angeschlossene Einwand (mehrfach fortgeschriebene These bei weiterhin steigender Leistungsfähigkeit) ist Wertung des Autors.</w:t>
-      </w:r>
-    </w:p>
-    <w:p>
-      <w:pPr>
-        <w:pStyle w:val="Anmerkung"/>
-      </w:pPr>
-      <w:r>
-        <w:t xml:space="preserve">[13] Emily M. Bender, Timnit Gebru, Angelina McMillan-Major, Margaret Mitchell (als „Shmargaret Shmitchell"): </w:t>
-      </w:r>
-      <w:r>
-        <w:rPr>
-          <w:i/>
-        </w:rPr>
-        <w:t>On the Dangers of Stochastic Parrots: Can Language Models Be Too Big?</w:t>
-      </w:r>
-      <w:r>
-        <w:t xml:space="preserve"> FAccT '21, ACM, März 2021, DOI 10.1145/3442188.3445922. → QUELLEN.md Nr. 104. </w:t>
-      </w:r>
-      <w:r>
-        <w:rPr>
-          <w:b/>
-        </w:rPr>
-        <w:t>[belegt]</w:t>
-      </w:r>
-      <w:r>
-        <w:t xml:space="preserve"> — </w:t>
-      </w:r>
-      <w:r>
-        <w:rPr>
-          <w:i/>
-        </w:rPr>
-        <w:t>Im Text sind nur die im Paper dokumentierten Risiken zugeschrieben; das Argument „Weltuntergangsdebatte lenkt von Gegenwartsschäden ab" ist ausdrücklich als strukturelles Argument bzw. Einschätzung des Autors gekennzeichnet und keiner Person als Zitat unterstellt.</w:t>
-      </w:r>
-    </w:p>
-    <w:p>
-      <w:pPr>
-        <w:pStyle w:val="Anmerkung"/>
-      </w:pPr>
-      <w:r>
-        <w:t xml:space="preserve">[14] Timnit Gebru: Abgang bei Google im Dezember 2020 im Streit um das Stochastic-Parrots-Paper; Margaret Mitchell rund zwei Monate später entlassen. MIT Technology Review (4.12.2020). → QUELLEN.md Nr. 105. </w:t>
-      </w:r>
-      <w:r>
-        <w:rPr>
-          <w:b/>
-        </w:rPr>
-        <w:t>[belegt]</w:t>
-      </w:r>
-    </w:p>
-    <w:p>
-      <w:pPr>
-        <w:pStyle w:val="Anmerkung"/>
-      </w:pPr>
-      <w:r>
-        <w:t xml:space="preserve">[15] Joy Buolamwini &amp; Timnit Gebru: </w:t>
-      </w:r>
-      <w:r>
-        <w:rPr>
-          <w:i/>
-        </w:rPr>
-        <w:t>Gender Shades</w:t>
-      </w:r>
-      <w:r>
-        <w:t xml:space="preserve">. PMLR / MIT Media Lab, 2018 — Fehlerraten bis 34,7 % gegenüber 0,8 % je nach Gruppe. Call-back auf Kapitel 8. → QUELLEN.md Nr. 79. </w:t>
-      </w:r>
-      <w:r>
-        <w:rPr>
-          <w:b/>
-        </w:rPr>
-        <w:t>[belegt]</w:t>
-      </w:r>
-    </w:p>
-    <w:p>
-      <w:pPr>
-        <w:pStyle w:val="Anmerkung"/>
-      </w:pPr>
-      <w:r>
-        <w:t xml:space="preserve">[16] Daniel Kokotajlo, Eli Lifland, Thomas Larsen, Romeo Dean (Red. Scott Alexander): </w:t>
-      </w:r>
-      <w:r>
-        <w:rPr>
-          <w:i/>
-        </w:rPr>
-        <w:t>AI 2027</w:t>
-      </w:r>
-      <w:r>
-        <w:t xml:space="preserve">. April 2025, ai-2027.com; von den Autoren ausdrücklich als hypothetisches Planungswerkzeug deklariert; Szenario mit zwei alternativen Ausgängen; spätere Verschiebung der AGI-Mediane (Kokotajlo ca. 2030; Lifland um ca. 3 Jahre). → QUELLEN.md Nr. 106. </w:t>
-      </w:r>
-      <w:r>
-        <w:rPr>
-          <w:b/>
-        </w:rPr>
-        <w:t>[Prognose / Szenario]</w:t>
-      </w:r>
-      <w:r>
-        <w:t xml:space="preserve"> — </w:t>
-      </w:r>
-      <w:r>
-        <w:rPr>
-          <w:i/>
-        </w:rPr>
-        <w:t>▲ Die Angabe der zwei Verzweigungen (Endungen des Szenarios) ist vor Drucklegung an ai-2027.com zu verifizieren.</w:t>
-      </w:r>
-    </w:p>
-    <w:p>
-      <w:pPr>
-        <w:pStyle w:val="Anmerkung"/>
-      </w:pPr>
-      <w:r>
-        <w:t xml:space="preserve">[17] Goldman Sachs Research (Joseph Briggs &amp; Devesh Kodnani): </w:t>
-      </w:r>
-      <w:r>
-        <w:rPr>
-          <w:i/>
-        </w:rPr>
-        <w:t>Generative AI Could Raise Global GDP by 7%</w:t>
-      </w:r>
-      <w:r>
-        <w:t xml:space="preserve">. 2023 — ca. 7 % globales BIP über 10 Jahre (≈ 7 Bio. USD), +1,5 Prozentpunkte Produktivitätswachstum; ca. zwei Drittel der US-Berufe exponiert, davon 25–50 % der Tätigkeiten automatisierbar. → QUELLEN.md Nr. 96. </w:t>
-      </w:r>
-      <w:r>
-        <w:rPr>
-          <w:b/>
-        </w:rPr>
-        <w:t>[Prognose]</w:t>
-      </w:r>
-    </w:p>
-    <w:p>
-      <w:pPr>
-        <w:pStyle w:val="Anmerkung"/>
-      </w:pPr>
-      <w:r>
-        <w:t xml:space="preserve">[18] McKinsey Global Institute / McKinsey Digital: </w:t>
-      </w:r>
-      <w:r>
-        <w:rPr>
-          <w:i/>
-        </w:rPr>
-        <w:t>The Economic Potential of Generative AI</w:t>
-      </w:r>
-      <w:r>
-        <w:t xml:space="preserve">. Juni 2023 — 2,6–4,4 Bio. USD jährlich über 63 Anwendungsfälle; ca. 75 % des Werts in vier Funktionen (Marketing/Vertrieb, Customer Operations, Software-Engineering, F&amp;E). → QUELLEN.md Nr. 97. </w:t>
-      </w:r>
-      <w:r>
-        <w:rPr>
-          <w:b/>
-        </w:rPr>
-        <w:t>[Prognose]</w:t>
-      </w:r>
-    </w:p>
-    <w:p>
-      <w:pPr>
-        <w:pStyle w:val="Anmerkung"/>
-      </w:pPr>
-      <w:r>
-        <w:t xml:space="preserve">[19] Daron Acemoglu: </w:t>
-      </w:r>
-      <w:r>
-        <w:rPr>
-          <w:i/>
-        </w:rPr>
-        <w:t>The Simple Macroeconomics of AI</w:t>
-      </w:r>
-      <w:r>
-        <w:t xml:space="preserve">. NBER Working Paper Nr. 32487, April 2024 — max. ca. 0,66 % TFP-Zuwachs über 10 Jahre; Annahmen ca. 20 % exponierte Tätigkeiten, davon ca. 23 % profitabel automatisierbar. Call-back auf Kapitel 6. → QUELLEN.md Nr. 110. </w:t>
-      </w:r>
-      <w:r>
-        <w:rPr>
-          <w:b/>
-        </w:rPr>
-        <w:t>[Prognose / Modellrechnung]</w:t>
-      </w:r>
-      <w:r>
-        <w:t xml:space="preserve"> — </w:t>
-      </w:r>
-      <w:r>
-        <w:rPr>
-          <w:i/>
-        </w:rPr>
-        <w:t>Die im Text angeschlossene Rechnung „drei multiplizierte Schätzungen" ist eine Veranschaulichung des Autors, keine Angabe der zitierten Studien.</w:t>
-      </w:r>
-    </w:p>
-    <w:p>
-      <w:pPr>
-        <w:pStyle w:val="Anmerkung"/>
-      </w:pPr>
-      <w:r>
-        <w:t xml:space="preserve">[20] ▲ Clifford Stoll: </w:t>
-      </w:r>
-      <w:r>
-        <w:rPr>
-          <w:i/>
-        </w:rPr>
-        <w:t>Why the Web Won't Be Nirvana</w:t>
-      </w:r>
-      <w:r>
-        <w:t xml:space="preserve">. Newsweek, 26./27. Februar 1995; spätere Selbstkorrektur (2010). Call-back auf Kapitel 5. → QUELLEN.md Nr. 35. </w:t>
-      </w:r>
-      <w:r>
-        <w:rPr>
-          <w:b/>
-        </w:rPr>
-        <w:t>[belegt als Fehlprognose]</w:t>
-      </w:r>
-      <w:r>
-        <w:t xml:space="preserve"> — </w:t>
-      </w:r>
-      <w:r>
-        <w:rPr>
-          <w:i/>
-        </w:rPr>
-        <w:t>Die drei Vorhersagen sind im Text sinngemäß wiedergegeben; englischer Originalwortlaut vor Drucklegung an der Newsweek-Fassung prüfen.</w:t>
-      </w:r>
-    </w:p>
-    <w:p>
-      <w:pPr>
-        <w:pStyle w:val="Anmerkung"/>
-      </w:pPr>
-      <w:r>
-        <w:t xml:space="preserve">[21] ▲ Roy Amara (Institute for the Future): Amara's Law — kurzfristige Über-, langfristige Unterschätzung technischer Wirkung; Datierung meist auf ca. 1978, Erstnennung unsicher. Call-back auf Kapitel 4. → QUELLEN.md Nr. 53. </w:t>
-      </w:r>
-      <w:r>
-        <w:rPr>
-          <w:b/>
-        </w:rPr>
-        <w:t>[belegt als Zuschreibung, Datierung unsicher]</w:t>
-      </w:r>
-    </w:p>
-    <w:p>
-      <w:pPr>
-        <w:pStyle w:val="Anmerkung"/>
-      </w:pPr>
-      <w:r>
-        <w:t xml:space="preserve">[22] Zur „bayerischen Ärztewarnung" als wahrscheinliche Legende: </w:t>
-      </w:r>
-      <w:r>
-        <w:rPr>
-          <w:i/>
-        </w:rPr>
-        <w:t>Eisenbahnkrankheit</w:t>
-      </w:r>
-      <w:r>
-        <w:t xml:space="preserve"> (Forschungsstand); W. K. Mück (Archiv-Negativbefund). Call-back auf Kapitel 2. → QUELLEN.md Nr. 5, 6. </w:t>
-      </w:r>
-      <w:r>
-        <w:rPr>
-          <w:b/>
-        </w:rPr>
-        <w:t>[belegt als Mythos]</w:t>
-      </w:r>
-    </w:p>
-    <w:p>
-      <w:pPr>
-        <w:pStyle w:val="Anmerkung"/>
-      </w:pPr>
-      <w:r>
-        <w:t xml:space="preserve">[23] ▲ Christian B. Anfinsen: Nobelpreis für Chemie 1972 (Arbeiten zur Ribonuklease); „Anfinsen-Dogma" — die Information für die native Faltung steckt in der Aminosäuresequenz. Cyrus Levinthal: </w:t>
-      </w:r>
-      <w:r>
-        <w:rPr>
-          <w:i/>
-        </w:rPr>
-        <w:t>How to Fold Graciously</w:t>
-      </w:r>
-      <w:r>
-        <w:t xml:space="preserve">, 1969 — Levinthal-Paradox: astronomische Zahl möglicher Konformationen gegenüber Faltungszeiten im Millisekundenbereich. NobelPrize.org; Standardliteratur der Strukturbiologie. → QUELLEN.md Nr. 119. </w:t>
-      </w:r>
-      <w:r>
-        <w:rPr>
-          <w:b/>
-        </w:rPr>
-        <w:t>[belegt]</w:t>
-      </w:r>
-      <w:r>
-        <w:t xml:space="preserve"> — </w:t>
-      </w:r>
-      <w:r>
-        <w:rPr>
-          <w:i/>
-        </w:rPr>
-        <w:t>Jahreszahlen, Preisbegründung und Formulierung des Levinthal-Arguments vor Drucklegung prüfen; keine Wortzitate im Text.</w:t>
-      </w:r>
-    </w:p>
-    <w:p>
-      <w:pPr>
-        <w:pStyle w:val="Anmerkung"/>
-      </w:pPr>
-      <w:r>
-        <w:t xml:space="preserve">[24] ▲ CASP — </w:t>
-      </w:r>
-      <w:r>
-        <w:rPr>
-          <w:i/>
-        </w:rPr>
-        <w:t>Critical Assessment of Structure Prediction</w:t>
-      </w:r>
-      <w:r>
-        <w:t xml:space="preserve">, initiiert 1994 von John Moult u. a., zweijährliche Blindprüfung; CASP13 (2018) erster AlphaFold-Sieg; CASP14 (2020) AlphaFold2 mit einem Median-GDT-Wert um 92, Schwellenbereich um 90 als experimentnahe Genauigkeit; Einordnung der Organisatoren, das Problem sei in wesentlichem Sinn gelöst. predictioncenter.org; Nature 2020. → QUELLEN.md Nr. 120. </w:t>
-      </w:r>
-      <w:r>
-        <w:rPr>
-          <w:b/>
-        </w:rPr>
-        <w:t>[belegt]</w:t>
-      </w:r>
-      <w:r>
-        <w:t xml:space="preserve"> — </w:t>
-      </w:r>
-      <w:r>
-        <w:rPr>
-          <w:i/>
-        </w:rPr>
-        <w:t>Medianwert, Metrik und die Aussage der Organisatoren am CASP14-Bericht verifizieren; im Text sinngemäß, ohne Wortzitat.</w:t>
-      </w:r>
-    </w:p>
-    <w:p>
-      <w:pPr>
-        <w:pStyle w:val="Anmerkung"/>
-      </w:pPr>
-      <w:r>
-        <w:t xml:space="preserve">[25] ▲ Protein Data Bank (seit 1971), Bestand zum Zeitpunkt von AlphaFold2 in der Größenordnung von 170.000 experimentell bestimmten Strukturen; AlphaFold2 in Nature, Juli 2021, samt Code; AlphaFold Protein Structure Database (DeepMind/EMBL-EBI), Start Juli 2021 mit Humanproteom und Modellorganismen, Ausbau Juli 2022 auf über 200 Mio. Vorhersagen. rcsb.org; alphafold.ebi.ac.uk. → QUELLEN.md Nr. 121. </w:t>
-      </w:r>
-      <w:r>
-        <w:rPr>
-          <w:b/>
-        </w:rPr>
-        <w:t>[belegt]</w:t>
-      </w:r>
-      <w:r>
-        <w:t xml:space="preserve"> — </w:t>
-      </w:r>
-      <w:r>
-        <w:rPr>
-          <w:i/>
-        </w:rPr>
-        <w:t>PDB-Bestandszahl und Ausbaudaten an den Betreiberangaben prüfen.</w:t>
-      </w:r>
-    </w:p>
-    <w:p>
-      <w:pPr>
-        <w:pStyle w:val="Anmerkung"/>
-      </w:pPr>
-      <w:r>
-        <w:t xml:space="preserve">[26] ▲ Grenzen der Strukturvorhersage: Konfidenzmaß pLDDT je Rest; niedrige Konfidenz bei intrinsisch ungeordneten Bereichen; keine Aussage über Faltungsweg und Dynamik; unzuverlässige Erfassung der Effekte einzelner Mutationen; Molekülkomplexe erst mit Nachfolgemodellen (AlphaFold-Multimer; AlphaFold3, Nature, Mai 2024). → QUELLEN.md Nr. 122. </w:t>
-      </w:r>
-      <w:r>
-        <w:rPr>
-          <w:b/>
-        </w:rPr>
-        <w:t>[belegt]</w:t>
-      </w:r>
-      <w:r>
-        <w:t xml:space="preserve"> — </w:t>
-      </w:r>
-      <w:r>
-        <w:rPr>
-          <w:i/>
-        </w:rPr>
-        <w:t>Einzelpunkte an der AlphaFold2/3-Primärliteratur belegen. Die Bemerkung, das Modell stehe auf den Daten der experimentellen Strukturbiologie, ist Überlegung des Autors.</w:t>
-      </w:r>
-    </w:p>
-    <w:p>
-      <w:pPr>
-        <w:pStyle w:val="Anmerkung"/>
-      </w:pPr>
-      <w:r>
-        <w:t xml:space="preserve">[27] ▲ Andrew Ng: Mitgründer von Coursera, Gründer von DeepLearning.AI. → QUELLEN.md Nr. 123. </w:t>
-      </w:r>
-      <w:r>
-        <w:rPr>
-          <w:b/>
-        </w:rPr>
-        <w:t>[belegt]</w:t>
-      </w:r>
-      <w:r>
-        <w:t xml:space="preserve"> — </w:t>
-      </w:r>
-      <w:r>
-        <w:rPr>
-          <w:i/>
-        </w:rPr>
-        <w:t>Im Text nur als Interessenlage angeführt, ausdrücklich ohne Entwertung seiner Argumente.</w:t>
-      </w:r>
-    </w:p>
-    <w:p>
-      <w:pPr>
-        <w:pStyle w:val="Anmerkung"/>
-      </w:pPr>
-      <w:r>
-        <w:t xml:space="preserve">[28] ▲ Bundeszentrale für politische Bildung, </w:t>
-      </w:r>
-      <w:r>
-        <w:rPr>
-          <w:i/>
-        </w:rPr>
-        <w:t>Aus Politik und Zeitgeschichte</w:t>
-      </w:r>
-      <w:r>
-        <w:t xml:space="preserve"> 7/1980: </w:t>
-      </w:r>
-      <w:r>
-        <w:rPr>
-          <w:i/>
-        </w:rPr>
-        <w:t>Mikroelektronik — die dritte industrielle Revolution</w:t>
-      </w:r>
-      <w:r>
-        <w:t xml:space="preserve">. — Zeitgenössische Debatte über technologisch verursachte Massenarbeitslosigkeit. Call-back auf Kapitel 5 und 6. → QUELLEN.md Nr. 30. </w:t>
-      </w:r>
-      <w:r>
-        <w:rPr>
-          <w:b/>
-        </w:rPr>
-        <w:t>[belegt als zeitgenössische Debatte]</w:t>
-      </w:r>
-      <w:r>
-        <w:t xml:space="preserve"> — </w:t>
-      </w:r>
-      <w:r>
-        <w:rPr>
-          <w:i/>
-        </w:rPr>
-        <w:t>Belegstelle prüfen; die Bewertung des Ausgangs ist im Text als Einordnung des Autors markiert.</w:t>
-      </w:r>
-    </w:p>
-    <w:p>
-      <w:pPr>
-        <w:pStyle w:val="Anmerkung"/>
-      </w:pPr>
-      <w:r>
-        <w:t xml:space="preserve">[29] Berkeley Roundtable on the International Economy (BRIE): </w:t>
-      </w:r>
-      <w:r>
-        <w:rPr>
-          <w:i/>
-        </w:rPr>
-        <w:t>Automation and the Future of Work in Germany</w:t>
-      </w:r>
-      <w:r>
-        <w:t xml:space="preserve">, 2022; ergänzend OECD: </w:t>
-      </w:r>
-      <w:r>
-        <w:rPr>
-          <w:i/>
-        </w:rPr>
-        <w:t>The Risk of Automation for Jobs in OECD Countries</w:t>
-      </w:r>
-      <w:r>
-        <w:t xml:space="preserve">, 2016. — Keine überdurchschnittlichen Jobverluste in hochautomatisierten deutschen Regionen; Produktivitätszuwächse eher mit regionalem Beschäftigungswachstum verbunden. Call-back auf Kapitel 5. → QUELLEN.md Nr. 31. </w:t>
-      </w:r>
-      <w:r>
-        <w:rPr>
-          <w:b/>
-        </w:rPr>
-        <w:t>[belegt]</w:t>
-      </w:r>
-    </w:p>
-    <w:p>
-      <w:pPr>
-        <w:pStyle w:val="Anmerkung"/>
-      </w:pPr>
-      <w:r>
-        <w:t xml:space="preserve">[30] De Simone, Martín; Tiberti, Federico u. a. (Weltbank): </w:t>
-      </w:r>
-      <w:r>
-        <w:rPr>
-          <w:i/>
-        </w:rPr>
-        <w:t>From Chalkboards to Chatbots: Transforming Learning in Nigeria</w:t>
-      </w:r>
-      <w:r>
-        <w:t xml:space="preserve">, 2024/25 — Edo-State-Pilot, ca. 800 Schüler:innen, 9 Schulen, 6 Wochen, randomisiert, GPT-4 über Microsoft Copilot als begleiteter Tutor; Lernzuwachs verglichen mit ca. zwei Jahren regulärer Schulbildung, ca. 48 USD pro Kind; Caveats in Kapitel 7 ausgeführt. Call-back auf Kapitel 7. → QUELLEN.md Nr. 65. </w:t>
-      </w:r>
-      <w:r>
-        <w:rPr>
-          <w:b/>
-        </w:rPr>
-        <w:t>[belegt]</w:t>
-      </w:r>
-      <w:r>
-        <w:t xml:space="preserve"> — </w:t>
-      </w:r>
-      <w:r>
-        <w:rPr>
-          <w:i/>
-        </w:rPr>
-        <w:t>Im Text als Prüfung der Andreessen-Behauptung verwendet, nicht als Bestätigung des Essays insgesamt.</w:t>
-      </w:r>
-    </w:p>
-    <w:p>
-      <w:pPr>
-        <w:pStyle w:val="Zwischen"/>
-      </w:pPr>
-      <w:r>
-        <w:t>Kapitel 10 — Was vom Menschen bleibt</w:t>
-      </w:r>
-    </w:p>
-    <w:p>
-      <w:pPr>
-        <w:pStyle w:val="Anmerkung"/>
-      </w:pPr>
-      <w:r>
-        <w:t xml:space="preserve">[1] Erik Brynjolfsson: </w:t>
-      </w:r>
-      <w:r>
-        <w:rPr>
-          <w:i/>
-        </w:rPr>
-        <w:t>The Turing Trap: The Promise &amp; Peril of Human-Like Artificial Intelligence</w:t>
-      </w:r>
-      <w:r>
-        <w:t>. Dædalus, Frühjahr 2022; auch arXiv:2201.04200. — Unterscheidung Automation/Augmentation; Verhandlungsmacht und Wertkonzentration bei Substitution; schiefe Anreizlage zugunsten von Automation. Ausdrücklich ökonomische Analyse und Position, keine Messung. → QUELLEN.md Nr. 108. ▲ *</w:t>
-      </w:r>
-      <w:r>
-        <w:rPr>
-          <w:i/>
-        </w:rPr>
-        <w:t>Der im Text erläuterte Bezug auf Turings Nachahmungsspiel als Namensgeber der „Falle" ist vor Drucklegung am Volltext des Papers zu verifizieren; ggf. Turing 1950 (</w:t>
-      </w:r>
-      <w:r>
-        <w:t>Computing Machinery and Intelligence</w:t>
-      </w:r>
-      <w:r>
-        <w:rPr>
-          <w:i/>
-        </w:rPr>
-        <w:t>) als eigene Quelle nachtragen.</w:t>
-      </w:r>
-      <w:r>
-        <w:rPr>
-          <w:i/>
-        </w:rPr>
-        <w:t xml:space="preserve"> — </w:t>
-      </w:r>
-      <w:r>
-        <w:t>Die vier Anreize im Abschnitt „Warum die Anreize in eine Richtung ziehen" und die vier Merkmale eines augmentierenden Entwurfs sind im Text als Beobachtung des Autors gekennzeichnet und werden Brynjolfsson nicht zugeschrieben.*</w:t>
-      </w:r>
-    </w:p>
-    <w:p>
-      <w:pPr>
-        <w:pStyle w:val="Anmerkung"/>
-      </w:pPr>
-      <w:r>
-        <w:t xml:space="preserve">[2] Erik Brynjolfsson, Bharat Chandar, Ruyu Chen (Stanford Digital Economy Lab): </w:t>
-      </w:r>
-      <w:r>
-        <w:rPr>
-          <w:i/>
-        </w:rPr>
-        <w:t>Canaries in the Coal Mine? Six Facts about the Recent Employment Effects of Artificial Intelligence</w:t>
-      </w:r>
-      <w:r>
-        <w:t xml:space="preserve">. 2025. ADP-Lohndaten von über 25 Mio. Beschäftigten. — Relativer Beschäftigungsrückgang ~13–16 % bei 22–25-Jährigen in stark KI-exponierten Berufen bei gleichzeitigem Zuwachs älterer Kohorten; Konzentration auf automatisierende statt augmentierende Anwendungen. → QUELLEN.md Nr. 63. ▲ </w:t>
-      </w:r>
-      <w:r>
-        <w:rPr>
-          <w:b/>
-        </w:rPr>
-        <w:t>Effektgrößen und die Automation/Augmentation-Aufschlüsselung vor Drucklegung am PDF gegenlesen; ebenso die Aussage zu den älteren Kohorten. Einschränkungen (ein Land, ein Datensatz, kurzer Zeitraum, konstruierte Expositions- und Anwendungsmaße) sind im Text gekennzeichnet.</w:t>
-      </w:r>
-    </w:p>
-    <w:p>
-      <w:pPr>
-        <w:pStyle w:val="Anmerkung"/>
-      </w:pPr>
-      <w:r>
-        <w:t xml:space="preserve">[3] Erik Brynjolfsson, Danielle Li, Lindsey Raymond: </w:t>
-      </w:r>
-      <w:r>
-        <w:rPr>
-          <w:i/>
-        </w:rPr>
-        <w:t>Generative AI at Work</w:t>
-      </w:r>
-      <w:r>
-        <w:t>. Quarterly Journal of Economics 140(2), 2025, S. 889–942. — ~15 % mehr gelöste Vorgänge pro Stunde bei 5.172 Kundendienst-Mitarbeitenden; größte Gewinne bei wenig erfahrenen und gering qualifizierten Kräften. → QUELLEN.md Nr. 55.</w:t>
-      </w:r>
-    </w:p>
-    <w:p>
-      <w:pPr>
-        <w:pStyle w:val="Anmerkung"/>
-      </w:pPr>
-      <w:r>
-        <w:t xml:space="preserve">[4] OECD: </w:t>
-      </w:r>
-      <w:r>
-        <w:rPr>
-          <w:i/>
-        </w:rPr>
-        <w:t>OECD Employment Outlook 2025</w:t>
-      </w:r>
-      <w:r>
-        <w:t>. OECD Publishing, 2025. — Bislang wenig Belege für KI-bedingte Jobverluste; zwei Drittel der KI-nutzenden Beschäftigten erleben die Arbeit als weniger monoton oder gefährlich. → QUELLEN.md Nr. 59.</w:t>
-      </w:r>
-    </w:p>
-    <w:p>
-      <w:pPr>
-        <w:pStyle w:val="Anmerkung"/>
-      </w:pPr>
-      <w:r>
-        <w:t xml:space="preserve">[5] METR: </w:t>
-      </w:r>
-      <w:r>
-        <w:rPr>
-          <w:i/>
-        </w:rPr>
-        <w:t>Measuring the Impact of Early-2025 AI on Experienced Open-Source Developer Productivity</w:t>
-      </w:r>
-      <w:r>
-        <w:t>. 2025; arXiv:2507.09089. — 16 erfahrene Entwickler:innen, RCT, 19 % längere Bearbeitungszeit mit KI bei gegenteiliger Selbsteinschätzung. → QUELLEN.md Nr. 64.</w:t>
-      </w:r>
-    </w:p>
-    <w:p>
-      <w:pPr>
-        <w:pStyle w:val="Anmerkung"/>
-      </w:pPr>
-      <w:r>
-        <w:t xml:space="preserve">[6] Anil R. Doshi, Oliver P. Hauser: </w:t>
-      </w:r>
-      <w:r>
-        <w:rPr>
-          <w:i/>
-        </w:rPr>
-        <w:t>Generative AI enhances individual creativity but reduces the collective diversity of novel content</w:t>
-      </w:r>
-      <w:r>
-        <w:t>. Science Advances 10(28), 2024, eadn5290, DOI 10.1126/sciadv.adn5290. — Rückverweis auf Kapitel 7. → QUELLEN.md Nr. 69.</w:t>
-      </w:r>
-    </w:p>
-    <w:p>
-      <w:pPr>
-        <w:pStyle w:val="Anmerkung"/>
-      </w:pPr>
-      <w:r>
-        <w:t xml:space="preserve">[7] Pawel Gmyrek, Janine Berg et al. (ILO/NASK): </w:t>
-      </w:r>
-      <w:r>
-        <w:rPr>
-          <w:i/>
-        </w:rPr>
-        <w:t>Generative AI and Jobs: A Refined Global Index of Occupational Exposure</w:t>
-      </w:r>
-      <w:r>
-        <w:t xml:space="preserve">. ILO Working Paper 140, Mai 2025. — ~1 von 4 Beschäftigten weltweit exponiert; 34 % (Hocheinkommen) vs. 11 % (Niedrigeinkommen); höchste Expositionsstufe 3,3 % der weltweiten Beschäftigung, Frauen 4,7 % vs. Männer 2,4 %; Transformation statt Ersatz. → QUELLEN.md Nr. 61. ▲ </w:t>
-      </w:r>
-      <w:r>
-        <w:rPr>
-          <w:b/>
-        </w:rPr>
-        <w:t>Die im Text angeschlossene Deutung („Exposition folgt der Bildschirmnähe, nicht dem Anspruch der Tätigkeit") ist als Lesart des Autors gekennzeichnet und keine Aussage der Studie.</w:t>
-      </w:r>
-    </w:p>
-    <w:p>
-      <w:pPr>
-        <w:pStyle w:val="Anmerkung"/>
-      </w:pPr>
-      <w:r>
-        <w:t xml:space="preserve">[8] Mauro Cazzaniga et al. (IWF): </w:t>
-      </w:r>
-      <w:r>
-        <w:rPr>
-          <w:i/>
-        </w:rPr>
-        <w:t>Gen-AI: Artificial Intelligence and the Future of Work</w:t>
-      </w:r>
-      <w:r>
-        <w:t>. IMF Staff Discussion Note, Januar 2024. — ~40 % der Jobs weltweit exponiert, ~60 % in fortgeschrittenen Volkswirtschaften, ~26 % in Niedrigeinkommensländern; ausdrückliche Warnung vor wachsender Ungleichheit. → QUELLEN.md Nr. 62.</w:t>
-      </w:r>
-    </w:p>
-    <w:p>
-      <w:pPr>
-        <w:pStyle w:val="Anmerkung"/>
-      </w:pPr>
-      <w:r>
-        <w:t xml:space="preserve">[9] OpenResearch: </w:t>
-      </w:r>
-      <w:r>
-        <w:rPr>
-          <w:i/>
-        </w:rPr>
-        <w:t>Unconditional Cash Study</w:t>
-      </w:r>
-      <w:r>
-        <w:t xml:space="preserve">, Ergebnisse veröffentlicht 21. Juli 2024; finanziell gestützt von Sam Altman. — 1.000 Teilnehmende, 1.000 USD/Monat über drei Jahre, Kontrollgruppe 50 USD; mehr Gründungen, Bildung, Vorsorge und medizinische Versorgung; geringer Effekt auf die Arbeitszeit (Größenordnung ~5 Std./Monat weniger Erwerbsarbeit). → QUELLEN.md Nr. 109. ▲ </w:t>
-      </w:r>
-      <w:r>
-        <w:rPr>
-          <w:b/>
-        </w:rPr>
-        <w:t>Genaue Effektgröße zur Arbeitszeit vor Drucklegung an der Originalveröffentlichung bestätigen.</w:t>
-      </w:r>
-      <w:r>
-        <w:t xml:space="preserve"> — </w:t>
-      </w:r>
-      <w:r>
-        <w:rPr>
-          <w:i/>
-        </w:rPr>
-        <w:t>Die im Text genannten Grenzen (Befristung auf drei Jahre, Stichprobengröße, Finanzierung von außen, US-Kontext der Gesundheitsversorgung) sind ausdrücklich als Einordnung des Autors gekennzeichnet, nicht als Aussagen der Studie.</w:t>
-      </w:r>
-    </w:p>
-    <w:p>
-      <w:pPr>
-        <w:pStyle w:val="Anmerkung"/>
-      </w:pPr>
-      <w:r>
-        <w:t xml:space="preserve">[10] Daron Acemoglu: </w:t>
-      </w:r>
-      <w:r>
-        <w:rPr>
-          <w:i/>
-        </w:rPr>
-        <w:t>The Simple Macroeconomics of AI</w:t>
-      </w:r>
-      <w:r>
-        <w:t>. NBER Working Paper Nr. 32487, April 2024. — Höchstens ~0,66 % zusätzliche TFP über zehn Jahre; ausdrücklich Modellrechnung/Prognose. → QUELLEN.md Nr. 110.</w:t>
-      </w:r>
-    </w:p>
-    <w:p>
-      <w:pPr>
-        <w:pStyle w:val="Anmerkung"/>
-      </w:pPr>
-      <w:r>
-        <w:t xml:space="preserve">[11] World Economic Forum: </w:t>
-      </w:r>
-      <w:r>
-        <w:rPr>
-          <w:i/>
-        </w:rPr>
-        <w:t>The Future of Jobs Report 2025</w:t>
-      </w:r>
-      <w:r>
-        <w:t>. 2025. — 170 Mio. neue, 92 Mio. wegfallende, netto +78 Mio. Stellen bis 2030; Basis ~1.000 Unternehmen in 55 Volkswirtschaften. Prognose auf Befragungsbasis. → QUELLEN.md Nr. 57.</w:t>
-      </w:r>
-    </w:p>
-    <w:p>
-      <w:pPr>
-        <w:pStyle w:val="Anmerkung"/>
-      </w:pPr>
-      <w:r>
-        <w:t xml:space="preserve">[12] IAB — Institut für Arbeitsmarkt- und Berufsforschung: </w:t>
-      </w:r>
-      <w:r>
-        <w:rPr>
-          <w:i/>
-        </w:rPr>
-        <w:t>KI und Arbeitsmarkt</w:t>
-      </w:r>
-      <w:r>
-        <w:t xml:space="preserve">, IAB-Forschungsbericht 2025. — Beschäftigungswachstum in stark KI-exponierten Berufen (+5,9 %) höher als in gering (+2,5 %) oder nicht exponierten (−1,7 %). → QUELLEN.md Nr. 58. ▲ </w:t>
-      </w:r>
-      <w:r>
-        <w:rPr>
-          <w:b/>
-        </w:rPr>
-        <w:t>Einzelzahlen vor Drucklegung direkt am IAB-Volltext prüfen.</w:t>
-      </w:r>
-    </w:p>
-    <w:p>
-      <w:pPr>
-        <w:pStyle w:val="Anmerkung"/>
-      </w:pPr>
-      <w:r>
-        <w:t xml:space="preserve">[13] OECD: </w:t>
-      </w:r>
-      <w:r>
-        <w:rPr>
-          <w:i/>
-        </w:rPr>
-        <w:t>OECD Employment Outlook 2023 — Artificial Intelligence and the Labour Market</w:t>
-      </w:r>
-      <w:r>
-        <w:t xml:space="preserve"> (Arbeitgeber- und Beschäftigten-Surveys 2022). — Lohnprämie für KI-spezifische Kompetenzen gegenüber vergleichbaren fortgeschrittenen Fähigkeiten. → QUELLEN.md Nr. 60.</w:t>
-      </w:r>
-    </w:p>
-    <w:p>
-      <w:pPr>
-        <w:pStyle w:val="Anmerkung"/>
-      </w:pPr>
-      <w:r>
-        <w:t xml:space="preserve">[14] Alan M. Turing: </w:t>
-      </w:r>
-      <w:r>
-        <w:rPr>
-          <w:i/>
-        </w:rPr>
-        <w:t>Computing Machinery and Intelligence</w:t>
-      </w:r>
-      <w:r>
-        <w:t xml:space="preserve">. Mind LIX (236), Oktober 1950, S. 433–460. — Ersetzung der Frage „Können Maschinen denken?" durch das Nachahmungsspiel (imitation game); Kommunikation ausschließlich über Fernschreiber; Prüfkriterium ist die Unterscheidbarkeit durch einen menschlichen Fragesteller. → QUELLEN.md Nr. 119. ▲ </w:t>
-      </w:r>
-      <w:r>
-        <w:rPr>
-          <w:b/>
-        </w:rPr>
-        <w:t>Im Text durchgehend paraphrasiert, kein Wortzitat. Aufbau des Spiels (Turings ursprüngliche Fassung mit Mann und Frau als Vorlage) und Seitenangabe vor Drucklegung am Originalaufsatz prüfen.</w:t>
-      </w:r>
-    </w:p>
-    <w:p>
-      <w:pPr>
-        <w:pStyle w:val="Zwischen"/>
-      </w:pPr>
-      <w:r>
-        <w:t>Kapitel 11 — Vertrauen ist eine Fähigkeit</w:t>
-      </w:r>
-    </w:p>
-    <w:p>
-      <w:pPr>
-        <w:pStyle w:val="Anmerkung"/>
-      </w:pPr>
-      <w:r>
-        <w:t xml:space="preserve">[1] Jeffrey Dastin (Reuters): </w:t>
-      </w:r>
-      <w:r>
-        <w:rPr>
-          <w:i/>
-        </w:rPr>
-        <w:t>Amazon scraps secret AI recruiting tool that showed bias against women</w:t>
-      </w:r>
-      <w:r>
-        <w:t>, Oktober 2018. — Training auf zehn Jahren überwiegend männlicher Bewerbungen; Abwertung von „women's" und reinen Frauen-Colleges; Projekt eingestellt. → QUELLEN.md Nr. 78.</w:t>
-      </w:r>
-    </w:p>
-    <w:p>
-      <w:pPr>
-        <w:pStyle w:val="Anmerkung"/>
-      </w:pPr>
-      <w:r>
-        <w:t>[2] Verordnung (EU) 2024/1689 (EU AI Act); Implementation Timeline des AI Act Service Desk der Europäischen Kommission. — Risikobasierter Ansatz mit vier Stufen; verbotene Praktiken nach Art. 5 (u. a. Social Scoring durch Behörden, ungezieltes Scraping von Gesichtsbildern, Emotionserkennung am Arbeitsplatz und in der Bildung) anwendbar seit 2.2.2025; Hochrisiko-Systeme nach Anhang III und Transparenzpflichten nach Art. 50 anwendbar seit 2.8.2026. → QUELLEN.md Nr. 84.</w:t>
-      </w:r>
-    </w:p>
-    <w:p>
-      <w:pPr>
-        <w:pStyle w:val="Anmerkung"/>
-      </w:pPr>
-      <w:r>
-        <w:t xml:space="preserve">[3] Gary Marcus: </w:t>
-      </w:r>
-      <w:r>
-        <w:rPr>
-          <w:i/>
-        </w:rPr>
-        <w:t>Deep Learning Is Hitting a Wall</w:t>
-      </w:r>
-      <w:r>
-        <w:t xml:space="preserve">, Nautilus 2022, fortgeführt im Substack „Marcus on AI" (2024). — Position: Halluzinationen und Reasoning-Schwächen lassen sich durch reines Hochskalieren nicht lösen. Im Text als Position gekennzeichnet, nicht als Konsens; die </w:t>
-      </w:r>
-      <w:r>
-        <w:rPr>
-          <w:i/>
-        </w:rPr>
-        <w:t>Existenz</w:t>
-      </w:r>
-      <w:r>
-        <w:t xml:space="preserve"> der Grenze (Halluzination) ist in der Recherchelage unstrittig, quantitative Fehlerraten werden im Text bewusst nicht genannt. → QUELLEN.md Nr. 103.</w:t>
-      </w:r>
-    </w:p>
-    <w:p>
-      <w:pPr>
-        <w:pStyle w:val="Anmerkung"/>
-      </w:pPr>
-      <w:r>
-        <w:t xml:space="preserve">[4] METR: </w:t>
-      </w:r>
-      <w:r>
-        <w:rPr>
-          <w:i/>
-        </w:rPr>
-        <w:t>Measuring the Impact of Early-2025 AI on Experienced Open-Source Developer Productivity</w:t>
-      </w:r>
-      <w:r>
-        <w:t>, 2025, arXiv:2507.09089; Update Februar 2026. — 16 erfahrene Entwickler:innen, RCT, 19 % langsamer bei gegenteiliger Selbsteinschätzung (~20 % schneller); Einschränkungen und das spätere METR-Update sind im Text genannt. → QUELLEN.md Nr. 64.</w:t>
-      </w:r>
-    </w:p>
-    <w:p>
-      <w:pPr>
-        <w:pStyle w:val="Anmerkung"/>
-      </w:pPr>
-      <w:r>
-        <w:t xml:space="preserve">[5] Hao-Ping Lee et al. (Microsoft Research / Carnegie Mellon): </w:t>
-      </w:r>
-      <w:r>
-        <w:rPr>
-          <w:i/>
-        </w:rPr>
-        <w:t>The Impact of Generative AI on Critical Thinking</w:t>
-      </w:r>
-      <w:r>
-        <w:t>, CHI 2025, DOI 10.1145/3706598.3713778. — 319 Berufstätige, 936 reale Anwendungsfälle; höheres Vertrauen in die KI korreliert mit weniger kritischem Denken, höheres Selbstvertrauen mit mehr. → QUELLEN.md Nr. 67.</w:t>
-      </w:r>
-    </w:p>
-    <w:p>
-      <w:pPr>
-        <w:pStyle w:val="Anmerkung"/>
-      </w:pPr>
-      <w:r>
-        <w:t xml:space="preserve">[6] Nataliya Kosmyna et al. (MIT Media Lab): </w:t>
-      </w:r>
-      <w:r>
-        <w:rPr>
-          <w:i/>
-        </w:rPr>
-        <w:t>Your Brain on ChatGPT: Accumulation of Cognitive Debt…</w:t>
-      </w:r>
-      <w:r>
-        <w:t>, 2025, arXiv:2506.08872. — EEG-Studie, n=54; schwächste neuronale Konnektivität bei LLM-Nutzung; Begriff „cognitive debt". Preprint, kleine Stichprobe, methodische Kritik in einem Folge-Kommentar — im Text ausdrücklich vermerkt. → QUELLEN.md Nr. 66.</w:t>
-      </w:r>
-    </w:p>
-    <w:p>
-      <w:pPr>
-        <w:pStyle w:val="Anmerkung"/>
-      </w:pPr>
-      <w:r>
-        <w:t xml:space="preserve">[7] Ray Hembree &amp; Donald J. Dessart: </w:t>
-      </w:r>
-      <w:r>
-        <w:rPr>
-          <w:i/>
-        </w:rPr>
-        <w:t>Effects of Hand-Held Calculators in Precollege Mathematics Education: A Meta-Analysis</w:t>
-      </w:r>
-      <w:r>
-        <w:t>, Journal for Research in Mathematics Education 17(2), 1986, S. 83–99. — Überwiegend neutrale bis positive Effekte über die Klassenstufen hinweg, mit Ausnahme der vierten Klasse. → QUELLEN.md Nr. 28.</w:t>
-      </w:r>
-    </w:p>
-    <w:p>
-      <w:pPr>
-        <w:pStyle w:val="Anmerkung"/>
-      </w:pPr>
-      <w:r>
-        <w:t xml:space="preserve">[8] Zusammenfassende Recherche zu KI-Desinformation in den Wahlen 2024–2025 (State of Surveillance / Recorded Future u. a.). — „Cheap fakes" deutlich häufiger als KI-Generate; dokumentierte Einzelfälle: KI-generierte Biden-Robocalls mit bis zu ca. 25.000 erreichten Wählern in New Hampshire, gefälschtes Kandidaten-Audio in der Slowakei, Annullierung der rumänischen Präsidentschaftswahl 2024; kausale Wirkung meist nicht quantifiziert. → QUELLEN.md Nr. 75. ▲ </w:t>
-      </w:r>
-      <w:r>
-        <w:rPr>
-          <w:b/>
-        </w:rPr>
-        <w:t>Einzelzahlen vor Drucklegung an Primärberichten prüfen.</w:t>
-      </w:r>
-    </w:p>
-    <w:p>
-      <w:pPr>
-        <w:pStyle w:val="Anmerkung"/>
-      </w:pPr>
-      <w:r>
-        <w:t xml:space="preserve">[9] Yoshua Bengio et al.: </w:t>
-      </w:r>
-      <w:r>
-        <w:rPr>
-          <w:i/>
-        </w:rPr>
-        <w:t>International AI Safety Report 2025</w:t>
-      </w:r>
-      <w:r>
-        <w:t xml:space="preserve"> sowie </w:t>
-      </w:r>
-      <w:r>
-        <w:rPr>
-          <w:i/>
-        </w:rPr>
-        <w:t>Second Key Update: Technical Safeguards and Risk Management</w:t>
-      </w:r>
-      <w:r>
-        <w:t>, arXiv:2511.19863. — Wasserzeichen und Detektion KI-generierter Inhalte werden behandelt; versierte Angreifer umgehen aktuelle Schutzmaßnahmen oft, reale Wirksamkeit vieler Safeguards unsicher. → QUELLEN.md Nr. 73 und Nr. 74.</w:t>
-      </w:r>
-    </w:p>
-    <w:p>
-      <w:pPr>
-        <w:pStyle w:val="Anmerkung"/>
-      </w:pPr>
-      <w:r>
-        <w:t xml:space="preserve">[10] European Data Protection Board: </w:t>
-      </w:r>
-      <w:r>
-        <w:rPr>
-          <w:i/>
-        </w:rPr>
-        <w:t>Opinion 28/2024 on certain data protection aspects related to the processing of personal data in the context of AI models</w:t>
-      </w:r>
-      <w:r>
-        <w:t>, 17.12.2024. — Anonymität eines Modells ist im Einzelfall zu prüfen; es muss „sehr unwahrscheinlich" sein, Personen zu identifizieren oder personenbezogene Daten per Anfrage zu extrahieren. → QUELLEN.md Nr. 85.</w:t>
-      </w:r>
-    </w:p>
-    <w:p>
-      <w:pPr>
-        <w:pStyle w:val="Anmerkung"/>
-      </w:pPr>
-      <w:r>
-        <w:t xml:space="preserve">[11] UNESCO: </w:t>
-      </w:r>
-      <w:r>
-        <w:rPr>
-          <w:i/>
-        </w:rPr>
-        <w:t>Guidance for Generative AI in Education and Research</w:t>
-      </w:r>
-      <w:r>
-        <w:t>, 2023. — Empfohlenes Mindestalter 13 für die eigenständige Nutzung generativer KI-Plattformen; Hinweis auf die DSGVO-Schwelle von 16 Jahren. Im Text als institutionelle Position gekennzeichnet, nicht als eigenes pädagogisches Urteil. → QUELLEN.md Nr. 68.</w:t>
-      </w:r>
-    </w:p>
-    <w:p>
-      <w:pPr>
-        <w:pStyle w:val="Anmerkung"/>
-      </w:pPr>
-      <w:r>
-        <w:t xml:space="preserve">[12] Garante per la protezione dei dati personali; Berichterstattung Euronews/Reuters. — Bußgeld von 15 Mio. € gegen OpenAI am 20.12.2024 (u. a. fehlende Rechtsgrundlage für Trainingsdatenverarbeitung, Transparenzverstöße); Annullierung durch ein italienisches Gericht 2026 aus Zuständigkeitsgründen, nicht wegen Entkräftung der inhaltlichen DSGVO-Vorwürfe. → QUELLEN.md Nr. 83. ▲ </w:t>
-      </w:r>
-      <w:r>
-        <w:rPr>
-          <w:b/>
-        </w:rPr>
-        <w:t>[PRÜFEN]</w:t>
-      </w:r>
-      <w:r>
-        <w:t xml:space="preserve"> genaues Urteilsdatum/Instanz 2026.</w:t>
-      </w:r>
-    </w:p>
-    <w:p>
-      <w:pPr>
-        <w:pStyle w:val="Anmerkung"/>
-      </w:pPr>
-      <w:r>
-        <w:t xml:space="preserve">[13] New York State Department of Financial Services: </w:t>
-      </w:r>
-      <w:r>
-        <w:rPr>
-          <w:i/>
-        </w:rPr>
-        <w:t>Report on the Apple Card Investigation</w:t>
-      </w:r>
-      <w:r>
-        <w:t>, März 2021. — Rund 400.000 New Yorker Anträge geprüft; kein Nachweis unrechtmäßiger Diskriminierung, Geschlecht kein Faktor. → QUELLEN.md Nr. 81.</w:t>
-      </w:r>
-    </w:p>
-    <w:p>
-      <w:pPr>
-        <w:pStyle w:val="Anmerkung"/>
-      </w:pPr>
-      <w:r>
-        <w:t xml:space="preserve">[14] Julia Angwin, Jeff Larson, Surya Mattu, Lauren Kirchner (ProPublica): </w:t>
-      </w:r>
-      <w:r>
-        <w:rPr>
-          <w:i/>
-        </w:rPr>
-        <w:t>Machine Bias</w:t>
-      </w:r>
-      <w:r>
-        <w:t>, 2016. — COMPAS/Northpointe, Broward County; unter den nicht erneut Straffälligen 45 % Falsch-Positiv-Rate bei schwarzen gegenüber 24 % bei weißen Angeklagten. → QUELLEN.md Nr. 77.</w:t>
-      </w:r>
-    </w:p>
-    <w:p>
-      <w:pPr>
-        <w:pStyle w:val="Anmerkung"/>
-      </w:pPr>
-      <w:r>
-        <w:t xml:space="preserve">[15] Alexandra Chouldechova: </w:t>
-      </w:r>
-      <w:r>
-        <w:rPr>
-          <w:i/>
-        </w:rPr>
-        <w:t>Fair prediction with disparate impact</w:t>
-      </w:r>
-      <w:r>
-        <w:t xml:space="preserve">, 2017; Jon Kleinberg, Sendhil Mullainathan, Manish Raghavan: </w:t>
-      </w:r>
-      <w:r>
-        <w:rPr>
-          <w:i/>
-        </w:rPr>
-        <w:t>Inherent Trade-Offs in the Fair Determination of Risk Scores</w:t>
-      </w:r>
-      <w:r>
-        <w:t>, 2016, arXiv:1703.00056. — „Unmöglichkeitstheorem": Bei ungleichen Basisraten sind Kalibrierung und Fehlerratenbalance nicht gleichzeitig erfüllbar. → QUELLEN.md Nr. 80.</w:t>
-      </w:r>
-    </w:p>
-    <w:p>
-      <w:pPr>
-        <w:pStyle w:val="Anmerkung"/>
-      </w:pPr>
-      <w:r>
-        <w:t xml:space="preserve">[16] Joy Buolamwini &amp; Timnit Gebru: </w:t>
-      </w:r>
-      <w:r>
-        <w:rPr>
-          <w:i/>
-        </w:rPr>
-        <w:t>Gender Shades: Intersectional Accuracy Disparities in Commercial Gender Classification</w:t>
-      </w:r>
-      <w:r>
-        <w:t>, PMLR / Conference on Fairness, Accountability and Transparency, 2018. — Drei kommerzielle Systeme zur Geschlechtsklassifikation; höchste Fehlerrate bei dunkelhäutigen Frauen bis 34,7 %, niedrigste bei hellhäutigen Männern 0,8 %. Die im Text angeschlossene Folgerung („der Durchschnitt versteckt das Problem", Frage nach der schlechtesten Gruppe in der Abnahme) ist Schlussfolgerung des Autors, keine Aussage der Studie. → QUELLEN.md Nr. 79.</w:t>
-      </w:r>
-    </w:p>
-    <w:p>
-      <w:pPr>
-        <w:pStyle w:val="Anmerkung"/>
-      </w:pPr>
-      <w:r>
-        <w:t xml:space="preserve">[17] Sida Peng, Eirini Kalliamvakou, Peter Cihon, Mert Demirer: </w:t>
-      </w:r>
-      <w:r>
-        <w:rPr>
-          <w:i/>
-        </w:rPr>
-        <w:t>The Impact of AI on Developer Productivity: Evidence from GitHub Copilot</w:t>
-      </w:r>
-      <w:r>
-        <w:t>, 2023, arXiv:2302.06590. — Randomisiertes Experiment, Implementierung eines HTTP-Servers in JavaScript; Gruppe mit Copilot rund 56 % schneller (71 vs. 160 Minuten). Nicht begutachtetes Arbeitspapier, Laborsetting — im Text ausdrücklich gekennzeichnet. Die Gegenüberstellung mit dem METR-Ergebnis [4] ist die Deutung des Autors. → QUELLEN.md Nr. 56.</w:t>
-      </w:r>
-    </w:p>
-    <w:p>
-      <w:pPr>
-        <w:pStyle w:val="Anmerkung"/>
-      </w:pPr>
-      <w:r>
-        <w:t xml:space="preserve">[18] Martín De Simone, Federico Tiberti et al. (Weltbank): </w:t>
-      </w:r>
-      <w:r>
-        <w:rPr>
-          <w:i/>
-        </w:rPr>
-        <w:t>From Chalkboards to Chatbots: Transforming Learning in Nigeria</w:t>
-      </w:r>
-      <w:r>
-        <w:t>, 2024/2025. — Randomisierter Pilot in Edo State, ca. 800 Schülerinnen und Schüler, sechs Wochen Nachmittagsunterricht in Englisch mit GPT-4/Copilot als Tutor; Lernzuwachs von der Weltbank mit etwa zwei Jahren regulärer Schulbildung verglichen, ca. 48 USD pro Schüler:in. Einschränkungen (kleiner Pilot, kurze Dauer, offene Skalierbarkeit) sind im Text genannt. → QUELLEN.md Nr. 65.</w:t>
-      </w:r>
-    </w:p>
-    <w:p>
-      <w:pPr>
-        <w:pStyle w:val="Anmerkung"/>
-      </w:pPr>
-      <w:r>
-        <w:rPr>
-          <w:i/>
-        </w:rPr>
-        <w:t>Nicht belegt und daher im Text ausdrücklich als Erfahrung, Angewohnheit oder Haltung des Autors gekennzeichnet:</w:t>
-      </w:r>
-      <w:r>
-        <w:t xml:space="preserve"> die Flur-Szene nach dem Workshop; sämtliche Projektszenen (der Ausnahmen-Workshop zum leeren Feld, der Schattenbetrieb, die Rückfrage nach zurückgeschickten Fällen, die Excel-Liste in der Abteilung); die Grenze beim Übersetzen von Amtsbriefen für die eigene Mutter; die Warnsignale für plausible Falschantworten, die Konsistenzprobe und die Fangfrage; die Beobachtung, dass in Workshops eher echtes Material für generiert erklärt wird als umgekehrt; das Familien-Codewort gegen Stimmfälschungen; sämtliche Empfehlungen an Organisationen und an Jugendliche.</w:t>
-      </w:r>
-    </w:p>
-    <w:p>
-      <w:pPr>
-        <w:pStyle w:val="Zwischen"/>
-      </w:pPr>
-      <w:r>
-        <w:t>Kapitel 12 — Wovor wir uns wirklich fürchten sollten</w:t>
-      </w:r>
-    </w:p>
-    <w:p>
-      <w:pPr>
-        <w:pStyle w:val="Anmerkung"/>
-      </w:pPr>
-      <w:r>
-        <w:t xml:space="preserve">[1] Bengio, Y. u. a. (Expert Panel): </w:t>
-      </w:r>
-      <w:r>
-        <w:rPr>
-          <w:i/>
-        </w:rPr>
-        <w:t>International AI Safety Report 2025</w:t>
-      </w:r>
-      <w:r>
-        <w:t>, Januar 2025, arXiv:2501.17805 / internationalaisafetyreport.org. — Rund 96 Fachleute, Vorsitz Bengio, getragen von 30 Ländern sowie EU/OECD/UN; breiter Konsens, dass heutige universelle KI kein Kontrollverlust-Risiko darstellt; Experteneinschätzungen zur nahen Zukunft divergieren stark („implausibel" bis „wahrscheinlich"); der Bericht legt bewusst keine gesicherten Positionen vor, wo kein Konsens besteht. → QUELLEN.md Nr. 73, 101.</w:t>
-      </w:r>
-    </w:p>
-    <w:p>
-      <w:pPr>
-        <w:pStyle w:val="Anmerkung"/>
-      </w:pPr>
-      <w:r>
-        <w:t xml:space="preserve">[2] IEA: </w:t>
-      </w:r>
-      <w:r>
-        <w:rPr>
-          <w:i/>
-        </w:rPr>
-        <w:t>Energy and AI</w:t>
-      </w:r>
-      <w:r>
-        <w:t>, April 2025. — Rechenzentren 2024: ca. 415 TWh / ca. 1,5 % des globalen Stromverbrauchs; Wachstum ca. 12 % p. a. seit 2017; Base Case ca. 945 TWh bis 2030 (knapp 3 %); Strombedarf KI-optimierter Rechenzentren bis 2030 mehr als vervierfacht. → QUELLEN.md Nr. 86.</w:t>
-      </w:r>
-    </w:p>
-    <w:p>
-      <w:pPr>
-        <w:pStyle w:val="Anmerkung"/>
-      </w:pPr>
-      <w:r>
-        <w:t xml:space="preserve">[3] VO (EU) 2024/1689 (EU AI Act), Art. 99 und Art. 113; EU-Kommission, AI Act Service Desk, </w:t>
-      </w:r>
-      <w:r>
-        <w:rPr>
-          <w:i/>
-        </w:rPr>
-        <w:t>Implementation Timeline</w:t>
-      </w:r>
-      <w:r>
-        <w:t xml:space="preserve">. — In Kraft 1.8.2024; Verbote 2.2.2025; Pflichten für GPAI-Modelle 2.8.2025; Hochrisiko/Transparenz 2.8.2026; volle Anwendbarkeit 2.8.2027; Bußgelder bis 35 Mio. € oder 7 % des weltweiten Jahresumsatzes. → QUELLEN.md Nr. 84. — </w:t>
-      </w:r>
-      <w:r>
-        <w:rPr>
-          <w:i/>
-        </w:rPr>
-        <w:t>Der Inhalt der GPAI-Pflichten wird im Text bewusst nicht referiert; belegt ist hier nur die Existenz der Kategorie und ihr Anwendungsdatum. Die Deutung „eigene Kategorie = Nadelöhr" ist als Deutung des Autors gekennzeichnet.</w:t>
-      </w:r>
-    </w:p>
-    <w:p>
-      <w:pPr>
-        <w:pStyle w:val="Anmerkung"/>
-      </w:pPr>
-      <w:r>
-        <w:t xml:space="preserve">[4] ▲ Stanford HAI: </w:t>
-      </w:r>
-      <w:r>
-        <w:rPr>
-          <w:i/>
-        </w:rPr>
-        <w:t>AI Index Report</w:t>
-      </w:r>
-      <w:r>
-        <w:t xml:space="preserve">, Kapitel „Economy", 2025/2026. — Organisationale KI-Adoption 2024 ca. 78 % gegenüber 55 % im Vorjahr. → QUELLEN.md Nr. 72. </w:t>
-      </w:r>
-      <w:r>
-        <w:rPr>
-          <w:b/>
-        </w:rPr>
-        <w:t>Adoptionswert und Bezugsjahr vor Drucklegung direkt am AI-Index-Kapitel verifizieren.</w:t>
-      </w:r>
-    </w:p>
-    <w:p>
-      <w:pPr>
-        <w:pStyle w:val="Anmerkung"/>
-      </w:pPr>
-      <w:r>
-        <w:t>[5] ▲ Rückverweis auf Kapitel 1 (Zensurbehörden, Druckprivilegien, Index der verbotenen Bücher als unmittelbare Machtreaktion auf den Buchdruck). — *</w:t>
-      </w:r>
-      <w:r>
-        <w:rPr>
-          <w:i/>
-        </w:rPr>
-        <w:t xml:space="preserve">Diese Angabe ist in Kapitel 1 ohne Einzelbeleg dargestellt; vor Drucklegung mit fachhistorischer Standardliteratur zur frühneuzeitlichen Zensur und zum </w:t>
-      </w:r>
-      <w:r>
-        <w:t>Index Librorum Prohibitorum</w:t>
-      </w:r>
-      <w:r>
-        <w:rPr>
-          <w:i/>
-        </w:rPr>
-        <w:t xml:space="preserve"> zu unterlegen. Das gilt ausdrücklich auch für die in diesem Kapitel ergänzte Bestimmung des Druckprivilegs als verliehenes Monopol in der Hand derselben Instanz, die über die Zulässigkeit von Inhalten entschied.</w:t>
-      </w:r>
-      <w:r>
-        <w:rPr>
-          <w:i/>
-        </w:rPr>
-      </w:r>
-    </w:p>
-    <w:p>
-      <w:pPr>
-        <w:pStyle w:val="Anmerkung"/>
-      </w:pPr>
-      <w:r>
-        <w:t>[6] Zum „Stromkrieg": Edisons Angstkampagne gegen Wechselstrom, öffentliche Tier-Elektrokutionen, „to be Westinghoused"; erste Hinrichtung auf dem elektrischen Stuhl (William Kemmler) am 6.8.1890 mit Wechselstrom; Westinghouse finanzierte Kemmlers Berufungsverfahren (Anwalt W. Bourke Cockran); Wendepunkte Weltausstellung Chicago 1893 und Niagara-Kraftwerk ab 1895. Ausführlich in Kapitel 2. → QUELLEN.md Nr. 9, 10, 11.</w:t>
-      </w:r>
-    </w:p>
-    <w:p>
-      <w:pPr>
-        <w:pStyle w:val="Anmerkung"/>
-      </w:pPr>
-      <w:r>
-        <w:t xml:space="preserve">[7] Bender, E. M.; Gebru, T.; McMillan-Major, A.; „Shmargaret Shmitchell" (M. Mitchell): </w:t>
-      </w:r>
-      <w:r>
-        <w:rPr>
-          <w:i/>
-        </w:rPr>
-        <w:t>On the Dangers of Stochastic Parrots: Can Language Models Be Too Big?</w:t>
-      </w:r>
-      <w:r>
-        <w:t xml:space="preserve"> FAccT '21, ACM, März 2021, DOI 10.1145/3442188.3445922. — Begriff „stochastische Papageien"; benannte Risiken u. a. Bias, Umwelt-/Ressourcenkosten und Verdrängung kritischer Forschung. → QUELLEN.md Nr. 104.</w:t>
-      </w:r>
-    </w:p>
-    <w:p>
-      <w:pPr>
-        <w:pStyle w:val="Anmerkung"/>
-      </w:pPr>
-      <w:r>
-        <w:t xml:space="preserve">[8] Timnit Gebru: Abgang/Entlassung bei Google, 2. Dezember 2020, im Streit um das Stochastic-Parrots-Papier; Margaret Mitchell rund zwei Monate später entlassen (MIT Technology Review, 4.12.2020). → QUELLEN.md Nr. 105. — </w:t>
-      </w:r>
-      <w:r>
-        <w:rPr>
-          <w:i/>
-        </w:rPr>
-        <w:t>Die Umstände werden von den Beteiligten unterschiedlich dargestellt; im Text ist nur der unstrittige Ablauf wiedergegeben.</w:t>
-      </w:r>
-    </w:p>
-    <w:p>
-      <w:pPr>
-        <w:pStyle w:val="Anmerkung"/>
-      </w:pPr>
-      <w:r>
-        <w:t xml:space="preserve">[9] Gmyrek, P.; Berg, J. u. a. (ILO/NASK): </w:t>
-      </w:r>
-      <w:r>
-        <w:rPr>
-          <w:i/>
-        </w:rPr>
-        <w:t>Generative AI and Jobs: A Refined Global Index of Occupational Exposure</w:t>
-      </w:r>
-      <w:r>
-        <w:t>, ILO Working Paper 140, 20.5.2025. — Ca. jeder vierte Beschäftigte weltweit exponiert; Transformation statt Ersatz; 34 % der Beschäftigung in Hocheinkommens- vs. 11 % in Niedrigeinkommensländern; höchste Expositionskategorie 3,3 % weltweit, davon Frauen 4,7 % vs. Männer 2,4 %. → QUELLEN.md Nr. 61.</w:t>
-      </w:r>
-    </w:p>
-    <w:p>
-      <w:pPr>
-        <w:pStyle w:val="Anmerkung"/>
-      </w:pPr>
-      <w:r>
-        <w:t xml:space="preserve">[10] Cazzaniga, M. u. a. (IWF): </w:t>
-      </w:r>
-      <w:r>
-        <w:rPr>
-          <w:i/>
-        </w:rPr>
-        <w:t>Gen-AI: Artificial Intelligence and the Future of Work</w:t>
-      </w:r>
-      <w:r>
-        <w:t>, Januar 2024. — Ca. 40 % der Jobs weltweit exponiert; fortgeschrittene Volkswirtschaften ca. 60 %, Niedrigeinkommensländer ca. 26 %; ausdrückliche Warnung vor wachsender Ungleichheit. → QUELLEN.md Nr. 62.</w:t>
-      </w:r>
-    </w:p>
-    <w:p>
-      <w:pPr>
-        <w:pStyle w:val="Anmerkung"/>
-      </w:pPr>
-      <w:r>
-        <w:t xml:space="preserve">[11] Brynjolfsson, E.; Chandar, B.; Chen, R. (Stanford Digital Economy Lab): </w:t>
-      </w:r>
-      <w:r>
-        <w:rPr>
-          <w:i/>
-        </w:rPr>
-        <w:t>Canaries in the Coal Mine? Six Facts about the Recent Employment Effects of Artificial Intelligence</w:t>
-      </w:r>
-      <w:r>
-        <w:t xml:space="preserve">, 2025. — ADP-Lohndaten von über 25 Mio. Beschäftigten; relativer Beschäftigungsrückgang von ca. 13–16 % bei 22- bis 25-Jährigen in stark KI-exponierten Berufen; Effekt konzentriert auf automatisierende, nicht augmentierende Anwendungen. → QUELLEN.md Nr. 63. — </w:t>
-      </w:r>
-      <w:r>
-        <w:rPr>
-          <w:i/>
-        </w:rPr>
-        <w:t>Einschränkung (ein Land, ein Datensatz, kurzer Zeitraum) im Text genannt.</w:t>
-      </w:r>
-    </w:p>
-    <w:p>
-      <w:pPr>
-        <w:pStyle w:val="Anmerkung"/>
-      </w:pPr>
-      <w:r>
-        <w:t xml:space="preserve">[12] Erik Brynjolfsson: </w:t>
-      </w:r>
-      <w:r>
-        <w:rPr>
-          <w:i/>
-        </w:rPr>
-        <w:t>The Turing Trap: The Promise &amp; Peril of Human-Like Artificial Intelligence</w:t>
-      </w:r>
-      <w:r>
-        <w:t xml:space="preserve">, Dædalus 2022 / arXiv:2201.04200. — Automation senkt die Verhandlungsmacht Arbeitender und konzentriert den geschaffenen Wert; Augmentation lässt Menschen daran teilhaben; derzeitige Anreize begünstigen Automation. → QUELLEN.md Nr. 108. — </w:t>
-      </w:r>
-      <w:r>
-        <w:rPr>
-          <w:i/>
-        </w:rPr>
-        <w:t>Ökonomische Position, keine Messung; im Text als solche gekennzeichnet.</w:t>
-      </w:r>
-    </w:p>
-    <w:p>
-      <w:pPr>
-        <w:pStyle w:val="Anmerkung"/>
-      </w:pPr>
-      <w:r>
-        <w:t xml:space="preserve">[13] Zum Luddismus 1811–1816 (Strumpfwirker, </w:t>
-      </w:r>
-      <w:r>
-        <w:rPr>
-          <w:i/>
-        </w:rPr>
-        <w:t>wide frames</w:t>
-      </w:r>
-      <w:r>
-        <w:t xml:space="preserve">, billige „cut-ups", Lohnsenkungen, Umgehung des Lehrlingsrechts; selektive, disziplinierte Aktionen): Wikipedia (en) </w:t>
-      </w:r>
-      <w:r>
-        <w:rPr>
-          <w:i/>
-        </w:rPr>
-        <w:t>Luddite</w:t>
-      </w:r>
-      <w:r>
-        <w:t xml:space="preserve">; Nottinghamshire Heritage Gateway, </w:t>
-      </w:r>
-      <w:r>
-        <w:rPr>
-          <w:i/>
-        </w:rPr>
-        <w:t>Luddites — Overview</w:t>
-      </w:r>
-      <w:r>
-        <w:t xml:space="preserve">; Richard Conniff: </w:t>
-      </w:r>
-      <w:r>
-        <w:rPr>
-          <w:i/>
-        </w:rPr>
-        <w:t>What the Luddites Really Fought Against</w:t>
-      </w:r>
-      <w:r>
-        <w:t>, Smithsonian Magazine, März 2011. Ausführlich in Kapitel 4. → QUELLEN.md Nr. 44, 45.</w:t>
-      </w:r>
-    </w:p>
-    <w:p>
-      <w:pPr>
-        <w:pStyle w:val="Anmerkung"/>
-      </w:pPr>
-      <w:r>
-        <w:t xml:space="preserve">[14] UK Government / Intellectual Property Office: </w:t>
-      </w:r>
-      <w:r>
-        <w:rPr>
-          <w:i/>
-        </w:rPr>
-        <w:t>Report on Copyright and Artificial Intelligence</w:t>
-      </w:r>
-      <w:r>
-        <w:t>, 2025 (Konsultation 17.12.2024–25.02.2025, über 11.500 Antworten). — Die zunächst bevorzugte TDM-Ausnahme mit Opt-out wurde nach Widerstand der Kreativwirtschaft fallengelassen; es gibt keine bevorzugte Option mehr. → QUELLEN.md Nr. 70.</w:t>
-      </w:r>
-    </w:p>
-    <w:p>
-      <w:pPr>
-        <w:pStyle w:val="Anmerkung"/>
-      </w:pPr>
-      <w:r>
-        <w:t xml:space="preserve">[15] Lee, H.-P. u. a. (Microsoft Research / Carnegie Mellon): </w:t>
-      </w:r>
-      <w:r>
-        <w:rPr>
-          <w:i/>
-        </w:rPr>
-        <w:t>The Impact of Generative AI on Critical Thinking</w:t>
-      </w:r>
-      <w:r>
-        <w:t xml:space="preserve">, CHI 2025, DOI 10.1145/3706598.3713778. — Befragung von 319 Berufstätigen zu 936 realen Anwendungsfällen; höheres Vertrauen in die KI korreliert mit weniger berichtetem kritischem Denken, höheres Selbstvertrauen mit mehr. → QUELLEN.md Nr. 67. — </w:t>
-      </w:r>
-      <w:r>
-        <w:rPr>
-          <w:i/>
-        </w:rPr>
-        <w:t>Selbstauskünfte, keine Leistungsmessung.</w:t>
-      </w:r>
-    </w:p>
-    <w:p>
-      <w:pPr>
-        <w:pStyle w:val="Anmerkung"/>
-      </w:pPr>
-      <w:r>
-        <w:t xml:space="preserve">[16] ▲ Kosmyna, N. u. a. (MIT Media Lab): </w:t>
-      </w:r>
-      <w:r>
-        <w:rPr>
-          <w:i/>
-        </w:rPr>
-        <w:t>Your Brain on ChatGPT: Accumulation of Cognitive Debt…</w:t>
-      </w:r>
-      <w:r>
-        <w:t xml:space="preserve">, 2025, arXiv:2506.08872. — EEG-Studie, n = 54; schwächste neuronale Konnektivität bei LLM-Nutzung; Begriff „cognitive debt". </w:t>
-      </w:r>
-      <w:r>
-        <w:rPr>
-          <w:b/>
-        </w:rPr>
-        <w:t>Preprint, kleine Stichprobe, methodische Kritik in einem Folge-Kommentar; im Text ausdrücklich als Hinweis, nicht als Beleg gekennzeichnet.</w:t>
-      </w:r>
-      <w:r>
-        <w:t xml:space="preserve"> → QUELLEN.md Nr. 66.</w:t>
-      </w:r>
-    </w:p>
-    <w:p>
-      <w:pPr>
-        <w:pStyle w:val="Anmerkung"/>
-      </w:pPr>
-      <w:r>
-        <w:t xml:space="preserve">[17] ▲ Platon: </w:t>
-      </w:r>
-      <w:r>
-        <w:rPr>
-          <w:i/>
-        </w:rPr>
-        <w:t>Phaidros</w:t>
-      </w:r>
-      <w:r>
-        <w:t xml:space="preserve"> 274c–275b (Theuth und Thamus; die Schrift mache „scheinbar weise statt weise"). Ausführlich in Kapitel 1. → QUELLEN.md Nr. 111. </w:t>
-      </w:r>
-      <w:r>
-        <w:rPr>
-          <w:b/>
-        </w:rPr>
-        <w:t>Deutsche Übersetzung und Stellenangabe vor Drucklegung festlegen; im Text Paraphrase, kein Wortzitat.</w:t>
-      </w:r>
-    </w:p>
-    <w:p>
-      <w:pPr>
-        <w:pStyle w:val="Anmerkung"/>
-      </w:pPr>
-      <w:r>
-        <w:t xml:space="preserve">[18] David Collingridge: </w:t>
-      </w:r>
-      <w:r>
-        <w:rPr>
-          <w:i/>
-        </w:rPr>
-        <w:t>The Social Control of Technology</w:t>
-      </w:r>
-      <w:r>
-        <w:t>, 1980. — Steuerungsdilemma (Informationsproblem vs. Machtproblem); Gegenrezepte: Optionen offenhalten, revidierbar und modular bauen, Feedback einbauen. Ausführlich in Kapitel 4. → QUELLEN.md Nr. 51.</w:t>
-      </w:r>
-    </w:p>
-    <w:p>
-      <w:pPr>
-        <w:pStyle w:val="Anmerkung"/>
-      </w:pPr>
-      <w:r>
-        <w:t xml:space="preserve">[19] OpenResearch: </w:t>
-      </w:r>
-      <w:r>
-        <w:rPr>
-          <w:i/>
-        </w:rPr>
-        <w:t>Unconditional Cash Study</w:t>
-      </w:r>
-      <w:r>
-        <w:t xml:space="preserve">, Ergebnisse veröffentlicht 21.7.2024. — 1.000 Teilnehmende erhielten über drei Jahre 1.000 USD/Monat (Kontrollgruppe 50 USD); mehr Handlungsfähigkeit (Gründungen, Bildung, Vorsorge, medizinische Versorgung), nur geringer Effekt auf die Arbeitszeit. → QUELLEN.md Nr. 109. — </w:t>
-      </w:r>
-      <w:r>
-        <w:rPr>
-          <w:i/>
-        </w:rPr>
-        <w:t>Belegt UBI-Effekte, nicht die These „KI zerstört die Arbeit"; im Text so gekennzeichnet.</w:t>
-      </w:r>
-    </w:p>
-    <w:p>
-      <w:pPr>
-        <w:pStyle w:val="Anmerkung"/>
-      </w:pPr>
-      <w:r>
-        <w:t xml:space="preserve">[20] OECD: </w:t>
-      </w:r>
-      <w:r>
-        <w:rPr>
-          <w:i/>
-        </w:rPr>
-        <w:t>Employment Outlook 2025</w:t>
-      </w:r>
-      <w:r>
-        <w:t>. — Bislang wenig Belege für KI-bedingte Jobverluste; zwei Drittel der bereits mit KI arbeitenden Beschäftigten empfinden ihre Arbeit als weniger monoton oder gefährlich. → QUELLEN.md Nr. 59.</w:t>
-      </w:r>
-    </w:p>
-    <w:p>
-      <w:pPr>
-        <w:pStyle w:val="Anmerkung"/>
-      </w:pPr>
-      <w:r>
-        <w:t xml:space="preserve">[21] ▲ </w:t>
-      </w:r>
-      <w:r>
-        <w:rPr>
-          <w:i/>
-        </w:rPr>
-        <w:t>International AI Safety Report 2025</w:t>
-      </w:r>
-      <w:r>
-        <w:t xml:space="preserve"> (Bengio u. a.) sowie Berichterstattung zu den Fortschreibungen 2025/2026. — Belegte Missbrauchsrisiken: Erleichterung und Beschleunigung von Cyberangriffen mit demonstrierten Fähigkeiten bei Aufgaben geringer und mittlerer Komplexität; im Bereich Bio/Chemie „einige Fähigkeit" bei Anleitung und Fehlerbehebung zu bekannten Waffen; 2025 veröffentlichten mehrere Anbieter Modelle bewusst mit zusätzlichen Sicherheitsvorkehrungen, weil Tests vor der Veröffentlichung eine substanzielle Hilfe für Laien nicht ausschließen konnten. → QUELLEN.md Nr. 73, 74. </w:t>
-      </w:r>
-      <w:r>
-        <w:rPr>
-          <w:b/>
-        </w:rPr>
-        <w:t>Die Angabe zu den Zusatz-Safeguards 2025 stammt aus der Berichterstattung über die Fortschreibungen; vor Drucklegung am Originalbericht verifizieren.</w:t>
-      </w:r>
-    </w:p>
-    <w:p>
-      <w:pPr>
-        <w:pStyle w:val="Anmerkung"/>
-      </w:pPr>
-      <w:r>
-        <w:t xml:space="preserve">[22] </w:t>
-      </w:r>
-      <w:r>
-        <w:rPr>
-          <w:i/>
-        </w:rPr>
-        <w:t>International AI Safety Report 2025 — Second Key Update: Technical Safeguards and Risk Management</w:t>
-      </w:r>
-      <w:r>
-        <w:t xml:space="preserve">, arXiv:2511.19863. — Zahl der Unternehmen mit veröffentlichten Frontier-AI-Safety-Frameworks seit Anfang 2025 mehr als verdoppelt; zugleich „significant gaps remain". → QUELLEN.md Nr. 74. — </w:t>
-      </w:r>
-      <w:r>
-        <w:rPr>
-          <w:i/>
-        </w:rPr>
-        <w:t>Die Einordnung als Selbstverpflichtung aus demselben Haus ist eine Wertung des Autors.</w:t>
-      </w:r>
-    </w:p>
-    <w:p>
-      <w:pPr>
-        <w:pStyle w:val="Anmerkung"/>
-      </w:pPr>
-      <w:r>
-        <w:t xml:space="preserve">[23] ▲ IEA: </w:t>
-      </w:r>
-      <w:r>
-        <w:rPr>
-          <w:i/>
-        </w:rPr>
-        <w:t>Energy and AI</w:t>
-      </w:r>
-      <w:r>
-        <w:t xml:space="preserve"> (April 2025) sowie IEA-Meldung zum Jahr 2025 („Data centre electricity use surged in 2025"). — Stromverbrauch KI-fokussierter Rechenzentren 2025 um rund 50 % gestiegen; rund 1.200 TWh bis 2035; Erneuerbare decken knapp die Hälfte der Zusatznachfrage, dahinter Erdgas und Kohle, Kernkraft gegen Ende des Jahrzehnts; Energieverbrauch pro KI-Aufgabe sinkt in beispiellosem Tempo. → QUELLEN.md Nr. 86 und Nr. 119. </w:t>
-      </w:r>
-      <w:r>
-        <w:rPr>
-          <w:b/>
-        </w:rPr>
-        <w:t>2025er-Zuwachszahl und Energiequellen-Aufteilung vor Drucklegung an der IEA-Primärquelle gegenlesen.</w:t>
-      </w:r>
-      <w:r>
-        <w:t xml:space="preserve"> — </w:t>
-      </w:r>
-      <w:r>
-        <w:rPr>
-          <w:i/>
-        </w:rPr>
-        <w:t>Die Deutung des Ausbaus als Verhandlungsposition gegenüber Netzbetreibern, Kommunen und Regierungen ist eine Einschätzung des Autors.</w:t>
-      </w:r>
-    </w:p>
-    <w:p>
-      <w:pPr>
-        <w:pStyle w:val="Anmerkung"/>
-      </w:pPr>
-      <w:r>
-        <w:t xml:space="preserve">[24] European Data Protection Board: </w:t>
-      </w:r>
-      <w:r>
-        <w:rPr>
-          <w:i/>
-        </w:rPr>
-        <w:t>Opinion 28/2024</w:t>
-      </w:r>
-      <w:r>
-        <w:t xml:space="preserve"> (personenbezogene Daten im Kontext von KI-Modellen), 17.12.2024. — Anonymität im Einzelfall zu prüfen; berechtigtes Interesse nur nach dreistufigem Test; ursprünglich unrechtmäßige Verarbeitung kann die weitere Nutzung des Modells beeinträchtigen. → QUELLEN.md Nr. 85. — </w:t>
-      </w:r>
-      <w:r>
-        <w:rPr>
-          <w:i/>
-        </w:rPr>
-        <w:t>Die Folgerung, dass Rechtsrisiko als Fixkostenblock größere Anbieter begünstigt, ist als Lesart des Autors markiert.</w:t>
-      </w:r>
-    </w:p>
-    <w:p>
-      <w:pPr>
-        <w:pStyle w:val="Anmerkung"/>
-      </w:pPr>
-      <w:r>
-        <w:t xml:space="preserve">[25] Buolamwini, J.; Gebru, T.: </w:t>
-      </w:r>
-      <w:r>
-        <w:rPr>
-          <w:i/>
-        </w:rPr>
-        <w:t>Gender Shades: Intersectional Accuracy Disparities in Commercial Gender Classification</w:t>
-      </w:r>
-      <w:r>
-        <w:t>, PMLR / FAccT 2018. — Drei kommerzielle Systeme; Fehlerrate bei dunkelhäutigen Frauen bis 34,7 %, bei hellhäutigen Männern 0,8 %; Nachweis verzerrter Trainingsdatensätze; maßgeblicher Anstoß für die Debatte um repräsentative Daten. → QUELLEN.md Nr. 79.</w:t>
-      </w:r>
-    </w:p>
-    <w:p>
-      <w:pPr>
-        <w:pStyle w:val="Anmerkung"/>
-      </w:pPr>
-      <w:r>
-        <w:t xml:space="preserve">[26] Cazzaniga, M. u. a. (IWF): </w:t>
-      </w:r>
-      <w:r>
-        <w:rPr>
-          <w:i/>
-        </w:rPr>
-        <w:t>Gen-AI: Artificial Intelligence and the Future of Work</w:t>
-      </w:r>
-      <w:r>
-        <w:t>, Januar 2024. — Von den ca. 60 % exponierten Jobs in fortgeschrittenen Volkswirtschaften läuft etwa die Hälfte Gefahr sinkender Arbeitsnachfrage und Löhne. → QUELLEN.md Nr. 62.</w:t>
-      </w:r>
-    </w:p>
-    <w:p>
-      <w:pPr>
-        <w:pStyle w:val="Anmerkung"/>
-      </w:pPr>
-      <w:r>
-        <w:t xml:space="preserve">[27] OECD: </w:t>
-      </w:r>
-      <w:r>
-        <w:rPr>
-          <w:i/>
-        </w:rPr>
-        <w:t>Employment Outlook 2025</w:t>
-      </w:r>
-      <w:r>
-        <w:t>. — Berufe mit dem höchsten Automatisierungsrisiko machen 27 % der Beschäftigung im OECD-Raum aus. → QUELLEN.md Nr. 59.</w:t>
-      </w:r>
-    </w:p>
-    <w:p>
-      <w:pPr>
-        <w:pStyle w:val="Anmerkung"/>
-      </w:pPr>
-      <w:r>
-        <w:t xml:space="preserve">[28] ▲ IAB: </w:t>
-      </w:r>
-      <w:r>
-        <w:rPr>
-          <w:i/>
-        </w:rPr>
-        <w:t>KI und Arbeitsmarkt</w:t>
-      </w:r>
-      <w:r>
-        <w:t xml:space="preserve">, IAB-Forschungsbericht 2025. — Beschäftigungswachstum in Berufen mit hoher KI-Exposition +5,9 % gegenüber +2,5 % (geringe) und −1,7 % (ohne Exposition). → QUELLEN.md Nr. 58. </w:t>
-      </w:r>
-      <w:r>
-        <w:rPr>
-          <w:b/>
-        </w:rPr>
-        <w:t>Einzelwerte vor Drucklegung am Forschungsbericht verifizieren.</w:t>
-      </w:r>
-    </w:p>
-    <w:p>
-      <w:pPr>
-        <w:pStyle w:val="Anmerkung"/>
-      </w:pPr>
-      <w:r>
-        <w:t xml:space="preserve">[29] </w:t>
-      </w:r>
-      <w:r>
-        <w:rPr>
-          <w:i/>
-        </w:rPr>
-        <w:t>Destruction of Stocking Frames, etc. Act 1812</w:t>
-      </w:r>
-      <w:r>
-        <w:t xml:space="preserve"> („Frame Breaking Act", 52 Geo. 3 c. 16), königliche Bestätigung 20.3.1812 (Todesstrafe für das Zerstören von Strumpf- und Spitzenstühlen); Lord Byrons Antrittsrede im Oberhaus dagegen am 27.2.1812. Ausführlich in Kapitel 4. → QUELLEN.md Nr. 46. — </w:t>
-      </w:r>
-      <w:r>
-        <w:rPr>
-          <w:i/>
-        </w:rPr>
-        <w:t>Zu Zahl und Umfang der nachfolgenden Hinrichtungen wird wie in Kapitel 4 bewusst keine Angabe gemacht.</w:t>
-      </w:r>
-    </w:p>
-    <w:p>
-      <w:pPr>
-        <w:pStyle w:val="Anmerkung"/>
-      </w:pPr>
-      <w:r>
-        <w:t xml:space="preserve">[30] Doshi, A. R.; Hauser, O. P.: </w:t>
-      </w:r>
-      <w:r>
-        <w:rPr>
-          <w:i/>
-        </w:rPr>
-        <w:t>Generative AI enhances individual creativity but reduces the collective diversity of novel content</w:t>
-      </w:r>
-      <w:r>
-        <w:t xml:space="preserve">, Science Advances 10(28), 12.7.2024, DOI 10.1126/sciadv.adn5290. Ausführlich in Kapitel 7. → QUELLEN.md Nr. 69. — </w:t>
-      </w:r>
-      <w:r>
-        <w:rPr>
-          <w:i/>
-        </w:rPr>
-        <w:t>Die Übertragung auf die öffentliche Debatte ist eine Deutung des Autors.</w:t>
-      </w:r>
-    </w:p>
-    <w:p>
-      <w:pPr>
-        <w:pStyle w:val="Anmerkung"/>
-      </w:pPr>
-      <w:r>
-        <w:t xml:space="preserve">[31] Office of Technology Assessment (USA), </w:t>
+        <w:t xml:space="preserve">[30] Office of Technology Assessment (USA), </w:t>
       </w:r>
       <w:r>
         <w:rPr>

</xml_diff>

<commit_message>
Phase 7: Verlags-Expose, Anschreiben-Vorlage, Leseprobe
- 06_expose/EXPOSE.md: Pitch, Relevanz, Zielgruppe in drei Ringen,
  Markt-Abgrenzung gegen sechs Vergleichstitel, kommentierte Gliederung,
  Autorenvita, Eckdaten. Schwache Autorenplattform offen benannt statt
  beschoenigt.
- 06_expose/ANSCHREIBEN_VORLAGE.md: einseitiges Anschreiben mit
  Platzhaltern und Versand-Checkliste.
- 06_expose/LESEPROBE.md: Einleitung + Kapitel 1 (10.410 W).

Co-Authored-By: Claude Opus 4.8 <noreply@anthropic.com>
Claude-Session: https://claude.ai/code/session_0134ACJs5QwNt7TBrqmWZELo
</commit_message>
<xml_diff>
--- a/04_produktion/Erst_kam_die_Angst_Manuskript.docx
+++ b/04_produktion/Erst_kam_die_Angst_Manuskript.docx
@@ -12470,25 +12470,16 @@
         <w:ind w:firstLine="283"/>
       </w:pPr>
       <w:r>
-        <w:t>Zwischen diesen beiden Enden liegt keine Linie, sondern eine Fläche, und die lohnt sich anzuschauen, weil fast alles, was du wirklich tust, irgendwo in der Mitte liegt. Zwei Achsen spannen sie auf. Die eine fragt, was ein Fehler kostet: ein paar Sekunden, einen verdorbenen Nachmittag, Geld, einen Ruf, im Extremfall eine Existenz. Die andere fragt, wann er auffliegt: sofort, beim nächsten Monatsabschluss, in der Betriebsprüfung in drei Jahren, nie.</w:t>
-      </w:r>
-    </w:p>
-    <w:p>
-      <w:pPr>
-        <w:pStyle w:val="Fliesstext"/>
-        <w:ind w:firstLine="283"/>
-      </w:pPr>
-      <w:r>
-        <w:t>Die erste Ecke, billig und sofort sichtbar, ist die, in der ich das Werkzeug ohne schlechtes Gewissen benutze. Formulierungen, Betreffzeilen, zwanzig Namensvorschläge für ein Projekt, von denen neunzehn albern sind. Eine Excel-Formel, die ich an drei Zeilen nachrechne. Ein regulärer Ausdruck, den ich früher nachgeschlagen hätte. Eine Übersetzung in eine Sprache, die ich selbst lesen kann. Der gemeinsame Nenner ist nicht, dass diese Dinge unwichtig wären, sondern dass die Prüfung im Lesen schon enthalten ist und deshalb nichts kostet.</w:t>
-      </w:r>
-    </w:p>
-    <w:p>
-      <w:pPr>
-        <w:pStyle w:val="Fliesstext"/>
-        <w:ind w:firstLine="283"/>
-      </w:pPr>
-      <w:r>
-        <w:t>Bei Code muss ich meinen eigenen brutalen Satz allerdings einschränken, weil die Ausnahme die wichtige ist. „Läuft oder läuft nicht" gilt für abstürzende Programme, nicht für solche, die laufen und dabei still falsch rechnen. Ein Skript, das zwei Exporte zusammenführt und jede Zeile verwirft, in der ein Feld leer ist, wirft keine Fehlermeldung. Es liefert eine Tabelle. Eine schöne, plausible, kürzere Tabelle. Mir ist das passiert, und ich habe es nicht am Code gemerkt, sondern daran, dass eine Summe nicht zu einer Zahl passte, die ich aus ganz anderem Grund im Kopf hatte. Seitdem gilt: Ich brauche mindestens einen Fall, dessen Ergebnis ich unabhängig weiß, und den lasse ich jedes Mal mitlaufen.</w:t>
+        <w:t>Zwischen diesen beiden Enden liegt keine Linie, sondern eine Fläche, und die lohnt sich anzuschauen, weil fast alles, was du wirklich tust, irgendwo in der Mitte liegt. Zwei Achsen spannen sie auf. Die eine fragt, was ein Fehler kostet: ein paar Sekunden, einen verdorbenen Nachmittag, Geld, einen Ruf, im Extremfall eine Existenz. Die andere fragt, wann er auffliegt: sofort, beim nächsten Monatsabschluss, in der Betriebsprüfung in drei Jahren, nie. Vier Ecken, und jede verlangt etwas anderes von dir.</w:t>
+      </w:r>
+    </w:p>
+    <w:p>
+      <w:pPr>
+        <w:pStyle w:val="Fliesstext"/>
+        <w:ind w:firstLine="283"/>
+      </w:pPr>
+      <w:r>
+        <w:t>Die erste, billig und sofort sichtbar, habe ich gerade beschrieben. Dort benutze ich das Werkzeug ohne schlechtes Gewissen, weil die Prüfung im Lesen schon enthalten ist und deshalb nichts kostet. Nur bei Code muss ich meinen eigenen brutalen Satz einschränken, und die Ausnahme ist die wichtige. „Läuft oder läuft nicht" gilt für abstürzende Programme, nicht für solche, die laufen und dabei still falsch rechnen. Ein Skript, das zwei Exporte zusammenführt und jede Zeile verwirft, in der ein Feld leer ist, wirft keine Fehlermeldung. Es liefert eine Tabelle. Eine schöne, plausible, kürzere Tabelle. Mir ist das passiert, und ich habe es nicht am Code gemerkt, sondern daran, dass eine Summe nicht zu einer Zahl passte, die ich aus ganz anderem Grund im Kopf hatte. Seitdem gilt: Ich brauche mindestens einen Fall, dessen Ergebnis ich unabhängig weiß, und den lasse ich jedes Mal mitlaufen.</w:t>
       </w:r>
     </w:p>
     <w:p>
@@ -12506,7 +12497,7 @@
         <w:ind w:firstLine="283"/>
       </w:pPr>
       <w:r>
-        <w:t>Die dritte Ecke ist die schleichende: billig im Einzelfall, aber unsichtbar. Du lässt dir einen Bericht zusammenfassen, den du nie im Original liest, eine Seite aus dem Norwegischen übersetzen, die Garzeit ausrechnen, den Weg beschreiben. Jeder dieser Fälle ist zu klein, um ihn zu prüfen; das ist keine Faulheit, sondern eine richtige Rechnung. Der Schaden liegt in der Menge. Nach hundert solchen Vorgängen hat sich dein Bild von einem Thema um ein paar Grad verschoben, und du hast keinen Kompass, an dem du das merken würdest. Was hilft, ist unspektakulär: ab und zu eine Stichprobe, nicht um diesen einen Fall aufzuklären, sondern um die eigene Fehlerquote überhaupt schätzen zu können. Ich halte etwa einmal im Monat eine Zusammenfassung gegen das Original. Manchmal ist sie tadellos. Manchmal fehlt genau der Satz, auf den es angekommen wäre.</w:t>
+        <w:t>Die dritte Ecke ist die schleichende: billig im Einzelfall, aber unsichtbar. Du lässt dir einen Bericht zusammenfassen, den du nie im Original liest, eine Seite aus dem Norwegischen übersetzen, die Garzeit ausrechnen, den Weg beschreiben. Jeder dieser Fälle ist zu klein, um ihn zu prüfen; das ist keine Faulheit, sondern eine richtige Rechnung. Der Schaden liegt in der Menge. Nach hundert solchen Vorgängen hat sich dein Bild von einem Thema um ein paar Grad verschoben, und du hast keinen Kompass dafür. Was hilft, ist unspektakulär: ab und zu eine Stichprobe, nicht um diesen einen Fall aufzuklären, sondern um die eigene Fehlerquote überhaupt schätzen zu können. Ich halte etwa einmal im Monat eine Zusammenfassung gegen das Original. Manchmal ist sie tadellos. Manchmal fehlt genau der Satz, auf den es angekommen wäre.</w:t>
       </w:r>
     </w:p>
     <w:p>
@@ -12533,7 +12524,7 @@
         <w:ind w:firstLine="283"/>
       </w:pPr>
       <w:r>
-        <w:t>Das zweite ist die Umkehrbarkeit. Ein Entwurf im Postausgang und dieselbe Mail beim Kunden sind nicht dasselbe Risiko, auch wenn der Text identisch ist. Zwischen einem Vorschlag, den jemand bestätigt, und einer Buchung, die das System selbst auslöst, liegt eine Klickstrecke, und die entscheidet, ob ein Fehler eine Korrektur wird oder ein Storno mit Aktenvermerk. Aus der umkehrbaren Variante kann man nach drei Monaten die andere machen. Umgekehrt nie.</w:t>
+        <w:t>Das zweite ist die Umkehrbarkeit. Ein Entwurf im Postausgang und dieselbe Mail beim Kunden sind nicht dasselbe Risiko, auch wenn der Text identisch ist. Zwischen einem Vorschlag, den jemand bestätigt, und einer Buchung, die das System selbst auslöst, liegt eine Klickstrecke, und die entscheidet, ob ein Fehler eine Korrektur wird oder ein Storno mit Aktenvermerk.</w:t>
       </w:r>
     </w:p>
     <w:p>
@@ -12646,7 +12637,7 @@
         <w:ind w:firstLine="283"/>
       </w:pPr>
       <w:r>
-        <w:t>Wenn du das eine Weile machst, merkst du, dass es drei Sorten von Ärger gibt, und die harmloseste ist die berühmteste. Sorte eins: Die Quelle existiert nicht. Titel, Autor, Jahr, Band, Seitenzahl, alles tadellos formatiert, und es gibt sie einfach nicht. Ärgerlich, aber eine Minute Suche, dann weißt du Bescheid. Sorte zwei ist häufiger und gefährlicher: Die Quelle existiert, sagt aber etwas anderes, meistens etwas Engeres. Aus einem Befund an vierundfünfzig Personen im Labor wird „Studien zeigen", aus einer Modellrechnung eine Prognose, aus „in dieser Stichprobe" ein „grundsätzlich". Niemand hat gelogen, es ist unterwegs nur eine Einschränkung verlorengegangen, und die Einschränkung war der ganze Inhalt. Sorte drei ist die feinste: Die Quelle existiert, sagt genau das, und ist trotzdem der falsche Beleg. Eine Pressemitteilung über eine Studie ist nicht die Studie, und ein Preprint ist kein Ergebnis, sondern ein Angebot zur Diskussion.</w:t>
+        <w:t>Wenn du das eine Weile machst, merkst du, dass es drei Sorten von Ärger gibt, und die harmloseste ist die berühmteste. Sorte eins: Die Quelle existiert nicht. Titel, Autor, Jahr, Seitenzahl, alles tadellos formatiert, und es gibt sie einfach nicht. Ärgerlich, aber eine Minute Suche, dann weißt du Bescheid. Sorte zwei ist häufiger und gefährlicher: Die Quelle existiert, sagt aber etwas anderes, meistens etwas Engeres. Aus einem Befund an vierundfünfzig Personen im Labor wird „Studien zeigen", aus einer Modellrechnung eine Prognose, aus „in dieser Stichprobe" ein „grundsätzlich". Niemand hat gelogen, es ist unterwegs nur eine Einschränkung verlorengegangen, und die war der ganze Inhalt. Sorte drei ist die feinste: Die Quelle existiert, sagt genau das, und ist trotzdem der falsche Beleg. Eine Pressemitteilung über eine Studie ist nicht die Studie, und ein Preprint ist kein Ergebnis, sondern ein Angebot zur Diskussion.</w:t>
       </w:r>
     </w:p>
     <w:p>
@@ -12682,7 +12673,7 @@
         <w:ind w:firstLine="283"/>
       </w:pPr>
       <w:r>
-        <w:t>Zwei Handgriffe kommen dazu. Die Konsistenzprobe: dieselbe Frage anders formuliert, in einem neuen Chat, ohne Vorgeschichte. Weichen die Antworten in der Substanz ab, ist keine von beiden ein Beleg. Und die Fangfrage: Ich frage gelegentlich nach etwas, das es nicht gibt — einer Studie, die ich mir gerade ausgedacht habe, einer Funktion, die diese Software nicht hat. Was dann passiert, sagt mir mehr über den Zustand meines Werkzeugs als jede Ankündigung des Anbieters.</w:t>
+        <w:t>Dazu kommen die Konsistenzprobe und die Fangfrage. Konsistenzprobe heißt: dieselbe Frage anders formuliert, in einem neuen Chat, ohne Vorgeschichte. Weichen die Antworten in der Substanz ab, ist keine von beiden ein Beleg. Fangfrage heißt: Ich frage gelegentlich nach etwas, das es nicht gibt — einer Studie, die ich mir gerade ausgedacht habe, einer Funktion, die diese Software nicht hat. Was dann passiert, sagt mir mehr über den Zustand meines Werkzeugs als jede Ankündigung des Anbieters. Und lass dir die Gegenposition geben, ausdrücklich und in derselben Ausführlichkeit; nichts bringt eine dünne Antwort schneller ins Wanken.</w:t>
       </w:r>
     </w:p>
     <w:p>
@@ -12727,16 +12718,7 @@
         <w:ind w:firstLine="283"/>
       </w:pPr>
       <w:r>
-        <w:t>Zwei Handgriffe, die dabei mehr bringen als alles andere: Lass dir die Gegenposition geben, ausdrücklich und in derselben Ausführlichkeit. Und frag nach, woher etwas kommt, statt es zu übernehmen. Ein Modell, das eine Behauptung nicht auf eine überprüfbare Fundstelle zurückführen kann, hat dir gerade gesagt, dass du selbst nachschauen musst.</w:t>
-      </w:r>
-    </w:p>
-    <w:p>
-      <w:pPr>
-        <w:pStyle w:val="Fliesstext"/>
-        <w:ind w:firstLine="283"/>
-      </w:pPr>
-      <w:r>
-        <w:t>Ich habe für dieses Buch jede Zahl, die du in den Kapiteln findest, gegen die Originalquelle gehalten. Das sage ich dir nicht, um mir auf die Schulter zu klopfen, sondern weil es die Arbeit ist, die der Text im Fließtext unsichtbar macht — und weil dabei genau die Sorte-zwei-Fälle aufgetaucht sind, von denen ich oben geschrieben habe. Belege, die es gab. Die aber ein bisschen weniger sagten, als sie sollten.</w:t>
+        <w:t>Und frag nach, woher etwas kommt, statt es zu übernehmen. Ein Modell, das eine Behauptung nicht auf eine überprüfbare Fundstelle zurückführen kann, hat dir gerade gesagt, dass du selbst nachschauen musst. Ich habe für dieses Buch jede Zahl gegen die Originalquelle gehalten. Das sage ich nicht, um mir auf die Schulter zu klopfen, sondern weil dabei genau die Sorte-zwei-Fälle auftauchten: Belege, die es gab, die aber ein bisschen weniger sagten, als sie sollten.</w:t>
       </w:r>
     </w:p>
     <w:p>
@@ -12813,16 +12795,7 @@
         <w:ind w:firstLine="283"/>
       </w:pPr>
       <w:r>
-        <w:t>Für dich heißt das: Auf Bildartefakte zu starren ist die schlechtere Investition. Sechs Finger und komische Ohren waren gestern, und die aufwendige Fälschung ist ohnehin die Ausnahme. Was sich lohnt, ist die Kontextprüfung, und die kostet dich zwei Minuten.</w:t>
-      </w:r>
-    </w:p>
-    <w:p>
-      <w:pPr>
-        <w:pStyle w:val="Fliesstext"/>
-        <w:ind w:firstLine="283"/>
-      </w:pPr>
-      <w:r>
-        <w:t>Spiel sie an der Situation durch, in der sie vorkommt. In der Familiengruppe liegt ein Video. Vierzig Sekunden, wackelig, jemand sagt etwas Ungeheuerliches, darunter drei Ausrufezeichen und die Aufforderung, das zu teilen, bevor es gelöscht wird. Der erste Reflex ist, das Bild zu untersuchen. Der zweite wäre besser.</w:t>
+        <w:t>Für dich heißt das: Auf Bildartefakte zu starren ist die schlechtere Investition. Sechs Finger und komische Ohren waren gestern, und die aufwendige Fälschung ist ohnehin die Ausnahme. Was sich lohnt, ist die Kontextprüfung, und die kostet dich zwei Minuten. Spiel sie an der Situation durch, in der sie vorkommt: In der Familiengruppe liegt ein Video, vierzig Sekunden, wackelig, jemand sagt etwas Ungeheuerliches, darunter drei Ausrufezeichen und die Aufforderung, das zu teilen, bevor es gelöscht wird. Der erste Reflex ist, das Bild zu untersuchen. Der zweite ist besser.</w:t>
       </w:r>
     </w:p>
     <w:p>
@@ -12840,7 +12813,7 @@
         <w:ind w:firstLine="283"/>
       </w:pPr>
       <w:r>
-        <w:t>Diese Fragen sind aus drei Gründen die bessere Investition. Das meiste Material, das dich erreicht, ist gar keine KI-Fälschung, sondern echtes Material im falschen Rahmen — dagegen hilft kein Detektor, weil am Bild nichts zu erkennen ist. Artefakte veralten außerdem, während sich die Frage, wer etwas wann in Umlauf gebracht hat, nicht wegentwickeln lässt. Und die Kontextprüfung wirkt in beide Richtungen. In meinen Workshops erlebe ich es inzwischen häufiger, dass jemand ein echtes Foto für generiert erklärt, als dass jemand auf eine Fälschung hereinfällt. Das ist meine Beobachtung, keine Statistik, aber sie beunruhigt mich mehr als die andere Richtung. Wer alles für gefälscht hält, ist nicht kritisch, sondern nur nicht mehr ansprechbar.</w:t>
+        <w:t>Warum das die bessere Investition ist: Das meiste Material, das dich erreicht, ist gar keine KI-Fälschung, sondern echtes Material im falschen Rahmen, und dagegen hilft kein Detektor. Artefakte veralten außerdem, während sich die Frage, wer etwas wann in Umlauf gebracht hat, nicht wegentwickeln lässt. Und die Kontextprüfung wirkt in beide Richtungen. In meinen Workshops erlebe ich es inzwischen häufiger, dass jemand ein echtes Foto für generiert erklärt, als dass jemand auf eine Fälschung hereinfällt. Das ist meine Beobachtung, keine Statistik, aber sie beunruhigt mich mehr als die andere Richtung. Wer alles für gefälscht hält, ist nicht kritisch, sondern nur nicht mehr ansprechbar.</w:t>
       </w:r>
     </w:p>
     <w:p>
@@ -12858,7 +12831,7 @@
         <w:ind w:firstLine="283"/>
       </w:pPr>
       <w:r>
-        <w:t>Eine Sache hat sich dabei wirklich verschoben, und sie betrifft nicht die Politik, sondern deine Familie. Eine Stimme am Telefon ist kein Ausweis mehr. Der Enkeltrick funktionierte früher mit einer schlechten Verbindung und einem Namen, den das Opfer selbst eingeworfen hat; die schlechte Verbindung braucht es heute nicht mehr. Die Gegenmaßnahme ist unspektakulär und wirkt unabhängig davon, wie gut die Fälschung ist: ein Wort, das in der Familie abgemacht ist und nirgends steht. Dazu die alte Regel, die schon vor der KI galt — auflegen und auf der Nummer zurückrufen, die man kennt. Wir haben das bei uns besprochen, und ich empfehle es jedem, der ältere Angehörige hat.</w:t>
+        <w:t>Eine Sache hat sich dabei wirklich verschoben, und sie betrifft nicht die Politik, sondern deine Familie. Eine Stimme am Telefon ist kein Ausweis mehr. Der Enkeltrick brauchte früher eine schlechte Verbindung und einen Namen, den das Opfer selbst einwarf; die schlechte Verbindung braucht es heute nicht mehr. Die Gegenmaßnahme wirkt unabhängig davon, wie gut die Fälschung ist: ein Wort, das in der Familie abgemacht ist und nirgends steht, dazu die alte Regel, auf der Nummer zurückzurufen, die man kennt. Wir haben das bei uns besprochen, und ich empfehle es jedem, der ältere Angehörige hat.</w:t>
       </w:r>
     </w:p>
     <w:p>
@@ -12971,25 +12944,7 @@
         <w:ind w:firstLine="283"/>
       </w:pPr>
       <w:r>
-        <w:t>Wenn niemand haftet. Frag ruhig direkt, wer geradesteht, wenn das Ergebnis Schaden anrichtet. Wenn die Antwort ist, dass das System ja nur unterstützt und die Entscheidung beim Menschen liegt, dann prüf, ob dieser Mensch überhaupt in der Lage ist, die Entscheidung zu prüfen — oder ob er nur der ist, der klickt.</w:t>
-      </w:r>
-    </w:p>
-    <w:p>
-      <w:pPr>
-        <w:pStyle w:val="Fliesstext"/>
-        <w:ind w:firstLine="283"/>
-      </w:pPr>
-      <w:r>
-        <w:t>Wenn du das Ergebnis nicht prüfen kannst. Dazu habe ich oben alles gesagt.</w:t>
-      </w:r>
-    </w:p>
-    <w:p>
-      <w:pPr>
-        <w:pStyle w:val="Fliesstext"/>
-        <w:ind w:firstLine="283"/>
-      </w:pPr>
-      <w:r>
-        <w:t>Und wenn es keinen Ausschalter gibt. Kein Rückfall auf den alten Prozess, keine Möglichkeit, das Ding für zwei Wochen anzuhalten und trotzdem weiterzuarbeiten. Das ist das Kriterium, das in Projekten am häufigsten vergessen wird, und das teuerste.</w:t>
+        <w:t>Wenn niemand haftet. Frag ruhig direkt, wer geradesteht, wenn das Ergebnis Schaden anrichtet. Lautet die Antwort, das System unterstütze ja nur und die Entscheidung liege beim Menschen, dann prüf, ob dieser Mensch die Entscheidung überhaupt prüfen kann — oder ob er nur der ist, der klickt. Wenn du das Ergebnis nicht prüfen kannst; dazu habe ich oben alles gesagt. Und wenn es keinen Ausschalter gibt: kein Rückfall auf den alten Prozess, keine Möglichkeit, das Ding zwei Wochen anzuhalten und trotzdem weiterzuarbeiten. Das ist das Kriterium, das in Projekten am häufigsten vergessen wird, und das teuerste.</w:t>
       </w:r>
     </w:p>
     <w:p>
@@ -13283,7 +13238,7 @@
         <w:pStyle w:val="Fliesstext"/>
       </w:pPr>
       <w:r>
-        <w:t>Die Entwicklung, die ich strukturell für die gefährlichste halte, ist die Konzentration. Sehr wenige Organisationen bauen die großen Modelle, sehr wenige besitzen die Rechenzentren, in denen sie laufen, und sehr wenige verfügen über die Datenmengen, aus denen sie entstehen. Ich halte das für gefährlicher als alles andere in diesem Kapitel, weil es die Bedingung für alles andere ist. Wer entscheidet, was ein Modell darf, was es verweigert, was es kostet und wer es überhaupt bekommt, entscheidet nicht über ein Produkt. Er entscheidet über eine Infrastruktur.</w:t>
+        <w:t>Die Entwicklung, die ich strukturell für die gefährlichste halte, ist die Konzentration. Sehr wenige Organisationen bauen die großen Modelle, sehr wenige besitzen die Rechenzentren, in denen sie laufen, sehr wenige verfügen über die Datenmengen, aus denen sie entstehen. Gefährlicher als alles andere in diesem Kapitel ist das, weil es die Bedingung für alles andere ist. Wer entscheidet, was ein Modell darf, was es verweigert, was es kostet und wer es überhaupt bekommt, entscheidet nicht über ein Produkt. Er entscheidet über eine Infrastruktur.</w:t>
       </w:r>
     </w:p>
     <w:p>
@@ -13328,7 +13283,7 @@
         <w:ind w:firstLine="283"/>
       </w:pPr>
       <w:r>
-        <w:t xml:space="preserve">Ein ehrlicher Gegenpunkt gehört dazu: Die Energieeffizienz pro KI-Aufgabe verbessert sich nach Einschätzung derselben Agentur in einem Tempo, das in der Energiegeschichte beispiellos ist.[23] Nur entkonzentriert das nichts. Es macht die </w:t>
+        <w:t xml:space="preserve">Ein ehrlicher Gegenpunkt gehört dazu: Die Energieeffizienz pro KI-Aufgabe verbessert sich nach Einschätzung derselben Agentur in beispiellosem Tempo.[23] Nur entkonzentriert das nichts. Es macht die </w:t>
       </w:r>
       <w:r>
         <w:rPr>
@@ -13337,7 +13292,7 @@
         <w:t>Nutzung</w:t>
       </w:r>
       <w:r>
-        <w:t xml:space="preserve"> billiger, während die Spitze weiterwandert. Am unteren Ende kannst du deshalb heute sehr viel mehr machen als vor drei Jahren — und die Frage, wem das obere Ende gehört, ist unverändert.</w:t>
+        <w:t xml:space="preserve"> billiger, während die Spitze weiterwandert. Am unteren Ende kannst du heute viel mehr machen als vor drei Jahren — die Frage, wem das obere Ende gehört, ist unverändert.</w:t>
       </w:r>
     </w:p>
     <w:p>
@@ -13454,16 +13409,16 @@
         <w:t>On the Dangers of Stochastic Parrots</w:t>
       </w:r>
       <w:r>
-        <w:t xml:space="preserve"> von Emily Bender, Timnit Gebru, Angelina McMillan-Major und Margaret Mitchell, das große Sprachmodelle als „stochastische Papageien" beschrieb und auf Bias, Ressourcenkosten und die Verdrängung kritischer Forschung hinwies.[7] Der Streit um dieses Papier führte im Dezember 2020 zu Gebrus Abgang bei Google; Mitchell wurde rund zwei Monate später entlassen.[8] Man kann über die Umstände streiten, und die Beteiligten tun das bis heute. Was nicht strittig ist: Die kritische Erforschung einer Technologie fand in dem Haus statt, das die Technologie baut und verkauft.</w:t>
-      </w:r>
-    </w:p>
-    <w:p>
-      <w:pPr>
-        <w:pStyle w:val="Fliesstext"/>
-        <w:ind w:firstLine="283"/>
-      </w:pPr>
-      <w:r>
-        <w:t>Und jetzt nimm die verdoppelte Zahl der Sicherheitsrahmenwerke von vorhin dazu.[22] Ich halte die nicht für Fassade, da steckt ernsthafte Arbeit drin. Es sind aber Selbstverpflichtungen, geschrieben in denselben Häusern, deren Produkte sie einhegen sollen, von Leuten, deren Gehalt aus demselben Topf kommt. Kein Prüfsiegel an einem Stecker funktioniert so. Genau das ist die Konzentration, von der ich rede. Sie äußert sich nicht als Weltherrschaft. Sie äußert sich darin, wer die Fragen stellen darf, wer sie bezahlt und wer den Antwortenden kündigen kann.</w:t>
+        <w:t xml:space="preserve"> von Emily Bender, Timnit Gebru, Angelina McMillan-Major und Margaret Mitchell, das große Sprachmodelle als „stochastische Papageien" beschrieb und auf Bias, Ressourcenkosten und die Verdrängung kritischer Forschung hinwies.[7] Der Streit um dieses Papier führte im Dezember 2020 zu Gebrus Abgang bei Google; Mitchell wurde rund zwei Monate später entlassen.[8] Über die Umstände streiten die Beteiligten bis heute. Nicht strittig ist: Die kritische Erforschung einer Technologie fand in dem Haus statt, das die Technologie baut und verkauft.</w:t>
+      </w:r>
+    </w:p>
+    <w:p>
+      <w:pPr>
+        <w:pStyle w:val="Fliesstext"/>
+        <w:ind w:firstLine="283"/>
+      </w:pPr>
+      <w:r>
+        <w:t>Und jetzt nimm die verdoppelte Zahl der Sicherheitsrahmenwerke dazu.[22] Ich halte die nicht für Fassade, da steckt ernsthafte Arbeit drin. Es sind aber Selbstverpflichtungen, geschrieben in denselben Häusern, deren Produkte sie einhegen sollen, von Leuten, deren Gehalt aus demselben Topf kommt. Kein Prüfsiegel an einem Stecker funktioniert so. Genau das ist die Konzentration, von der ich rede. Sie äußert sich nicht als Weltherrschaft, sondern darin, wer die Fragen stellen darf, wer sie bezahlt und wer den Antwortenden kündigen kann.</w:t>
       </w:r>
     </w:p>
     <w:p>
@@ -13497,7 +13452,7 @@
         <w:ind w:firstLine="283"/>
       </w:pPr>
       <w:r>
-        <w:t>Eine verbreitete Annahme muss ich an dieser Stelle korrigieren, auch meine eigene frühere. Die Exposition ist nicht in den armen Ländern am höchsten, sondern in den reichen: 34 Prozent der Beschäftigung in Hocheinkommensländern gegenüber 11 Prozent in Niedrigeinkommensländern.[9] Der IWF kommt zu einem ähnlichen Bild, rund 40 Prozent der Jobs weltweit exponiert, in fortgeschrittenen Volkswirtschaften etwa 60 Prozent, in Niedrigeinkommensländern etwa 26 Prozent — und warnt trotzdem vor wachsender Ungleichheit.[10] Bei diesen 60 Prozent steht in derselben Analyse eine Aufschlüsselung, die man nicht überlesen sollte: Etwa die Hälfte davon läuft Gefahr, dass Arbeitsnachfrage und Löhne sinken; die andere Hälfte kann profitieren.[26]</w:t>
+        <w:t>Eine verbreitete Annahme muss ich an dieser Stelle korrigieren, auch meine eigene frühere. Die Exposition ist nicht in den armen Ländern am höchsten, sondern in den reichen: 34 Prozent der Beschäftigung in Hocheinkommensländern gegenüber 11 Prozent in Niedrigeinkommensländern.[9] Der IWF kommt zu einem ähnlichen Bild, rund 40 Prozent der Jobs weltweit exponiert, in fortgeschrittenen Volkswirtschaften etwa 60 Prozent, in Niedrigeinkommensländern etwa 26 Prozent — und warnt trotzdem vor wachsender Ungleichheit.[10] Zu diesen 60 Prozent steht dort eine Aufschlüsselung, die man nicht überlesen sollte: Etwa die Hälfte läuft Gefahr, dass Arbeitsnachfrage und Löhne sinken; die andere Hälfte kann profitieren.[26]</w:t>
       </w:r>
     </w:p>
     <w:p>
@@ -13630,7 +13585,7 @@
         <w:ind w:firstLine="283"/>
       </w:pPr>
       <w:r>
-        <w:t>Der eine Befund ist solide, der andere ein Hinweis. Zusammen beschreiben sie etwas, das ich an mir selbst beobachte. Ich baue mir abends mit Claude Code kleine Werkzeuge für meinen Alltag, und ich merke, wie sich mein Prüfverhalten verschiebt. Am Anfang liest man jede Zeile. Nach dem zwanzigsten Mal, in dem es funktioniert hat, liest man die Zeilen quer. Nach dem fünfzigsten Mal übernimmt man. Das ist keine Faulheit, das ist ein völlig vernünftiger Umgang mit begrenzter Aufmerksamkeit — und genau deshalb passiert es einem, ohne dass man es entscheidet. Es gibt keinen Tag, an dem du beschließt, nicht mehr hinzusehen. Es gibt nur einen Tag, an dem du es das letzte Mal getan hast, und du merkst ihn nicht.</w:t>
+        <w:t>Der eine Befund ist solide, der andere ein Hinweis. Zusammen beschreiben sie etwas, das ich an mir selbst beobachte. Ich baue mir abends mit Claude Code kleine Werkzeuge für meinen Alltag, und mein Prüfverhalten verschiebt sich. Am Anfang liest man jede Zeile. Nach dem zwanzigsten Mal, in dem es funktioniert hat, liest man quer. Nach dem fünfzigsten übernimmt man. Das ist keine Faulheit, sondern ein vernünftiger Umgang mit begrenzter Aufmerksamkeit — und genau deshalb passiert es einem, ohne dass man es entscheidet. Es gibt keinen Tag, an dem du beschließt, nicht mehr hinzusehen. Nur einen, an dem du es das letzte Mal getan hast, und den merkst du nicht.</w:t>
       </w:r>
     </w:p>
     <w:p>
@@ -13718,7 +13673,7 @@
         <w:ind w:firstLine="283"/>
       </w:pPr>
       <w:r>
-        <w:t>Die Autorinnen des Papiers über die stochastischen Papageien haben unter anderem argumentiert, dass die Fixierung auf immer größere Modelle Forschung verdrängt, die sich mit den bereits eingetretenen Schäden befasst.[7] Ich lese das, in Verbindung mit dem, was ich in Kapitel 9 über das Lesen von Prognosen geschrieben habe, als das stärkste Argument der Debatte, und ich mache es mir zu eigen: Solange öffentlich über die Auslöschung der Menschheit in dreißig Jahren gestritten wird, streitet niemand darüber, wem die Rechenzentren gehören, wer beim Berufseinstieg keine Stelle mehr findet und was passiert, wenn eine Behörde eine Entscheidung nicht mehr erklären kann. Das ist eine Debatte über die ferne Zukunft, geführt zu Lasten der Gegenwart. Ob das Absicht ist oder Bequemlichkeit, weiß ich nicht, und ich behaupte es auch nicht. Die Wirkung ist dieselbe.</w:t>
+        <w:t>Die Autorinnen des Papiers über die stochastischen Papageien haben argumentiert, dass die Fixierung auf immer größere Modelle Forschung verdrängt, die sich mit den bereits eingetretenen Schäden befasst.[7] Zusammen mit dem, was in Kapitel 9 über das Lesen von Prognosen steht, halte ich das für das stärkste Argument der Debatte, und ich mache es mir zu eigen: Solange öffentlich über die Auslöschung der Menschheit in dreißig Jahren gestritten wird, streitet niemand darüber, wem die Rechenzentren gehören, wer beim Berufseinstieg keine Stelle mehr findet und was passiert, wenn eine Behörde eine Entscheidung nicht mehr erklären kann. Eine Debatte über die ferne Zukunft, geführt zu Lasten der Gegenwart. Ob das Absicht ist oder Bequemlichkeit, weiß ich nicht und behaupte es auch nicht. Die Wirkung ist dieselbe.</w:t>
       </w:r>
     </w:p>
     <w:p>
@@ -13806,7 +13761,7 @@
         <w:t>Was Gesellschaft und Politik tun können.</w:t>
       </w:r>
       <w:r>
-        <w:t xml:space="preserve"> Der europäische Rechtsrahmen ist trotz aller Kritik der ernsthafteste Versuch, das Problem risikobasiert statt pauschal anzugehen: verbotene Praktiken seit Februar 2025, Pflichten für Modelle mit allgemeinem Verwendungszweck seit August 2025, der Großteil der Hochrisiko-Regeln ab August 2026, volle Anwendbarkeit 2027, Bußgelder bis zu 35 Millionen Euro oder sieben Prozent des weltweiten Jahresumsatzes.[3] Ich habe in Kapitel 8 gesagt, wo ich ihn für zu schwerfällig halte, und dabei bleibe ich. Aber die Grundidee — nicht die Technik regulieren, sondern ihren Einsatz nach Schadenspotenzial — ist richtig, und die gestaffelten Fristen sind selbst ein Stück Collingridge: Sie lassen Raum zum Nachbessern, statt alles auf einen Stichtag zu legen.</w:t>
+        <w:t xml:space="preserve"> Der europäische Rechtsrahmen ist trotz aller Kritik der ernsthafteste Versuch, das Problem risikobasiert statt pauschal anzugehen: verbotene Praktiken seit Februar 2025, Pflichten für Modelle mit allgemeinem Verwendungszweck seit August 2025, der Großteil der Hochrisiko-Regeln ab August 2026, volle Anwendbarkeit 2027, Bußgelder bis zu 35 Millionen Euro oder sieben Prozent des weltweiten Jahresumsatzes.[3] Wo ich ihn für zu schwerfällig halte, steht in Kapitel 8, und dabei bleibe ich. Aber die Grundidee — nicht die Technik regulieren, sondern ihren Einsatz nach Schadenspotenzial — ist richtig, und die gestaffelten Fristen sind selbst ein Stück Collingridge: Raum zum Nachbessern, statt alles auf einen Stichtag zu legen.</w:t>
       </w:r>
     </w:p>
     <w:p>
@@ -13833,7 +13788,7 @@
         <w:ind w:firstLine="283"/>
       </w:pPr>
       <w:r>
-        <w:t>Und der Mut, Verteilungsfragen als Verteilungsfragen zu behandeln. Immerhin gibt es dazu inzwischen Empirie statt nur Meinung: Die große amerikanische Grundeinkommensstudie mit 1.000 Teilnehmenden über drei Jahre fand mehr Handlungsfähigkeit — Gründungen, Bildung, Vorsorge, medizinische Versorgung — bei nur geringem Effekt auf die Arbeitszeit.[19] Das beweist nicht, dass wir ein Grundeinkommen brauchen; die These „KI zerstört die Arbeit" ist damit nicht belegt. Es beweist, dass man über Verteilung mit Daten reden kann statt mit Reflexen.</w:t>
+        <w:t>Und der Mut, Verteilungsfragen als Verteilungsfragen zu behandeln. Dazu gibt es inzwischen Empirie statt nur Meinung: Die große amerikanische Grundeinkommensstudie mit 1.000 Teilnehmenden über drei Jahre fand mehr Handlungsfähigkeit — Gründungen, Bildung, Vorsorge, medizinische Versorgung — bei nur geringem Effekt auf die Arbeitszeit.[19] Das beweist nicht, dass wir ein Grundeinkommen brauchen; die These „KI zerstört die Arbeit" ist damit nicht belegt. Es beweist, dass man über Verteilung mit Daten reden kann statt mit Reflexen.</w:t>
       </w:r>
     </w:p>
     <w:p>
@@ -13876,16 +13831,16 @@
         <w:ind w:firstLine="283"/>
       </w:pPr>
       <w:r>
-        <w:t>Aber ich bin ein Optimist mit einer Fußnote, und die Fußnote ist der Grund für dieses ganze Buch: Die guten Ausgänge kamen nie von allein. Nach dem Buchdruck wuchsen die Register, die Kataloge, die Quellenkritik, das Urheberrecht, die Pressefreiheit — jedes einzelne Stück davon erdacht, erstritten, oft gegen Widerstand durchgesetzt. Nach der Elektrifizierung kamen Normen, Prüfsiegel, Netzregulierung, ohne die niemand von uns eine Steckdose berühren würde. Die Bilanz zur KI-Arbeitswelt sieht heute gar nicht schlecht aus; die OECD findet bislang wenig Belege für breite Jobverluste, und zwei Drittel derjenigen, die bereits mit KI arbeiten, empfinden ihre Arbeit als weniger monoton oder gefährlich.[20] Ich glaube, dass das so bleiben kann. Ich glaube nur nicht, dass es so bleibt, weil es von selbst so bleibt.</w:t>
-      </w:r>
-    </w:p>
-    <w:p>
-      <w:pPr>
-        <w:pStyle w:val="Fliesstext"/>
-        <w:ind w:firstLine="283"/>
-      </w:pPr>
-      <w:r>
-        <w:t>Ein Unterschied zu Gutenberg stimmt mich dabei zuversichtlicher, als dieses Kapitel bisher klingt. Register und Quellenkritik brauchten nach dem Buchdruck Generationen, weil niemand wusste, dass so etwas nötig sein würde. Wir wissen es. Wir haben die Muster, wir haben die Daten, und wir reden über Fristen in Jahren statt in Jahrhunderten. Das ist keine Garantie. Es ist ein Vorsprung, den keine Gesellschaft vor uns hatte.</w:t>
+        <w:t>Aber ich bin ein Optimist mit einer Fußnote, und die Fußnote ist der Grund für dieses ganze Buch: Die guten Ausgänge kamen nie von allein. Nach dem Buchdruck wuchsen Register, Kataloge, Quellenkritik, Urheberrecht, Pressefreiheit — jedes Stück davon erdacht, erstritten, oft gegen Widerstand durchgesetzt. Nach der Elektrifizierung kamen Normen, Prüfsiegel, Netzregulierung, ohne die niemand von uns eine Steckdose berühren würde. Die Bilanz zur KI-Arbeitswelt sieht heute gar nicht schlecht aus; die OECD findet bislang wenig Belege für breite Jobverluste, und zwei Drittel derjenigen, die bereits mit KI arbeiten, empfinden ihre Arbeit als weniger monoton oder gefährlich.[20] Das kann so bleiben. Es bleibt nur nicht so, weil es von selbst so bleibt.</w:t>
+      </w:r>
+    </w:p>
+    <w:p>
+      <w:pPr>
+        <w:pStyle w:val="Fliesstext"/>
+        <w:ind w:firstLine="283"/>
+      </w:pPr>
+      <w:r>
+        <w:t>Ein Unterschied zu Gutenberg stimmt mich zuversichtlicher, als dieses Kapitel bisher klingt. Register und Quellenkritik brauchten Generationen, weil niemand wusste, dass so etwas nötig sein würde. Wir wissen es. Wir haben die Muster, wir haben die Daten, und wir reden über Fristen in Jahren statt in Jahrhunderten. Keine Garantie — aber ein Vorsprung, den keine Gesellschaft vor uns hatte.</w:t>
       </w:r>
     </w:p>
     <w:p>
@@ -20194,7 +20149,7 @@
         <w:t>Gender Shades: Intersectional Accuracy Disparities in Commercial Gender Classification</w:t>
       </w:r>
       <w:r>
-        <w:t>, PMLR / Conference on Fairness, Accountability and Transparency, 2018. — Drei kommerzielle Systeme zur Geschlechtsklassifikation; höchste Fehlerrate bei dunkelhäutigen Frauen bis 34,7 %, niedrigste bei hellhäutigen Männern 0,8 %. Die im Text angeschlossene Folgerung („der Durchschnitt versteckt das Problem", Frage nach der schlechtesten Gruppe in der Abnahme) ist Schlussfolgerung des Autors, keine Aussage der Studie. → QUELLEN.md Nr. 79.</w:t>
+        <w:t>, PMLR / FAccT 2018. — Drei kommerzielle Systeme zur Geschlechtsklassifikation; Fehlerrate bei dunkelhäutigen Frauen bis 34,7 %, bei hellhäutigen Männern 0,8 %. Die angeschlossene Folgerung („der Durchschnitt versteckt das Problem") ist Schluss des Autors, keine Aussage der Studie. → QUELLEN.md Nr. 79.</w:t>
       </w:r>
     </w:p>
     <w:p>
@@ -20211,7 +20166,7 @@
         <w:t>The Impact of AI on Developer Productivity: Evidence from GitHub Copilot</w:t>
       </w:r>
       <w:r>
-        <w:t>, 2023, arXiv:2302.06590. — Randomisiertes Experiment, Implementierung eines HTTP-Servers in JavaScript; Gruppe mit Copilot rund 56 % schneller (71 vs. 160 Minuten). Nicht begutachtetes Arbeitspapier, Laborsetting — im Text ausdrücklich gekennzeichnet. Die Gegenüberstellung mit dem METR-Ergebnis [4] ist die Deutung des Autors. → QUELLEN.md Nr. 56.</w:t>
+        <w:t>, 2023, arXiv:2302.06590. — Randomisiertes Experiment (HTTP-Server in JavaScript); Copilot-Gruppe rund 56 % schneller (71 vs. 160 Min.). Nicht begutachtetes Arbeitspapier, Laborsetting — im Text gekennzeichnet; die Gegenüberstellung mit [4] ist Deutung des Autors. → QUELLEN.md Nr. 56.</w:t>
       </w:r>
     </w:p>
     <w:p>
@@ -20228,7 +20183,7 @@
         <w:t>From Chalkboards to Chatbots: Transforming Learning in Nigeria</w:t>
       </w:r>
       <w:r>
-        <w:t>, 2024/2025. — Randomisierter Pilot in Edo State, ca. 800 Schülerinnen und Schüler, sechs Wochen Nachmittagsunterricht in Englisch mit GPT-4/Copilot als Tutor; Lernzuwachs von der Weltbank mit etwa zwei Jahren regulärer Schulbildung verglichen, ca. 48 USD pro Schüler:in. Einschränkungen (kleiner Pilot, kurze Dauer, offene Skalierbarkeit) sind im Text genannt. → QUELLEN.md Nr. 65.</w:t>
+        <w:t>, 2024/2025. — Randomisierter Pilot in Edo State, ca. 800 Schüler:innen, sechs Wochen, GPT-4/Copilot als Tutor; Lernzuwachs von der Weltbank mit etwa zwei Jahren regulärer Schulbildung verglichen. Einschränkungen im Text genannt. → QUELLEN.md Nr. 65.</w:t>
       </w:r>
     </w:p>
     <w:p>
@@ -20239,10 +20194,10 @@
         <w:rPr>
           <w:i/>
         </w:rPr>
-        <w:t>Nicht belegt und daher im Text ausdrücklich als Erfahrung, Angewohnheit oder Haltung des Autors gekennzeichnet:</w:t>
-      </w:r>
-      <w:r>
-        <w:t xml:space="preserve"> die Flur-Szene nach dem Workshop; sämtliche Projektszenen (der Ausnahmen-Workshop zum leeren Feld, der Schattenbetrieb, die Rückfrage nach zurückgeschickten Fällen, die Excel-Liste in der Abteilung); die Grenze beim Übersetzen von Amtsbriefen für die eigene Mutter; die Warnsignale für plausible Falschantworten, die Konsistenzprobe und die Fangfrage; die Beobachtung, dass in Workshops eher echtes Material für generiert erklärt wird als umgekehrt; das Familien-Codewort gegen Stimmfälschungen; sämtliche Empfehlungen an Organisationen und an Jugendliche.</w:t>
+        <w:t>Nicht belegt und daher im Text als Erfahrung, Angewohnheit oder Haltung des Autors gekennzeichnet:</w:t>
+      </w:r>
+      <w:r>
+        <w:t xml:space="preserve"> die Flur-Szene nach dem Workshop; sämtliche Projektszenen; die Grenze beim Übersetzen von Amtsbriefen für die eigene Mutter; die Warnsignale für plausible Falschantworten, Konsistenzprobe und Fangfrage; die Beobachtung aus Workshops zu für generiert erklärtem echtem Material; das Familien-Codewort gegen Stimmfälschungen; sämtliche Empfehlungen an Organisationen und an Jugendliche.</w:t>
       </w:r>
     </w:p>
     <w:p>
@@ -20307,7 +20262,7 @@
         <w:rPr>
           <w:i/>
         </w:rPr>
-        <w:t>Der Inhalt der GPAI-Pflichten wird im Text bewusst nicht referiert; belegt ist hier nur die Existenz der Kategorie und ihr Anwendungsdatum. Die Deutung „eigene Kategorie = Nadelöhr" ist als Deutung des Autors gekennzeichnet.</w:t>
+        <w:t>Der Inhalt der GPAI-Pflichten wird im Text bewusst nicht referiert; belegt ist nur die Existenz der Kategorie und ihr Anwendungsdatum.</w:t>
       </w:r>
     </w:p>
     <w:p>
@@ -20684,13 +20639,13 @@
         <w:t>International AI Safety Report 2025</w:t>
       </w:r>
       <w:r>
-        <w:t xml:space="preserve"> (Bengio u. a.) sowie Berichterstattung zu den Fortschreibungen 2025/2026. — Belegte Missbrauchsrisiken: Erleichterung und Beschleunigung von Cyberangriffen mit demonstrierten Fähigkeiten bei Aufgaben geringer und mittlerer Komplexität; im Bereich Bio/Chemie „einige Fähigkeit" bei Anleitung und Fehlerbehebung zu bekannten Waffen; 2025 veröffentlichten mehrere Anbieter Modelle bewusst mit zusätzlichen Sicherheitsvorkehrungen, weil Tests vor der Veröffentlichung eine substanzielle Hilfe für Laien nicht ausschließen konnten. → QUELLEN.md Nr. 73, 74. </w:t>
+        <w:t xml:space="preserve"> (Bengio u. a.) sowie Berichterstattung zu den Fortschreibungen 2025/2026. — Belegte Missbrauchsrisiken: Erleichterung und Beschleunigung von Cyberangriffen bei Aufgaben geringer und mittlerer Komplexität; im Bereich Bio/Chemie „einige Fähigkeit" bei Anleitung und Fehlerbehebung zu bekannten Waffen; 2025 veröffentlichten mehrere Anbieter Modelle mit zusätzlichen Sicherheitsvorkehrungen, weil Tests eine substanzielle Hilfe für Laien nicht ausschließen konnten. → QUELLEN.md Nr. 73, 74. </w:t>
       </w:r>
       <w:r>
         <w:rPr>
           <w:b/>
         </w:rPr>
-        <w:t>Die Angabe zu den Zusatz-Safeguards 2025 stammt aus der Berichterstattung über die Fortschreibungen; vor Drucklegung am Originalbericht verifizieren.</w:t>
+        <w:t>Die Angabe zu den Zusatz-Safeguards 2025 stammt aus der Berichterstattung; vor Drucklegung am Originalbericht verifizieren.</w:t>
       </w:r>
     </w:p>
     <w:p>
@@ -20707,13 +20662,7 @@
         <w:t>International AI Safety Report 2025 — Second Key Update: Technical Safeguards and Risk Management</w:t>
       </w:r>
       <w:r>
-        <w:t xml:space="preserve">, arXiv:2511.19863. — Zahl der Unternehmen mit veröffentlichten Frontier-AI-Safety-Frameworks seit Anfang 2025 mehr als verdoppelt; zugleich „significant gaps remain". → QUELLEN.md Nr. 74. — </w:t>
-      </w:r>
-      <w:r>
-        <w:rPr>
-          <w:i/>
-        </w:rPr>
-        <w:t>Die Einordnung als Selbstverpflichtung aus demselben Haus ist eine Wertung des Autors.</w:t>
+        <w:t>, arXiv:2511.19863. — Zahl der Unternehmen mit veröffentlichten Frontier-AI-Safety-Frameworks seit Anfang 2025 mehr als verdoppelt; zugleich „significant gaps remain". → QUELLEN.md Nr. 74.</w:t>
       </w:r>
     </w:p>
     <w:p>
@@ -20738,15 +20687,6 @@
         </w:rPr>
         <w:t>2025er-Zuwachszahl und Energiequellen-Aufteilung vor Drucklegung an der IEA-Primärquelle gegenlesen.</w:t>
       </w:r>
-      <w:r>
-        <w:t xml:space="preserve"> — </w:t>
-      </w:r>
-      <w:r>
-        <w:rPr>
-          <w:i/>
-        </w:rPr>
-        <w:t>Die Deutung des Ausbaus als Verhandlungsposition gegenüber Netzbetreibern, Kommunen und Regierungen ist eine Einschätzung des Autors.</w:t>
-      </w:r>
     </w:p>
     <w:p>
       <w:pPr>
@@ -20762,13 +20702,7 @@
         <w:t>Opinion 28/2024</w:t>
       </w:r>
       <w:r>
-        <w:t xml:space="preserve"> (personenbezogene Daten im Kontext von KI-Modellen), 17.12.2024. — Anonymität im Einzelfall zu prüfen; berechtigtes Interesse nur nach dreistufigem Test; ursprünglich unrechtmäßige Verarbeitung kann die weitere Nutzung des Modells beeinträchtigen. → QUELLEN.md Nr. 85. — </w:t>
-      </w:r>
-      <w:r>
-        <w:rPr>
-          <w:i/>
-        </w:rPr>
-        <w:t>Die Folgerung, dass Rechtsrisiko als Fixkostenblock größere Anbieter begünstigt, ist als Lesart des Autors markiert.</w:t>
+        <w:t xml:space="preserve"> (personenbezogene Daten im Kontext von KI-Modellen), 17.12.2024. — Anonymität im Einzelfall zu prüfen; berechtigtes Interesse nur nach dreistufigem Test; ursprünglich unrechtmäßige Verarbeitung kann die weitere Nutzung des Modells beeinträchtigen. → QUELLEN.md Nr. 85.</w:t>
       </w:r>
     </w:p>
     <w:p>
@@ -20785,7 +20719,7 @@
         <w:t>Gender Shades: Intersectional Accuracy Disparities in Commercial Gender Classification</w:t>
       </w:r>
       <w:r>
-        <w:t>, PMLR / FAccT 2018. — Drei kommerzielle Systeme; Fehlerrate bei dunkelhäutigen Frauen bis 34,7 %, bei hellhäutigen Männern 0,8 %; Nachweis verzerrter Trainingsdatensätze; maßgeblicher Anstoß für die Debatte um repräsentative Daten. → QUELLEN.md Nr. 79.</w:t>
+        <w:t>, PMLR / FAccT 2018. — Drei kommerzielle Systeme; Fehlerrate bei dunkelhäutigen Frauen bis 34,7 %, bei hellhäutigen Männern 0,8 %; verzerrte Trainingsdatensätze; Anstoß für die Debatte um repräsentative Daten. → QUELLEN.md Nr. 79.</w:t>
       </w:r>
     </w:p>
     <w:p>
@@ -20882,13 +20816,7 @@
         <w:t>Technology Assessment Act of 1972</w:t>
       </w:r>
       <w:r>
-        <w:t xml:space="preserve">, Betrieb 1974–1995, rund 750 Studien, 1995 abgeschafft; Büro für Technikfolgen-Abschätzung beim Deutschen Bundestag (TAB), gegründet 1990, betrieben vom ITAS am KIT. → QUELLEN.md Nr. 52. — </w:t>
-      </w:r>
-      <w:r>
-        <w:rPr>
-          <w:i/>
-        </w:rPr>
-        <w:t>Die Forderung nach Ausstattung und Zugangsrechten ist eine Position des Autors.</w:t>
+        <w:t>, Betrieb 1974–1995, rund 750 Studien, 1995 abgeschafft; Büro für Technikfolgen-Abschätzung beim Deutschen Bundestag (TAB), gegründet 1990, betrieben vom ITAS am KIT. → QUELLEN.md Nr. 52.</w:t>
       </w:r>
     </w:p>
     <w:p>
@@ -20902,7 +20830,7 @@
         <w:t>Nicht belegt und daher im Text ausdrücklich als persönliche Erfahrung, Einschätzung oder Forderung des Autors gekennzeichnet:</w:t>
       </w:r>
       <w:r>
-        <w:t xml:space="preserve"> die Workshop-Szene und die Rückfrage der Kollegin; die Beobachtung zum nachlassenden Prüfverhalten bei selbstgebauten Werkzeugen; die Szene vom Vier-Augen-Prinzip, das zu null Augen wird, und die These, dass Formulierungsqualität als Hinweis auf gedankliche Arbeit entwertet ist; die Einschätzung, dass Kapitalintensität an der Modellspitze konzentrierend wirkt (Marktanteils- und Compute-Zahlen wurden für dieses Buch </w:t>
+        <w:t xml:space="preserve"> die Workshop-Szene; die Beobachtung zum nachlassenden Prüfverhalten bei selbstgebauten Werkzeugen; die Szene vom Vier-Augen-Prinzip, das zu null Augen wird, samt der These, dass Formulierungsqualität als Hinweis auf gedankliche Arbeit entwertet ist; die Einschätzung, dass Kapitalintensität an der Modellspitze konzentrierend wirkt (Marktanteils- und Compute-Zahlen wurden für dieses Buch </w:t>
       </w:r>
       <w:r>
         <w:rPr>
@@ -20911,7 +20839,7 @@
         <w:t>nicht</w:t>
       </w:r>
       <w:r>
-        <w:t xml:space="preserve"> belastbar recherchiert und werden deshalb bewusst nicht genannt); die Deutung der GPAI-Kategorie als Hinweis auf ein Nadelöhr; die Lesart, dass Rechts- und Compliance-Kosten als Marktzutrittsschranke wirken; die Deutung, warum Edisons Angstkampagne scheiterte, samt Kehrseite; die Schlussfolgerung, dass der Rechenzentrumsausbau bestehende Gefälle verstärkt; die Deutung der Weltuntergangsdebatte als Ablenkung; die Forderungen nach Wettbewerbsrecht, nach Austauschbarkeit in der öffentlichen Beschaffung und nach handlungsfähiger Technikfolgenabschätzung; sämtliche Handlungsempfehlungen an Unternehmen.</w:t>
+        <w:t xml:space="preserve"> belastbar recherchiert und werden bewusst nicht genannt); die Deutung des Rechenzentrumsausbaus als Verhandlungsposition gegenüber Netzbetreibern, Kommunen und Regierungen und als Verstärker bestehender Gefälle; die Deutung der GPAI-Kategorie als Hinweis auf ein Nadelöhr; die Lesart, dass Rechts- und Compliance-Kosten als Marktzutrittsschranke wirken; die Deutung, warum Edisons Angstkampagne scheiterte, samt Kehrseite; die Einordnung der Sicherheitsrahmenwerke als Selbstverpflichtung; die Deutung der Weltuntergangsdebatte als Ablenkung; die Forderungen nach Wettbewerbsrecht, nach Austauschbarkeit in der öffentlichen Beschaffung und nach handlungsfähiger Technikfolgenabschätzung; sämtliche Handlungsempfehlungen an Unternehmen.</w:t>
       </w:r>
     </w:p>
     <w:sectPr>

</xml_diff>

<commit_message>
Kapitel 11 und 12: finale Fassung der Ausbau-Agents
Kap 12 auf 6.546 W neu gefasst (Machtkonzentration ueber vier Engpaesse
hergeleitet, historische Call-backs weiterentwickelt statt wiederholt,
Beleglueke bei Compute-Zahlen weiterhin offengelegt). QUELLEN.md Nr. 165.
Verweise geprueft: lueckenlos, keine Doppelten. Word-Manuskript und
Pruefliste neu gebaut.

Co-Authored-By: Claude Opus 4.8 <noreply@anthropic.com>
Claude-Session: https://claude.ai/code/session_0134ACJs5QwNt7TBrqmWZELo
</commit_message>
<xml_diff>
--- a/04_produktion/Erst_kam_die_Angst_Manuskript.docx
+++ b/04_produktion/Erst_kam_die_Angst_Manuskript.docx
@@ -12524,7 +12524,7 @@
         <w:ind w:firstLine="283"/>
       </w:pPr>
       <w:r>
-        <w:t>Das zweite ist die Umkehrbarkeit. Ein Entwurf im Postausgang und dieselbe Mail beim Kunden sind nicht dasselbe Risiko, auch wenn der Text identisch ist. Zwischen einem Vorschlag, den jemand bestätigt, und einer Buchung, die das System selbst auslöst, liegt eine Klickstrecke, und die entscheidet, ob ein Fehler eine Korrektur wird oder ein Storno mit Aktenvermerk.</w:t>
+        <w:t>Das zweite ist die Umkehrbarkeit. Ein Entwurf im Postausgang und dieselbe Mail beim Kunden sind nicht dasselbe Risiko, auch wenn der Text identisch ist; zwischen einem Vorschlag, den jemand bestätigt, und einer Buchung, die das System selbst auslöst, liegt eine Klickstrecke, und die entscheidet, ob ein Fehler eine Korrektur wird oder ein Storno mit Aktenvermerk.</w:t>
       </w:r>
     </w:p>
     <w:p>
@@ -12542,7 +12542,7 @@
         <w:ind w:firstLine="283"/>
       </w:pPr>
       <w:r>
-        <w:t>Woran erkennst du im Alltag, in welchem Feld du bist? Ich benutze zwei Fragen. Erstens: Woran würde ich merken, dass das falsch ist? Fällt dir darauf keine Antwort ein, hast du kein Werkzeugproblem, sondern ein Prüfproblem, und das musst du zuerst lösen. Zweitens: Was passiert, wenn es ausfällt oder wenn ich es abschalten muss? In Projekten frage ich das immer, bevor irgendjemand über Technologie redet. Wenn es keine Rückfallebene gibt, ist der Prozess zu wichtig für ein Experiment.</w:t>
+        <w:t>Woran erkennst du im Alltag, in welcher Ecke du bist? An zwei Fragen. Woran würde ich merken, dass das falsch ist? Fällt dir darauf keine Antwort ein, hast du kein Werkzeugproblem, sondern ein Prüfproblem. Und was passiert, wenn es ausfällt oder wenn ich es abschalten muss? Wenn es keine Rückfallebene gibt, ist der Prozess zu wichtig für ein Experiment.</w:t>
       </w:r>
     </w:p>
     <w:p>
@@ -12558,7 +12558,7 @@
         <w:pStyle w:val="Fliesstext"/>
       </w:pPr>
       <w:r>
-        <w:t>Nimm die Zahl im Reporting und spiel sie durch. Eine Kollegin hat einen Datenexport, zweitausend Zeilen, und lässt sich daraus eine Auswertung bauen. Ergebnis: ein Prozentwert. Der wandert auf eine Folie, die Folie in eine Vorlage, die Vorlage in eine Sitzung, in der eine Entscheidung fällt. An welcher Stelle dieser Kette hätte jemand gemerkt, dass die Zahl nicht stimmt? An keiner. Folien haben kein Prüfverfahren, sie haben ein Layout. Ich halte es deshalb mit einer Arbeitsteilung: Zahlen kommen aus dem System, das sie verantwortet. Erklären darf das Modell sie, erzeugen nicht.</w:t>
+        <w:t>Nimm die Zahl im Reporting. Eine Kollegin hat einen Datenexport, zweitausend Zeilen, und lässt sich daraus eine Auswertung bauen. Ergebnis: ein Prozentwert. Der wandert auf eine Folie, die Folie in eine Vorlage, die Vorlage in eine Sitzung, in der eine Entscheidung fällt. An welcher Stelle dieser Kette hätte jemand gemerkt, dass die Zahl nicht stimmt? An keiner. Folien haben kein Prüfverfahren, sie haben ein Layout. Ich halte es deshalb mit einer Arbeitsteilung: Zahlen kommen aus dem System, das sie verantwortet. Erklären darf das Modell sie, erzeugen nicht.</w:t>
       </w:r>
     </w:p>
     <w:p>
@@ -12576,7 +12576,7 @@
         <w:ind w:firstLine="283"/>
       </w:pPr>
       <w:r>
-        <w:t>Bei der Gesundheit wird die Grenze oft falsch gezogen. Sie heißt nicht „frag nie". Sich einen Befund erklären zu lassen, den man schon hat, oder sich vor einem Termin fünf vernünftige Fragen zurechtzulegen, halte ich für eine der besseren Anwendungen überhaupt. Die Grenze liegt zwischen erklären lassen und entscheiden lassen. Wer sich einen Laborwert übersetzen lässt, bleibt in der prüfbaren Ecke, weil beim nächsten Termin jemand sitzt, der es besser weiß. Wer sich aufgrund einer Auskunft gegen den Termin entscheidet, merkt nichts, denn ein ausgefallener Termin produziert kein Ereignis.</w:t>
+        <w:t>Bei der Gesundheit wird die Grenze oft falsch gezogen. Sie heißt nicht „frag nie" — sich einen Befund erklären zu lassen, den man schon hat, oder sich vor einem Termin fünf vernünftige Fragen zurechtzulegen, halte ich für eine der besseren Anwendungen überhaupt. Sie liegt zwischen erklären lassen und entscheiden lassen. Wer sich einen Laborwert übersetzen lässt, bleibt in der prüfbaren Ecke, weil beim nächsten Termin jemand sitzt, der es besser weiß. Wer sich aufgrund einer Auskunft gegen den Termin entscheidet, merkt nichts, denn ein ausgefallener Termin produziert kein Ereignis.</w:t>
       </w:r>
     </w:p>
     <w:p>
@@ -12646,7 +12646,7 @@
         <w:ind w:firstLine="283"/>
       </w:pPr>
       <w:r>
-        <w:t>Bei Zahlen prüfe ich vier Dinge fast automatisch. Was ist der Nenner — Prozent wovon? Aus welchem Jahr stammt die Zahl, und womit wird sie verglichen? Passt die Größenordnung zu etwas, das ich kenne? Und wer hat gezählt, in wessen Auftrag? Ein Beispiel, das in jeder Firma so ähnlich vorkommt: „Vierzig Prozent unserer Tickets sind Standardfälle." Schöne Zahl, Grundlage für ein Automatisierungsvorhaben. Vierzig Prozent von welchen Tickets — allen, oder denen aus dem einen Postfach, das ausgewertet wurde? Über welchen Zeitraum, und war der normal? Und wer hat entschieden, was ein Standardfall ist? Ich habe noch kein Projekt erlebt, in dem diese Rückfragen die Zahl unverändert gelassen hätten. Im Meeting greift man dafür übrigens besser nicht die Zahl an, sondern fragt nach der Herkunft. „Aus welchem Feld kommt das denn?" ist keine Unterstellung, und wenn die Antwort „das kann ich nachliefern" lautet, haben es alle gehört, ohne dass jemand vorgeführt wurde.</w:t>
+        <w:t>Bei Zahlen prüfe ich vier Dinge fast automatisch. Was ist der Nenner — Prozent wovon? Aus welchem Jahr, und womit verglichen? Passt die Größenordnung zu etwas, das ich kenne? Und wer hat gezählt, in wessen Auftrag? Ein Beispiel, das in jeder Firma so ähnlich vorkommt: „Vierzig Prozent unserer Tickets sind Standardfälle." Schöne Zahl, Grundlage für ein Automatisierungsvorhaben. Vierzig Prozent von welchen Tickets — allen, oder denen aus dem einen Postfach, das ausgewertet wurde? Über welchen Zeitraum, und war der normal? Und wer hat entschieden, was ein Standardfall ist? Ich habe noch kein Projekt erlebt, in dem diese Rückfragen die Zahl unverändert gelassen hätten. Im Meeting greift man dafür übrigens besser nicht die Zahl an, sondern fragt nach der Herkunft. „Aus welchem Feld kommt das denn?" ist keine Unterstellung, und wenn die Antwort „das kann ich nachliefern" lautet, haben es alle gehört, ohne dass jemand vorgeführt wurde.</w:t>
       </w:r>
     </w:p>
     <w:p>
@@ -12883,7 +12883,7 @@
         <w:ind w:firstLine="283"/>
       </w:pPr>
       <w:r>
-        <w:t>Das Zweite: Benutz es nicht für das, was du gerade lernen sollst. Nicht nie. Später. Der Unterschied zwischen „ich habe die Hausaufgabe abgegeben" und „ich kann das jetzt" fällt dir in dem Moment nicht auf, in dem du ihn machst, und in der Klausur ist es zu spät. Den Gegenbefund muss ich dazu erwähnen, sonst mache ich es mir zu leicht: Ein randomisierter Pilot der Weltbank in Nigeria mit rund 800 Schülerinnen und Schülern, sechs Wochen Nachmittagsunterricht in Englisch mit einem Sprachmodell als Tutor, kam auf Lernzuwächse, die die Weltbank mit etwa zwei Jahren regulärer Schulbildung vergleicht — kleiner Umfang, kurze Dauer, offene Skalierbarkeit.[18] Das ist ernst zu nehmen, und es widerspricht meiner Regel weniger, als es aussieht. Dort war das Werkzeug ein Tutor, der erklärt, nachfragt und dasselbe geduldig zum vierten Mal sagt, kein Ersatz für den eigenen Versuch. Der Unterschied liegt nicht im Werkzeug, sondern in der Reihenfolge.</w:t>
+        <w:t>Das Zweite: Benutz es nicht für das, was du gerade lernen sollst. Nicht nie. Später. Der Unterschied zwischen „ich habe die Hausaufgabe abgegeben" und „ich kann das jetzt" fällt dir in dem Moment nicht auf, in dem du ihn machst, und in der Klausur ist es zu spät. Den Gegenbefund muss ich erwähnen, sonst mache ich es mir zu leicht: Ein randomisierter Pilot der Weltbank in Nigeria, rund 800 Schülerinnen und Schüler, sechs Wochen Nachmittagsunterricht in Englisch mit einem Sprachmodell als Tutor, kam auf Lernzuwächse, die die Weltbank mit etwa zwei Jahren regulärer Schulbildung vergleicht — kleiner Umfang, kurze Dauer, offene Skalierbarkeit.[18] Das ist ernst zu nehmen und widerspricht meiner Regel weniger, als es aussieht. Dort war das Werkzeug ein Tutor, der erklärt, nachfragt und dasselbe geduldig zum vierten Mal sagt, kein Ersatz für den eigenen Versuch. Der Unterschied liegt nicht im Werkzeug, sondern in der Reihenfolge.</w:t>
       </w:r>
     </w:p>
     <w:p>
@@ -12926,7 +12926,7 @@
         <w:ind w:firstLine="283"/>
       </w:pPr>
       <w:r>
-        <w:t>Es gibt vier Situationen, in denen mein Misstrauen sofort anspringt, und alle vier kommen aus dem Beruf.</w:t>
+        <w:t>Vier Situationen lassen mein Misstrauen sofort anspringen, und alle vier kommen aus dem Beruf.</w:t>
       </w:r>
     </w:p>
     <w:p>
@@ -12978,7 +12978,7 @@
         <w:pStyle w:val="Fliesstext"/>
       </w:pPr>
       <w:r>
-        <w:t>Bis hierher galt das dir als Benutzer. Jetzt der Teil für die, die solche Systeme in einer Organisation einführen — und das sind mehr Leute, als sich dafür halten, denn wer im Team entscheidet, dass die Angebote ab jetzt mit einem Werkzeug vorbereitet werden, führt eines ein.</w:t>
+        <w:t>Bis hierher galt das dir als Benutzer. Jetzt der Teil für die, die solche Systeme in einer Organisation einführen — und das sind mehr Leute, als sich dafür halten.</w:t>
       </w:r>
     </w:p>
     <w:p>
@@ -13005,7 +13005,7 @@
         <w:ind w:firstLine="283"/>
       </w:pPr>
       <w:r>
-        <w:t>Bevor jemand fragt, ob ein Modell gut genug ist, stelle ich eine andere Frage, und sie erzeugt fast immer eine Pause: Wie gut ist es denn heute? Wie viele Vorgänge werden im Moment falsch bearbeitet — im Urlaub, am Freitagnachmittag, in der Einarbeitung eines neuen Kollegen? Fast nie weiß das jemand. Ohne diese Zahl ist jede Diskussion über Modellqualität eine Meinungsäußerung, denn der Maßstab ist nicht Fehlerfreiheit, den erfüllt kein Prozess der Welt, sondern der heutige Zustand. Danach lasse ich das System eine Weile mitlaufen, ohne dass es entscheidet: Es bekommt jeden Fall, sagt, was es täte, und ein Mensch arbeitet weiter wie bisher. Interessant sind hinterher nicht die Übereinstimmungen, sondern die Abweichungen — nicht weil dort feststünde, wer recht hat, sondern weil dort die unklaren Regeln liegen.</w:t>
+        <w:t>Bevor jemand fragt, ob ein Modell gut genug ist, stelle ich eine andere Frage, und sie erzeugt fast immer eine Pause: Wie gut ist es denn heute? Wie viele Vorgänge werden im Moment falsch bearbeitet — im Urlaub, am Freitagnachmittag, in der Einarbeitung eines neuen Kollegen? Fast nie weiß das jemand. Ohne diese Zahl ist jede Diskussion über Modellqualität eine Meinungsäußerung, denn der Maßstab ist nicht Fehlerfreiheit, den erfüllt kein Prozess der Welt, sondern der heutige Zustand. Danach lasse ich das System eine Weile mitlaufen, ohne dass es entscheidet: Es sagt zu jedem Fall, was es täte, und ein Mensch arbeitet weiter wie bisher. Interessant sind hinterher die Abweichungen — nicht weil dort feststünde, wer recht hat, sondern weil dort die unklaren Regeln liegen.</w:t>
       </w:r>
     </w:p>
     <w:p>
@@ -13247,7 +13247,7 @@
         <w:ind w:firstLine="283"/>
       </w:pPr>
       <w:r>
-        <w:t>Damit an der Spitze des Feldes überhaupt etwas entsteht, müssen vier Dinge zusammenkommen: das Wissen, wie man so ein System baut, und die Leute, die es können; Rechenleistung in einer Menge, die man nicht mietet wie einen Server, sondern plant wie ein Kraftwerk; Daten in einem Umfang, den man nicht mehr zusammenbekommt, wenn man erst morgen anfängt; und die physische Grundlage darunter, also Grundstücke, Kühlung, Netzanschluss, Strom. Jedes davon ist für sich teuer. Alle vier zusammen hat fast niemand.</w:t>
+        <w:t>Damit an der Spitze überhaupt etwas entsteht, müssen vier Dinge zusammenkommen: das Wissen, wie man so ein System baut, und die Leute, die es können; Rechenleistung in einer Menge, die man nicht mietet wie einen Server, sondern plant wie ein Kraftwerk; Daten in einem Umfang, den man nicht mehr zusammenbekommt, wenn man erst morgen anfängt; und die physische Grundlage darunter, also Grundstücke, Kühlung, Netzanschluss, Strom. Jedes davon ist teuer. Alle vier zusammen hat fast niemand.</w:t>
       </w:r>
     </w:p>
     <w:p>
@@ -13319,7 +13319,7 @@
         <w:ind w:firstLine="283"/>
       </w:pPr>
       <w:r>
-        <w:t>Und die Gegenseite dieses Nadelöhrs wächst rasant: Der Stanford AI Index beziffert den Anteil der Organisationen, die KI einsetzen, für 2024 auf rund 78 Prozent gegenüber 55 Prozent im Jahr davor.[4] Sehr viele hängen also sehr schnell an sehr wenigen. Im Berufsalltag sieht das unspektakulär aus: Ein Anbieter ändert die Preisliste, stellt eine Modellversion ab oder passt die Nutzungsbedingungen an, und in vierzig Unternehmen sitzen Leute in Terminen, die sie sich nicht ausgesucht haben.</w:t>
+        <w:t>Und die Gegenseite dieses Nadelöhrs wächst rasant: Der Stanford AI Index beziffert den Anteil der Organisationen, die KI einsetzen, für 2024 auf rund 78 Prozent gegenüber 55 Prozent im Jahr davor.[4] Sehr viele hängen also sehr schnell an sehr wenigen. Im Berufsalltag sieht das unspektakulär aus: Ein Anbieter ändert die Preisliste oder stellt eine Modellversion ab, und in vierzig Unternehmen sitzen Leute in Terminen, die sie sich nicht ausgesucht haben.</w:t>
       </w:r>
     </w:p>
     <w:p>
@@ -13434,16 +13434,16 @@
         <w:pStyle w:val="Fliesstext"/>
       </w:pPr>
       <w:r>
-        <w:t>Meine zweite Sorge ist eine Verteilungssorge, und ich sage gleich dazu: Es ist eine politische Frage, keine technische. Das ist der ganze Punkt.</w:t>
-      </w:r>
-    </w:p>
-    <w:p>
-      <w:pPr>
-        <w:pStyle w:val="Fliesstext"/>
-        <w:ind w:firstLine="283"/>
-      </w:pPr>
-      <w:r>
-        <w:t>Die Datenlage ist inzwischen ordentlich. Der ILO-Index von 2025 schätzt, dass etwa jeder vierte Beschäftigte weltweit in einem Beruf mit einer gewissen Exposition gegenüber generativer KI arbeitet, wobei die große Mehrheit dieser Jobs transformiert und nicht ersetzt wird. In der höchsten Expositionskategorie liegen 3,3 Prozent der weltweiten Beschäftigung — und dort zeigt sich ein deutlicher Unterschied: 4,7 Prozent bei Frauen gegenüber 2,4 Prozent bei Männern.[9] Diese Schieflage ist kein Nebeneffekt, sie ist eine Ansage an die Bürojobs, in denen überproportional Frauen arbeiten.</w:t>
+        <w:t>Meine zweite Sorge ist eine Verteilungssorge, und das heißt: eine politische Frage, keine technische. Das ist der ganze Punkt.</w:t>
+      </w:r>
+    </w:p>
+    <w:p>
+      <w:pPr>
+        <w:pStyle w:val="Fliesstext"/>
+        <w:ind w:firstLine="283"/>
+      </w:pPr>
+      <w:r>
+        <w:t>Die Datenlage ist inzwischen ordentlich. Der ILO-Index von 2025 schätzt, dass etwa jeder vierte Beschäftigte weltweit in einem Beruf mit einer gewissen Exposition gegenüber generativer KI arbeitet, wobei die große Mehrheit dieser Jobs transformiert und nicht ersetzt wird. In der höchsten Expositionskategorie liegen 3,3 Prozent der weltweiten Beschäftigung — und dort zeigt sich ein deutlicher Unterschied: 4,7 Prozent bei Frauen gegenüber 2,4 Prozent bei Männern.[9] Diese Schieflage ist kein Nebeneffekt, sondern eine Ansage an die Bürojobs, in denen überproportional Frauen arbeiten.</w:t>
       </w:r>
     </w:p>
     <w:p>
@@ -13648,7 +13648,7 @@
         <w:ind w:firstLine="283"/>
       </w:pPr>
       <w:r>
-        <w:t>Deshalb stand Kapitel 11 vor diesem hier und nicht umgekehrt. Gegen die Konzentration von Rechenleistung kannst du am Dienstagnachmittag nichts ausrichten. Gegen die Verteilungsfrage auch nicht allein. Gegen die dritte Gefahr schon: indem du prüfst, indem du gelegentlich ohne das Werkzeug arbeitest, um zu merken, ob du es noch kannst, indem du dir angewöhnst, bei allem, was dir wichtig ist, eine Quelle sehen zu wollen. Und indem du in einer Runde, in der alle nicken, einmal fragst, wer die Zahl eigentlich nachgerechnet hat. Vertrauen ist eine Fähigkeit, habe ich geschrieben. Fähigkeiten verschwinden, wenn man sie nicht benutzt.</w:t>
+        <w:t>Deshalb stand Kapitel 11 vor diesem hier und nicht umgekehrt. Gegen die Konzentration von Rechenleistung kannst du am Dienstagnachmittag nichts ausrichten. Gegen die Verteilungsfrage auch nicht allein. Gegen die dritte Gefahr schon: indem du prüfst, gelegentlich ohne das Werkzeug arbeitest, um zu merken, ob du es noch kannst, und dir angewöhnst, bei allem, was dir wichtig ist, eine Quelle sehen zu wollen. Und indem du in einer Runde, in der alle nicken, einmal fragst, wer die Zahl nachgerechnet hat. Vertrauen ist eine Fähigkeit, habe ich geschrieben. Fähigkeiten verschwinden, wenn man sie nicht benutzt.</w:t>
       </w:r>
     </w:p>
     <w:p>
@@ -13746,7 +13746,7 @@
         <w:ind w:firstLine="283"/>
       </w:pPr>
       <w:r>
-        <w:t>Fünftens, und das ist der unbequeme Punkt: Wenn Automatisierung Produktivität hebt, ist die Verteilung des Gewinns eine Entscheidung und keine Naturkonstante. Ob er ausschließlich nach oben und außen fließt oder auch in Weiterbildung, in Arbeitszeit, in Einstiegsstellen, entscheidet ein Mensch in einem Meeting. Meine Meinung: Wer nur nach oben verteilt, produziert genau den Widerstand, über den er sich anschließend beklagt.</w:t>
+        <w:t>Fünftens, der unbequeme Punkt: Wenn Automatisierung Produktivität hebt, ist die Verteilung des Gewinns eine Entscheidung und keine Naturkonstante. Ob er nur nach oben und außen fließt oder auch in Weiterbildung, Arbeitszeit und Einstiegsstellen, entscheidet ein Mensch in einem Meeting. Meine Meinung: Wer nur nach oben verteilt, produziert genau den Widerstand, über den er sich anschließend beklagt.</w:t>
       </w:r>
     </w:p>
     <w:p>
@@ -13779,7 +13779,7 @@
         <w:ind w:firstLine="283"/>
       </w:pPr>
       <w:r>
-        <w:t>Dazu kommt Bildung, nicht in der Form, in der sie gerade meistens gefordert wird. Es geht nicht in erster Linie um Kurse zur Bedienung dieser Werkzeuge; die Bedienung ist der leichte Teil und in zwei Jahren ohnehin anders. Es geht um das alte Handwerk: Quellen prüfen, Statistiken lesen, ein Argument auseinandernehmen. Die Antwort auf die Bücherflut in Kapitel 1 lautete nicht „weniger drucken", sondern Register, Kataloge, Quellenkritik. Das war Bildung, keine Technik.</w:t>
+        <w:t>Dazu kommt Bildung, nicht in der Form, in der sie meistens gefordert wird. Es geht nicht um Kurse zur Bedienung dieser Werkzeuge; die Bedienung ist der leichte Teil und in zwei Jahren ohnehin anders. Es geht um das alte Handwerk: Quellen prüfen, Statistiken lesen, ein Argument auseinandernehmen. Die Antwort auf die Bücherflut in Kapitel 1 lautete nicht „weniger drucken", sondern Register, Kataloge, Quellenkritik. Das war Bildung, keine Technik.</w:t>
       </w:r>
     </w:p>
     <w:p>
@@ -13806,7 +13806,7 @@
         <w:ind w:firstLine="283"/>
       </w:pPr>
       <w:r>
-        <w:t>Und der Zeitpunkt? Collingridge hat ihn beschrieben: zu früh weiß man nichts, zu spät kann man nichts.[18] Wir sind gerade in dem kurzen Abschnitt dazwischen. Was dieses Fenster schließt, ist nach meiner Erfahrung selten ein Gesetz. Es sind Prozesse, die irgendwann so tief an einem Anbieter hängen, dass ein Wechsel kein Beschluss mehr ist, sondern ein Zweijahresprojekt. Der Abschnitt ist nicht offen für immer.</w:t>
+        <w:t>Und der Zeitpunkt? Collingridge hat ihn beschrieben: zu früh weiß man nichts, zu spät kann man nichts.[18] Wir sind in dem kurzen Abschnitt dazwischen. Was dieses Fenster schließt, ist selten ein Gesetz. Es sind Prozesse, die irgendwann so tief an einem Anbieter hängen, dass ein Wechsel kein Beschluss mehr ist, sondern ein Zweijahresprojekt. Der Abschnitt ist nicht offen für immer.</w:t>
       </w:r>
     </w:p>
     <w:p>
@@ -20679,7 +20679,7 @@
         <w:t>Energy and AI</w:t>
       </w:r>
       <w:r>
-        <w:t xml:space="preserve"> (April 2025) sowie IEA-Meldung zum Jahr 2025 („Data centre electricity use surged in 2025"). — Stromverbrauch KI-fokussierter Rechenzentren 2025 um rund 50 % gestiegen; rund 1.200 TWh bis 2035; Erneuerbare decken knapp die Hälfte der Zusatznachfrage, dahinter Erdgas und Kohle, Kernkraft gegen Ende des Jahrzehnts; Energieverbrauch pro KI-Aufgabe sinkt in beispiellosem Tempo. → QUELLEN.md Nr. 86 und Nr. 119. </w:t>
+        <w:t xml:space="preserve"> (April 2025) sowie IEA-Meldung zum Jahr 2025 („Data centre electricity use surged in 2025"). — Stromverbrauch KI-fokussierter Rechenzentren 2025 um rund 50 % gestiegen; rund 1.200 TWh bis 2035; Erneuerbare decken knapp die Hälfte der Zusatznachfrage, dahinter Erdgas und Kohle, Kernkraft gegen Ende des Jahrzehnts; Energieverbrauch pro KI-Aufgabe sinkt in beispiellosem Tempo. → QUELLEN.md Nr. 86 und Nr. 165. </w:t>
       </w:r>
       <w:r>
         <w:rPr>

</xml_diff>

<commit_message>
Kapitel 11: finale Fassung (6.926 W)
Fehlerkosten-Heuristik zur Zwei-Achsen-Landkarte ausgebaut, Abschnitt
'Teuer und unsichtbar', Kontextpruefung als Familiengruppen-Szene,
voller Organisationsteil. Word-Manuskript neu gebaut.

Co-Authored-By: Claude Opus 4.8 <noreply@anthropic.com>
Claude-Session: https://claude.ai/code/session_0134ACJs5QwNt7TBrqmWZELo
</commit_message>
<xml_diff>
--- a/04_produktion/Erst_kam_die_Angst_Manuskript.docx
+++ b/04_produktion/Erst_kam_die_Angst_Manuskript.docx
@@ -12637,7 +12637,7 @@
         <w:ind w:firstLine="283"/>
       </w:pPr>
       <w:r>
-        <w:t>Wenn du das eine Weile machst, merkst du, dass es drei Sorten von Ärger gibt, und die harmloseste ist die berühmteste. Sorte eins: Die Quelle existiert nicht. Titel, Autor, Jahr, Seitenzahl, alles tadellos formatiert, und es gibt sie einfach nicht. Ärgerlich, aber eine Minute Suche, dann weißt du Bescheid. Sorte zwei ist häufiger und gefährlicher: Die Quelle existiert, sagt aber etwas anderes, meistens etwas Engeres. Aus einem Befund an vierundfünfzig Personen im Labor wird „Studien zeigen", aus einer Modellrechnung eine Prognose, aus „in dieser Stichprobe" ein „grundsätzlich". Niemand hat gelogen, es ist unterwegs nur eine Einschränkung verlorengegangen, und die war der ganze Inhalt. Sorte drei ist die feinste: Die Quelle existiert, sagt genau das, und ist trotzdem der falsche Beleg. Eine Pressemitteilung über eine Studie ist nicht die Studie, und ein Preprint ist kein Ergebnis, sondern ein Angebot zur Diskussion.</w:t>
+        <w:t>Wenn du das eine Weile machst, merkst du, dass es drei Sorten von Ärger gibt, und die harmloseste ist die berühmteste. Sorte eins: Die Quelle existiert nicht. Titel, Autor, Jahr, Seitenzahl, alles tadellos formatiert, und es gibt sie einfach nicht — eine Minute Suche, dann weißt du Bescheid. Sorte zwei ist häufiger und gefährlicher: Die Quelle existiert, sagt aber etwas anderes, meistens etwas Engeres. Aus einem Befund an vierundfünfzig Personen im Labor wird „Studien zeigen", aus einer Modellrechnung eine Prognose. Niemand hat gelogen, es ist unterwegs nur eine Einschränkung verlorengegangen, und die war der ganze Inhalt. Sorte drei ist die feinste: Die Quelle existiert, sagt genau das, und ist trotzdem der falsche Beleg. Eine Pressemitteilung über eine Studie ist nicht die Studie, und ein Preprint ist kein Ergebnis, sondern ein Angebot zur Diskussion.</w:t>
       </w:r>
     </w:p>
     <w:p>
@@ -12673,7 +12673,7 @@
         <w:ind w:firstLine="283"/>
       </w:pPr>
       <w:r>
-        <w:t>Dazu kommen die Konsistenzprobe und die Fangfrage. Konsistenzprobe heißt: dieselbe Frage anders formuliert, in einem neuen Chat, ohne Vorgeschichte. Weichen die Antworten in der Substanz ab, ist keine von beiden ein Beleg. Fangfrage heißt: Ich frage gelegentlich nach etwas, das es nicht gibt — einer Studie, die ich mir gerade ausgedacht habe, einer Funktion, die diese Software nicht hat. Was dann passiert, sagt mir mehr über den Zustand meines Werkzeugs als jede Ankündigung des Anbieters. Und lass dir die Gegenposition geben, ausdrücklich und in derselben Ausführlichkeit; nichts bringt eine dünne Antwort schneller ins Wanken.</w:t>
+        <w:t>Dazu kommen zwei Handgriffe. Die Konsistenzprobe: dieselbe Frage anders formuliert, in einem neuen Chat, ohne Vorgeschichte — weichen die Antworten in der Substanz ab, ist keine von beiden ein Beleg. Und die Fangfrage: Ich frage gelegentlich nach etwas, das es nicht gibt, einer Studie, die ich mir gerade ausgedacht habe. Was dann passiert, sagt mir mehr über den Zustand meines Werkzeugs als jede Ankündigung des Anbieters. Lass dir außerdem die Gegenposition geben, ausdrücklich und in derselben Ausführlichkeit; nichts bringt eine dünne Antwort schneller ins Wanken.</w:t>
       </w:r>
     </w:p>
     <w:p>

</xml_diff>